<commit_message>
TP1 en prog appliquer terminer et tester
</commit_message>
<xml_diff>
--- a/veille_techno/projet_1/Gabarit analyse projet 1.docx
+++ b/veille_techno/projet_1/Gabarit analyse projet 1.docx
@@ -15,7 +15,7 @@
       <w:r>
         <w:t xml:space="preserve">Afin d’améliorer la compétitivité des transports en commun, on voudrait visualiser la qualité des services fournis par la Société de transport de Montréal (STM) sur le territoire de l’ile de Montréal. Pour ce faire, nous allons créer une </w:t>
       </w:r>
-      <w:hyperlink r:id="rId8" w:history="1">
+      <w:hyperlink r:id="rId11" w:history="1">
         <w:r>
           <w:rPr>
             <w:rStyle w:val="Lienhypertexte"/>
@@ -34,7 +34,7 @@
       <w:r>
         <w:t xml:space="preserve"> ») dont les couleurs indiqueront un score de « qualité du service » selon le lieu et l’heure. Par chance, </w:t>
       </w:r>
-      <w:hyperlink r:id="rId9" w:history="1">
+      <w:hyperlink r:id="rId12" w:history="1">
         <w:r>
           <w:rPr>
             <w:rStyle w:val="Lienhypertexte"/>
@@ -238,7 +238,6 @@
           <w:rStyle w:val="hgkelc"/>
           <w:b/>
           <w:bCs/>
-          <w:lang w:val="en"/>
         </w:rPr>
         <w:t>→</w:t>
       </w:r>
@@ -1195,12 +1194,12 @@
         <w:tblLook w:val="04A0" w:firstRow="1" w:lastRow="0" w:firstColumn="1" w:lastColumn="0" w:noHBand="0" w:noVBand="1"/>
       </w:tblPr>
       <w:tblGrid>
-        <w:gridCol w:w="2877"/>
-        <w:gridCol w:w="2877"/>
-        <w:gridCol w:w="2881"/>
-        <w:gridCol w:w="2877"/>
-        <w:gridCol w:w="2877"/>
-        <w:gridCol w:w="2881"/>
+        <w:gridCol w:w="2859"/>
+        <w:gridCol w:w="2860"/>
+        <w:gridCol w:w="2864"/>
+        <w:gridCol w:w="2860"/>
+        <w:gridCol w:w="2963"/>
+        <w:gridCol w:w="2864"/>
       </w:tblGrid>
       <w:tr>
         <w:trPr>
@@ -1319,6 +1318,9 @@
             <w:pPr>
               <w:spacing w:line="259" w:lineRule="auto"/>
             </w:pPr>
+            <w:r>
+              <w:t>OVH Cloud (VPS)</w:t>
+            </w:r>
           </w:p>
         </w:tc>
         <w:tc>
@@ -1330,6 +1332,9 @@
               <w:spacing w:line="259" w:lineRule="auto"/>
               <w:cnfStyle w:val="000000100000" w:firstRow="0" w:lastRow="0" w:firstColumn="0" w:lastColumn="0" w:oddVBand="0" w:evenVBand="0" w:oddHBand="1" w:evenHBand="0" w:firstRowFirstColumn="0" w:firstRowLastColumn="0" w:lastRowFirstColumn="0" w:lastRowLastColumn="0"/>
             </w:pPr>
+            <w:r>
+              <w:t>Permet d’avoir un serveur privé</w:t>
+            </w:r>
           </w:p>
         </w:tc>
         <w:tc>
@@ -1361,8 +1366,12 @@
           <w:p>
             <w:pPr>
               <w:spacing w:line="259" w:lineRule="auto"/>
+              <w:jc w:val="center"/>
               <w:cnfStyle w:val="000000100000" w:firstRow="0" w:lastRow="0" w:firstColumn="0" w:lastColumn="0" w:oddVBand="0" w:evenVBand="0" w:oddHBand="1" w:evenHBand="0" w:firstRowFirstColumn="0" w:firstRowLastColumn="0" w:lastRowFirstColumn="0" w:lastRowLastColumn="0"/>
             </w:pPr>
+            <w:r>
+              <w:t>https://www.ovhcloud.com/fr-ca/web-hosting/</w:t>
+            </w:r>
           </w:p>
         </w:tc>
         <w:tc>
@@ -1373,6 +1382,69 @@
             <w:pPr>
               <w:spacing w:line="259" w:lineRule="auto"/>
               <w:cnfStyle w:val="000000100000" w:firstRow="0" w:lastRow="0" w:firstColumn="0" w:lastColumn="0" w:oddVBand="0" w:evenVBand="0" w:oddHBand="1" w:evenHBand="0" w:firstRowFirstColumn="0" w:firstRowLastColumn="0" w:lastRowFirstColumn="0" w:lastRowLastColumn="0"/>
+            </w:pPr>
+          </w:p>
+        </w:tc>
+      </w:tr>
+      <w:tr>
+        <w:tc>
+          <w:tcPr>
+            <w:cnfStyle w:val="001000000000" w:firstRow="0" w:lastRow="0" w:firstColumn="1" w:lastColumn="0" w:oddVBand="0" w:evenVBand="0" w:oddHBand="0" w:evenHBand="0" w:firstRowFirstColumn="0" w:firstRowLastColumn="0" w:lastRowFirstColumn="0" w:lastRowLastColumn="0"/>
+            <w:tcW w:w="833" w:type="pct"/>
+          </w:tcPr>
+          <w:p/>
+        </w:tc>
+        <w:tc>
+          <w:tcPr>
+            <w:tcW w:w="833" w:type="pct"/>
+          </w:tcPr>
+          <w:p>
+            <w:pPr>
+              <w:cnfStyle w:val="000000000000" w:firstRow="0" w:lastRow="0" w:firstColumn="0" w:lastColumn="0" w:oddVBand="0" w:evenVBand="0" w:oddHBand="0" w:evenHBand="0" w:firstRowFirstColumn="0" w:firstRowLastColumn="0" w:lastRowFirstColumn="0" w:lastRowLastColumn="0"/>
+            </w:pPr>
+          </w:p>
+        </w:tc>
+        <w:tc>
+          <w:tcPr>
+            <w:tcW w:w="834" w:type="pct"/>
+          </w:tcPr>
+          <w:p>
+            <w:pPr>
+              <w:cnfStyle w:val="000000000000" w:firstRow="0" w:lastRow="0" w:firstColumn="0" w:lastColumn="0" w:oddVBand="0" w:evenVBand="0" w:oddHBand="0" w:evenHBand="0" w:firstRowFirstColumn="0" w:firstRowLastColumn="0" w:lastRowFirstColumn="0" w:lastRowLastColumn="0"/>
+            </w:pPr>
+          </w:p>
+        </w:tc>
+        <w:tc>
+          <w:tcPr>
+            <w:tcW w:w="833" w:type="pct"/>
+          </w:tcPr>
+          <w:p>
+            <w:pPr>
+              <w:cnfStyle w:val="000000000000" w:firstRow="0" w:lastRow="0" w:firstColumn="0" w:lastColumn="0" w:oddVBand="0" w:evenVBand="0" w:oddHBand="0" w:evenHBand="0" w:firstRowFirstColumn="0" w:firstRowLastColumn="0" w:lastRowFirstColumn="0" w:lastRowLastColumn="0"/>
+            </w:pPr>
+          </w:p>
+        </w:tc>
+        <w:tc>
+          <w:tcPr>
+            <w:tcW w:w="833" w:type="pct"/>
+          </w:tcPr>
+          <w:p>
+            <w:pPr>
+              <w:jc w:val="center"/>
+              <w:cnfStyle w:val="000000000000" w:firstRow="0" w:lastRow="0" w:firstColumn="0" w:lastColumn="0" w:oddVBand="0" w:evenVBand="0" w:oddHBand="0" w:evenHBand="0" w:firstRowFirstColumn="0" w:firstRowLastColumn="0" w:lastRowFirstColumn="0" w:lastRowLastColumn="0"/>
+            </w:pPr>
+            <w:r>
+              <w:t>https://www.ovhcloud.com/fr-ca/vps/</w:t>
+            </w:r>
+          </w:p>
+        </w:tc>
+        <w:tc>
+          <w:tcPr>
+            <w:tcW w:w="834" w:type="pct"/>
+          </w:tcPr>
+          <w:p>
+            <w:pPr>
+              <w:cnfStyle w:val="000000000000" w:firstRow="0" w:lastRow="0" w:firstColumn="0" w:lastColumn="0" w:oddVBand="0" w:evenVBand="0" w:oddHBand="0" w:evenHBand="0" w:firstRowFirstColumn="0" w:firstRowLastColumn="0" w:lastRowFirstColumn="0" w:lastRowLastColumn="0"/>
             </w:pPr>
           </w:p>
         </w:tc>
@@ -1385,7 +1457,6 @@
       </w:pPr>
       <w:bookmarkStart w:id="3" w:name="_Toc144118371"/>
       <w:r>
-        <w:lastRenderedPageBreak/>
         <w:t>Sources de données (bases de données, API web</w:t>
       </w:r>
       <w:r>
@@ -2660,7 +2731,7 @@
     </w:p>
     <w:p/>
     <w:sectPr>
-      <w:headerReference w:type="default" r:id="rId10"/>
+      <w:headerReference w:type="default" r:id="rId13"/>
       <w:pgSz w:w="20160" w:h="12240" w:orient="landscape" w:code="5"/>
       <w:pgMar w:top="1440" w:right="1440" w:bottom="1440" w:left="1440" w:header="709" w:footer="709" w:gutter="0"/>
       <w:cols w:space="708"/>
@@ -4174,10 +4245,23 @@
 </file>
 
 <file path=customXml/item1.xml><?xml version="1.0" encoding="utf-8"?>
-<b:Sources xmlns:b="http://schemas.openxmlformats.org/officeDocument/2006/bibliography" xmlns="http://schemas.openxmlformats.org/officeDocument/2006/bibliography" SelectedStyle="\APASixthEditionOfficeOnline.xsl" StyleName="APA" Version="6"/>
+<p:properties xmlns:p="http://schemas.microsoft.com/office/2006/metadata/properties" xmlns:xsi="http://www.w3.org/2001/XMLSchema-instance" xmlns:pc="http://schemas.microsoft.com/office/infopath/2007/PartnerControls">
+  <documentManagement>
+    <ReferenceId xmlns="42257c34-c77f-467d-905d-75a97d547138" xsi:nil="true"/>
+  </documentManagement>
+</p:properties>
 </file>
 
 <file path=customXml/item2.xml><?xml version="1.0" encoding="utf-8"?>
+<?mso-contentType ?>
+<FormTemplates xmlns="http://schemas.microsoft.com/sharepoint/v3/contenttype/forms">
+  <Display>DocumentLibraryForm</Display>
+  <Edit>DocumentLibraryForm</Edit>
+  <New>DocumentLibraryForm</New>
+</FormTemplates>
+</file>
+
+<file path=customXml/item3.xml><?xml version="1.0" encoding="utf-8"?>
 <ct:contentTypeSchema xmlns:ct="http://schemas.microsoft.com/office/2006/metadata/contentType" xmlns:ma="http://schemas.microsoft.com/office/2006/metadata/properties/metaAttributes" ct:_="" ma:_="" ma:contentTypeName="Document" ma:contentTypeID="0x010100551D635FAC5C8C40B6758ED46EE74085" ma:contentTypeVersion="1" ma:contentTypeDescription="Crée un document." ma:contentTypeScope="" ma:versionID="0c523bf75113fe7fa38646be70e883a9">
   <xsd:schema xmlns:xsd="http://www.w3.org/2001/XMLSchema" xmlns:xs="http://www.w3.org/2001/XMLSchema" xmlns:p="http://schemas.microsoft.com/office/2006/metadata/properties" xmlns:ns2="42257c34-c77f-467d-905d-75a97d547138" targetNamespace="http://schemas.microsoft.com/office/2006/metadata/properties" ma:root="true" ma:fieldsID="7a54401c2abbf958be344a21e651011b" ns2:_="">
     <xsd:import namespace="42257c34-c77f-467d-905d-75a97d547138"/>
@@ -4303,39 +4387,50 @@
 </ct:contentTypeSchema>
 </file>
 
-<file path=customXml/item3.xml><?xml version="1.0" encoding="utf-8"?>
-<?mso-contentType ?>
-<FormTemplates xmlns="http://schemas.microsoft.com/sharepoint/v3/contenttype/forms">
-  <Display>DocumentLibraryForm</Display>
-  <Edit>DocumentLibraryForm</Edit>
-  <New>DocumentLibraryForm</New>
-</FormTemplates>
-</file>
-
 <file path=customXml/item4.xml><?xml version="1.0" encoding="utf-8"?>
-<p:properties xmlns:p="http://schemas.microsoft.com/office/2006/metadata/properties" xmlns:xsi="http://www.w3.org/2001/XMLSchema-instance" xmlns:pc="http://schemas.microsoft.com/office/infopath/2007/PartnerControls">
-  <documentManagement>
-    <ReferenceId xmlns="42257c34-c77f-467d-905d-75a97d547138" xsi:nil="true"/>
-  </documentManagement>
-</p:properties>
+<b:Sources xmlns:b="http://schemas.openxmlformats.org/officeDocument/2006/bibliography" xmlns="http://schemas.openxmlformats.org/officeDocument/2006/bibliography" SelectedStyle="\APASixthEditionOfficeOnline.xsl" StyleName="APA" Version="6"/>
 </file>
 
 <file path=customXml/itemProps1.xml><?xml version="1.0" encoding="utf-8"?>
+<ds:datastoreItem xmlns:ds="http://schemas.openxmlformats.org/officeDocument/2006/customXml" ds:itemID="{9F598CD7-6DF5-442C-BC9D-4EF79CA37EA3}">
+  <ds:schemaRefs>
+    <ds:schemaRef ds:uri="http://schemas.microsoft.com/office/2006/metadata/properties"/>
+    <ds:schemaRef ds:uri="http://schemas.microsoft.com/office/infopath/2007/PartnerControls"/>
+    <ds:schemaRef ds:uri="42257c34-c77f-467d-905d-75a97d547138"/>
+  </ds:schemaRefs>
+</ds:datastoreItem>
+</file>
+
+<file path=customXml/itemProps2.xml><?xml version="1.0" encoding="utf-8"?>
+<ds:datastoreItem xmlns:ds="http://schemas.openxmlformats.org/officeDocument/2006/customXml" ds:itemID="{3FD6EF8E-ADF0-4C4F-B817-D3959536959B}">
+  <ds:schemaRefs>
+    <ds:schemaRef ds:uri="http://schemas.microsoft.com/sharepoint/v3/contenttype/forms"/>
+  </ds:schemaRefs>
+</ds:datastoreItem>
+</file>
+
+<file path=customXml/itemProps3.xml><?xml version="1.0" encoding="utf-8"?>
+<ds:datastoreItem xmlns:ds="http://schemas.openxmlformats.org/officeDocument/2006/customXml" ds:itemID="{57C2D642-B5AC-40E5-8AC8-1A6F08B0B667}">
+  <ds:schemaRefs>
+    <ds:schemaRef ds:uri="http://schemas.microsoft.com/office/2006/metadata/contentType"/>
+    <ds:schemaRef ds:uri="http://schemas.microsoft.com/office/2006/metadata/properties/metaAttributes"/>
+    <ds:schemaRef ds:uri="http://www.w3.org/2001/XMLSchema"/>
+    <ds:schemaRef ds:uri="http://schemas.microsoft.com/office/2006/metadata/properties"/>
+    <ds:schemaRef ds:uri="42257c34-c77f-467d-905d-75a97d547138"/>
+    <ds:schemaRef ds:uri="http://schemas.microsoft.com/office/2006/documentManagement/types"/>
+    <ds:schemaRef ds:uri="http://schemas.microsoft.com/office/infopath/2007/PartnerControls"/>
+    <ds:schemaRef ds:uri="http://schemas.openxmlformats.org/package/2006/metadata/core-properties"/>
+    <ds:schemaRef ds:uri="http://purl.org/dc/elements/1.1/"/>
+    <ds:schemaRef ds:uri="http://purl.org/dc/terms/"/>
+    <ds:schemaRef ds:uri="http://schemas.microsoft.com/internal/obd"/>
+  </ds:schemaRefs>
+</ds:datastoreItem>
+</file>
+
+<file path=customXml/itemProps4.xml><?xml version="1.0" encoding="utf-8"?>
 <ds:datastoreItem xmlns:ds="http://schemas.openxmlformats.org/officeDocument/2006/customXml" ds:itemID="{C5E14211-7814-4068-AEC0-194C3A425F86}">
   <ds:schemaRefs>
     <ds:schemaRef ds:uri="http://schemas.openxmlformats.org/officeDocument/2006/bibliography"/>
   </ds:schemaRefs>
 </ds:datastoreItem>
-</file>
-
-<file path=customXml/itemProps2.xml><?xml version="1.0" encoding="utf-8"?>
-<ds:datastoreItem xmlns:ds="http://schemas.openxmlformats.org/officeDocument/2006/customXml" ds:itemID="{57C2D642-B5AC-40E5-8AC8-1A6F08B0B667}"/>
-</file>
-
-<file path=customXml/itemProps3.xml><?xml version="1.0" encoding="utf-8"?>
-<ds:datastoreItem xmlns:ds="http://schemas.openxmlformats.org/officeDocument/2006/customXml" ds:itemID="{3FD6EF8E-ADF0-4C4F-B817-D3959536959B}"/>
-</file>
-
-<file path=customXml/itemProps4.xml><?xml version="1.0" encoding="utf-8"?>
-<ds:datastoreItem xmlns:ds="http://schemas.openxmlformats.org/officeDocument/2006/customXml" ds:itemID="{9F598CD7-6DF5-442C-BC9D-4EF79CA37EA3}"/>
 </file>
</xml_diff>

<commit_message>
analyse projet 1 en veille technologie presque fini
</commit_message>
<xml_diff>
--- a/veille_techno/projet_1/Gabarit analyse projet 1.docx
+++ b/veille_techno/projet_1/Gabarit analyse projet 1.docx
@@ -51,7 +51,13 @@
           <w:rPr>
             <w:rStyle w:val="Lienhypertexte"/>
           </w:rPr>
-          <w:t xml:space="preserve"> format GTFS </w:t>
+          <w:t xml:space="preserve"> format GTFS</w:t>
+        </w:r>
+        <w:r>
+          <w:rPr>
+            <w:rStyle w:val="Lienhypertexte"/>
+          </w:rPr>
+          <w:t xml:space="preserve"> </w:t>
         </w:r>
         <w:r>
           <w:rPr>
@@ -1333,7 +1339,11 @@
               <w:cnfStyle w:val="000000100000" w:firstRow="0" w:lastRow="0" w:firstColumn="0" w:lastColumn="0" w:oddVBand="0" w:evenVBand="0" w:oddHBand="1" w:evenHBand="0" w:firstRowFirstColumn="0" w:firstRowLastColumn="0" w:lastRowFirstColumn="0" w:lastRowLastColumn="0"/>
             </w:pPr>
             <w:r>
-              <w:t>Permet d’avoir un serveur privé</w:t>
+              <w:t xml:space="preserve">OVH Cloud VPS est un service d'hébergement virtuel privé qui offre des ressources serveur flexibles et </w:t>
+            </w:r>
+            <w:r>
+              <w:lastRenderedPageBreak/>
+              <w:t xml:space="preserve">évolutives, permettant aux utilisateurs de déployer des applications et des sites web sur des serveurs virtuels isolés au sein de l'infrastructure cloud d'OVH. </w:t>
             </w:r>
           </w:p>
         </w:tc>
@@ -1343,20 +1353,76 @@
           </w:tcPr>
           <w:p>
             <w:pPr>
-              <w:spacing w:line="259" w:lineRule="auto"/>
+              <w:pStyle w:val="Paragraphedeliste"/>
+              <w:numPr>
+                <w:ilvl w:val="0"/>
+                <w:numId w:val="4"/>
+              </w:numPr>
               <w:cnfStyle w:val="000000100000" w:firstRow="0" w:lastRow="0" w:firstColumn="0" w:lastColumn="0" w:oddVBand="0" w:evenVBand="0" w:oddHBand="1" w:evenHBand="0" w:firstRowFirstColumn="0" w:firstRowLastColumn="0" w:lastRowFirstColumn="0" w:lastRowLastColumn="0"/>
             </w:pPr>
-          </w:p>
-        </w:tc>
-        <w:tc>
-          <w:tcPr>
-            <w:tcW w:w="833" w:type="pct"/>
-          </w:tcPr>
-          <w:p>
-            <w:pPr>
-              <w:spacing w:line="259" w:lineRule="auto"/>
+            <w:r>
+              <w:lastRenderedPageBreak/>
+              <w:t>Évolutivité et Flexibilité</w:t>
+            </w:r>
+          </w:p>
+          <w:p>
+            <w:pPr>
+              <w:pStyle w:val="Paragraphedeliste"/>
+              <w:numPr>
+                <w:ilvl w:val="0"/>
+                <w:numId w:val="4"/>
+              </w:numPr>
               <w:cnfStyle w:val="000000100000" w:firstRow="0" w:lastRow="0" w:firstColumn="0" w:lastColumn="0" w:oddVBand="0" w:evenVBand="0" w:oddHBand="1" w:evenHBand="0" w:firstRowFirstColumn="0" w:firstRowLastColumn="0" w:lastRowFirstColumn="0" w:lastRowLastColumn="0"/>
             </w:pPr>
+            <w:r>
+              <w:t>Isolation et Sécurité</w:t>
+            </w:r>
+          </w:p>
+          <w:p>
+            <w:pPr>
+              <w:pStyle w:val="Paragraphedeliste"/>
+              <w:numPr>
+                <w:ilvl w:val="0"/>
+                <w:numId w:val="4"/>
+              </w:numPr>
+              <w:cnfStyle w:val="000000100000" w:firstRow="0" w:lastRow="0" w:firstColumn="0" w:lastColumn="0" w:oddVBand="0" w:evenVBand="0" w:oddHBand="1" w:evenHBand="0" w:firstRowFirstColumn="0" w:firstRowLastColumn="0" w:lastRowFirstColumn="0" w:lastRowLastColumn="0"/>
+            </w:pPr>
+            <w:r>
+              <w:t>Coût Abordable</w:t>
+            </w:r>
+          </w:p>
+        </w:tc>
+        <w:tc>
+          <w:tcPr>
+            <w:tcW w:w="833" w:type="pct"/>
+          </w:tcPr>
+          <w:p>
+            <w:pPr>
+              <w:spacing w:line="259" w:lineRule="auto"/>
+              <w:cnfStyle w:val="000000100000" w:firstRow="0" w:lastRow="0" w:firstColumn="0" w:lastColumn="0" w:oddVBand="0" w:evenVBand="0" w:oddHBand="1" w:evenHBand="0" w:firstRowFirstColumn="0" w:firstRowLastColumn="0" w:lastRowFirstColumn="0" w:lastRowLastColumn="0"/>
+            </w:pPr>
+            <w:r>
+              <w:t xml:space="preserve">Pas gratuit et peu potentiellement avoir des pannes. Doit faire un back-up </w:t>
+            </w:r>
+            <w:r>
+              <w:lastRenderedPageBreak/>
+              <w:t>des services ou applications en cas de problèmes majeurs</w:t>
+            </w:r>
+          </w:p>
+          <w:p>
+            <w:pPr>
+              <w:spacing w:line="259" w:lineRule="auto"/>
+              <w:cnfStyle w:val="000000100000" w:firstRow="0" w:lastRow="0" w:firstColumn="0" w:lastColumn="0" w:oddVBand="0" w:evenVBand="0" w:oddHBand="1" w:evenHBand="0" w:firstRowFirstColumn="0" w:firstRowLastColumn="0" w:lastRowFirstColumn="0" w:lastRowLastColumn="0"/>
+            </w:pPr>
+          </w:p>
+          <w:p>
+            <w:pPr>
+              <w:spacing w:line="259" w:lineRule="auto"/>
+              <w:cnfStyle w:val="000000100000" w:firstRow="0" w:lastRow="0" w:firstColumn="0" w:lastColumn="0" w:oddVBand="0" w:evenVBand="0" w:oddHBand="1" w:evenHBand="0" w:firstRowFirstColumn="0" w:firstRowLastColumn="0" w:lastRowFirstColumn="0" w:lastRowLastColumn="0"/>
+            </w:pPr>
+            <w:r>
+              <w:t>Nom de domaine pas inclut mais peut s’acheter</w:t>
+            </w:r>
           </w:p>
         </w:tc>
         <w:tc>
@@ -1370,7 +1436,8 @@
               <w:cnfStyle w:val="000000100000" w:firstRow="0" w:lastRow="0" w:firstColumn="0" w:lastColumn="0" w:oddVBand="0" w:evenVBand="0" w:oddHBand="1" w:evenHBand="0" w:firstRowFirstColumn="0" w:firstRowLastColumn="0" w:lastRowFirstColumn="0" w:lastRowLastColumn="0"/>
             </w:pPr>
             <w:r>
-              <w:t>https://www.ovhcloud.com/fr-ca/web-hosting/</w:t>
+              <w:lastRenderedPageBreak/>
+              <w:t>https://www.ovhcloud.com/fr-ca/vps/</w:t>
             </w:r>
           </w:p>
         </w:tc>
@@ -1383,6 +1450,13 @@
               <w:spacing w:line="259" w:lineRule="auto"/>
               <w:cnfStyle w:val="000000100000" w:firstRow="0" w:lastRow="0" w:firstColumn="0" w:lastColumn="0" w:oddVBand="0" w:evenVBand="0" w:oddHBand="1" w:evenHBand="0" w:firstRowFirstColumn="0" w:firstRowLastColumn="0" w:lastRowFirstColumn="0" w:lastRowLastColumn="0"/>
             </w:pPr>
+            <w:r>
+              <w:t xml:space="preserve">Serait adéquat pour héberger notre site qui serait accessible sur internet à un prix modeste et peut aussi </w:t>
+            </w:r>
+            <w:r>
+              <w:lastRenderedPageBreak/>
+              <w:t>faire la tâche backend. Cependant, on devra débourser pour accéder à un site web</w:t>
+            </w:r>
           </w:p>
         </w:tc>
       </w:tr>
@@ -1392,7 +1466,16 @@
             <w:cnfStyle w:val="001000000000" w:firstRow="0" w:lastRow="0" w:firstColumn="1" w:lastColumn="0" w:oddVBand="0" w:evenVBand="0" w:oddHBand="0" w:evenHBand="0" w:firstRowFirstColumn="0" w:firstRowLastColumn="0" w:lastRowFirstColumn="0" w:lastRowLastColumn="0"/>
             <w:tcW w:w="833" w:type="pct"/>
           </w:tcPr>
-          <w:p/>
+          <w:p>
+            <w:r>
+              <w:t xml:space="preserve">OVH </w:t>
+            </w:r>
+            <w:proofErr w:type="spellStart"/>
+            <w:r>
+              <w:t>WebHosting</w:t>
+            </w:r>
+            <w:proofErr w:type="spellEnd"/>
+          </w:p>
         </w:tc>
         <w:tc>
           <w:tcPr>
@@ -1402,6 +1485,17 @@
             <w:pPr>
               <w:cnfStyle w:val="000000000000" w:firstRow="0" w:lastRow="0" w:firstColumn="0" w:lastColumn="0" w:oddVBand="0" w:evenVBand="0" w:oddHBand="0" w:evenHBand="0" w:firstRowFirstColumn="0" w:firstRowLastColumn="0" w:lastRowFirstColumn="0" w:lastRowLastColumn="0"/>
             </w:pPr>
+            <w:r>
+              <w:t xml:space="preserve">OVH </w:t>
+            </w:r>
+            <w:proofErr w:type="spellStart"/>
+            <w:r>
+              <w:t>WebHosting</w:t>
+            </w:r>
+            <w:proofErr w:type="spellEnd"/>
+            <w:r>
+              <w:t xml:space="preserve"> est un service d'hébergement web complet offert par OVH, fournissant des solutions d'hébergement de sites web, de messagerie et de domaine avec une facilité de gestion et une infrastructure fiable.</w:t>
+            </w:r>
           </w:p>
         </w:tc>
         <w:tc>
@@ -1410,32 +1504,94 @@
           </w:tcPr>
           <w:p>
             <w:pPr>
+              <w:pStyle w:val="Paragraphedeliste"/>
+              <w:numPr>
+                <w:ilvl w:val="0"/>
+                <w:numId w:val="5"/>
+              </w:numPr>
               <w:cnfStyle w:val="000000000000" w:firstRow="0" w:lastRow="0" w:firstColumn="0" w:lastColumn="0" w:oddVBand="0" w:evenVBand="0" w:oddHBand="0" w:evenHBand="0" w:firstRowFirstColumn="0" w:firstRowLastColumn="0" w:lastRowFirstColumn="0" w:lastRowLastColumn="0"/>
             </w:pPr>
-          </w:p>
-        </w:tc>
-        <w:tc>
-          <w:tcPr>
-            <w:tcW w:w="833" w:type="pct"/>
-          </w:tcPr>
-          <w:p>
-            <w:pPr>
+            <w:r>
+              <w:t>Fiabilité</w:t>
+            </w:r>
+          </w:p>
+          <w:p>
+            <w:pPr>
+              <w:pStyle w:val="Paragraphedeliste"/>
+              <w:numPr>
+                <w:ilvl w:val="0"/>
+                <w:numId w:val="5"/>
+              </w:numPr>
               <w:cnfStyle w:val="000000000000" w:firstRow="0" w:lastRow="0" w:firstColumn="0" w:lastColumn="0" w:oddVBand="0" w:evenVBand="0" w:oddHBand="0" w:evenHBand="0" w:firstRowFirstColumn="0" w:firstRowLastColumn="0" w:lastRowFirstColumn="0" w:lastRowLastColumn="0"/>
             </w:pPr>
-          </w:p>
-        </w:tc>
-        <w:tc>
-          <w:tcPr>
-            <w:tcW w:w="833" w:type="pct"/>
-          </w:tcPr>
-          <w:p>
-            <w:pPr>
+            <w:r>
+              <w:t>Facilité d'utilisation</w:t>
+            </w:r>
+          </w:p>
+          <w:p>
+            <w:pPr>
+              <w:pStyle w:val="Paragraphedeliste"/>
+              <w:numPr>
+                <w:ilvl w:val="0"/>
+                <w:numId w:val="5"/>
+              </w:numPr>
+              <w:cnfStyle w:val="000000000000" w:firstRow="0" w:lastRow="0" w:firstColumn="0" w:lastColumn="0" w:oddVBand="0" w:evenVBand="0" w:oddHBand="0" w:evenHBand="0" w:firstRowFirstColumn="0" w:firstRowLastColumn="0" w:lastRowFirstColumn="0" w:lastRowLastColumn="0"/>
+            </w:pPr>
+            <w:r>
+              <w:t>Évolutivité</w:t>
+            </w:r>
+          </w:p>
+        </w:tc>
+        <w:tc>
+          <w:tcPr>
+            <w:tcW w:w="833" w:type="pct"/>
+          </w:tcPr>
+          <w:p>
+            <w:pPr>
+              <w:cnfStyle w:val="000000000000" w:firstRow="0" w:lastRow="0" w:firstColumn="0" w:lastColumn="0" w:oddVBand="0" w:evenVBand="0" w:oddHBand="0" w:evenHBand="0" w:firstRowFirstColumn="0" w:firstRowLastColumn="0" w:lastRowFirstColumn="0" w:lastRowLastColumn="0"/>
+            </w:pPr>
+            <w:r>
+              <w:t>Payant et non compris avec le service VPS par exemple</w:t>
+            </w:r>
+          </w:p>
+          <w:p>
+            <w:pPr>
+              <w:cnfStyle w:val="000000000000" w:firstRow="0" w:lastRow="0" w:firstColumn="0" w:lastColumn="0" w:oddVBand="0" w:evenVBand="0" w:oddHBand="0" w:evenHBand="0" w:firstRowFirstColumn="0" w:firstRowLastColumn="0" w:lastRowFirstColumn="0" w:lastRowLastColumn="0"/>
+            </w:pPr>
+          </w:p>
+          <w:p>
+            <w:pPr>
+              <w:cnfStyle w:val="000000000000" w:firstRow="0" w:lastRow="0" w:firstColumn="0" w:lastColumn="0" w:oddVBand="0" w:evenVBand="0" w:oddHBand="0" w:evenHBand="0" w:firstRowFirstColumn="0" w:firstRowLastColumn="0" w:lastRowFirstColumn="0" w:lastRowLastColumn="0"/>
+            </w:pPr>
+            <w:r>
+              <w:t xml:space="preserve">Peut tomber en panne aussi ce qui rend le site inaccessible </w:t>
+            </w:r>
+          </w:p>
+        </w:tc>
+        <w:tc>
+          <w:tcPr>
+            <w:tcW w:w="833" w:type="pct"/>
+          </w:tcPr>
+          <w:p>
+            <w:pPr>
+              <w:spacing w:line="259" w:lineRule="auto"/>
               <w:jc w:val="center"/>
               <w:cnfStyle w:val="000000000000" w:firstRow="0" w:lastRow="0" w:firstColumn="0" w:lastColumn="0" w:oddVBand="0" w:evenVBand="0" w:oddHBand="0" w:evenHBand="0" w:firstRowFirstColumn="0" w:firstRowLastColumn="0" w:lastRowFirstColumn="0" w:lastRowLastColumn="0"/>
             </w:pPr>
-            <w:r>
-              <w:t>https://www.ovhcloud.com/fr-ca/vps/</w:t>
-            </w:r>
+            <w:hyperlink r:id="rId13" w:history="1">
+              <w:r>
+                <w:rPr>
+                  <w:rStyle w:val="Lienhypertexte"/>
+                </w:rPr>
+                <w:t>https://www.ovhcloud.com/fr-ca/web-hosting/</w:t>
+              </w:r>
+            </w:hyperlink>
+          </w:p>
+          <w:p>
+            <w:pPr>
+              <w:jc w:val="center"/>
+              <w:cnfStyle w:val="000000000000" w:firstRow="0" w:lastRow="0" w:firstColumn="0" w:lastColumn="0" w:oddVBand="0" w:evenVBand="0" w:oddHBand="0" w:evenHBand="0" w:firstRowFirstColumn="0" w:firstRowLastColumn="0" w:lastRowFirstColumn="0" w:lastRowLastColumn="0"/>
+            </w:pPr>
           </w:p>
         </w:tc>
         <w:tc>
@@ -1446,6 +1602,9 @@
             <w:pPr>
               <w:cnfStyle w:val="000000000000" w:firstRow="0" w:lastRow="0" w:firstColumn="0" w:lastColumn="0" w:oddVBand="0" w:evenVBand="0" w:oddHBand="0" w:evenHBand="0" w:firstRowFirstColumn="0" w:firstRowLastColumn="0" w:lastRowFirstColumn="0" w:lastRowLastColumn="0"/>
             </w:pPr>
+            <w:r>
+              <w:t>Ne serait pas tant adéquat à moins d’avoir un serveur qui permet de faires les tâches backend qu’on relie au site web. Un nom de domaine nous serait donné aussi</w:t>
+            </w:r>
           </w:p>
         </w:tc>
       </w:tr>
@@ -1623,6 +1782,9 @@
             <w:pPr>
               <w:spacing w:line="259" w:lineRule="auto"/>
             </w:pPr>
+            <w:r>
+              <w:t>API WEB de la STM</w:t>
+            </w:r>
           </w:p>
         </w:tc>
         <w:tc>
@@ -1634,6 +1796,23 @@
               <w:spacing w:line="259" w:lineRule="auto"/>
               <w:cnfStyle w:val="000000100000" w:firstRow="0" w:lastRow="0" w:firstColumn="0" w:lastColumn="0" w:oddVBand="0" w:evenVBand="0" w:oddHBand="1" w:evenHBand="0" w:firstRowFirstColumn="0" w:firstRowLastColumn="0" w:lastRowFirstColumn="0" w:lastRowLastColumn="0"/>
             </w:pPr>
+            <w:r>
+              <w:t xml:space="preserve">L'API web de la </w:t>
+            </w:r>
+            <w:proofErr w:type="gramStart"/>
+            <w:r>
+              <w:t>STM</w:t>
+            </w:r>
+            <w:r>
+              <w:t xml:space="preserve"> </w:t>
+            </w:r>
+            <w:r>
+              <w:t xml:space="preserve"> permet</w:t>
+            </w:r>
+            <w:proofErr w:type="gramEnd"/>
+            <w:r>
+              <w:t xml:space="preserve"> aux développeurs d'accéder aux données et aux fonctionnalités liées au réseau de transport en commun de Montréal.</w:t>
+            </w:r>
           </w:p>
         </w:tc>
         <w:tc>
@@ -1642,31 +1821,76 @@
           </w:tcPr>
           <w:p>
             <w:pPr>
-              <w:spacing w:line="259" w:lineRule="auto"/>
+              <w:pStyle w:val="Paragraphedeliste"/>
+              <w:numPr>
+                <w:ilvl w:val="0"/>
+                <w:numId w:val="6"/>
+              </w:numPr>
               <w:cnfStyle w:val="000000100000" w:firstRow="0" w:lastRow="0" w:firstColumn="0" w:lastColumn="0" w:oddVBand="0" w:evenVBand="0" w:oddHBand="1" w:evenHBand="0" w:firstRowFirstColumn="0" w:firstRowLastColumn="0" w:lastRowFirstColumn="0" w:lastRowLastColumn="0"/>
             </w:pPr>
-          </w:p>
-        </w:tc>
-        <w:tc>
-          <w:tcPr>
-            <w:tcW w:w="833" w:type="pct"/>
-          </w:tcPr>
-          <w:p>
-            <w:pPr>
-              <w:spacing w:line="259" w:lineRule="auto"/>
+            <w:r>
+              <w:t>Accès aux Données en Temps Réel</w:t>
+            </w:r>
+          </w:p>
+          <w:p>
+            <w:pPr>
+              <w:pStyle w:val="Paragraphedeliste"/>
+              <w:numPr>
+                <w:ilvl w:val="0"/>
+                <w:numId w:val="6"/>
+              </w:numPr>
               <w:cnfStyle w:val="000000100000" w:firstRow="0" w:lastRow="0" w:firstColumn="0" w:lastColumn="0" w:oddVBand="0" w:evenVBand="0" w:oddHBand="1" w:evenHBand="0" w:firstRowFirstColumn="0" w:firstRowLastColumn="0" w:lastRowFirstColumn="0" w:lastRowLastColumn="0"/>
             </w:pPr>
-          </w:p>
-        </w:tc>
-        <w:tc>
-          <w:tcPr>
-            <w:tcW w:w="833" w:type="pct"/>
-          </w:tcPr>
-          <w:p>
-            <w:pPr>
-              <w:spacing w:line="259" w:lineRule="auto"/>
+            <w:r>
+              <w:t xml:space="preserve">Pas besoin de construire </w:t>
+            </w:r>
+            <w:r>
+              <w:t>une api vue</w:t>
+            </w:r>
+            <w:r>
+              <w:t xml:space="preserve"> qu’elle est disponible</w:t>
+            </w:r>
+          </w:p>
+          <w:p>
+            <w:pPr>
+              <w:pStyle w:val="Paragraphedeliste"/>
+              <w:numPr>
+                <w:ilvl w:val="0"/>
+                <w:numId w:val="6"/>
+              </w:numPr>
               <w:cnfStyle w:val="000000100000" w:firstRow="0" w:lastRow="0" w:firstColumn="0" w:lastColumn="0" w:oddVBand="0" w:evenVBand="0" w:oddHBand="1" w:evenHBand="0" w:firstRowFirstColumn="0" w:firstRowLastColumn="0" w:lastRowFirstColumn="0" w:lastRowLastColumn="0"/>
             </w:pPr>
+            <w:r>
+              <w:t>Personnalisation des Services</w:t>
+            </w:r>
+          </w:p>
+        </w:tc>
+        <w:tc>
+          <w:tcPr>
+            <w:tcW w:w="833" w:type="pct"/>
+          </w:tcPr>
+          <w:p>
+            <w:pPr>
+              <w:spacing w:line="259" w:lineRule="auto"/>
+              <w:cnfStyle w:val="000000100000" w:firstRow="0" w:lastRow="0" w:firstColumn="0" w:lastColumn="0" w:oddVBand="0" w:evenVBand="0" w:oddHBand="1" w:evenHBand="0" w:firstRowFirstColumn="0" w:firstRowLastColumn="0" w:lastRowFirstColumn="0" w:lastRowLastColumn="0"/>
+            </w:pPr>
+            <w:r>
+              <w:t>On ne peut pas modifier l’API telle qu’elle mais on peut faire surement faire une demande pour répondre à un besoin spécifique</w:t>
+            </w:r>
+          </w:p>
+        </w:tc>
+        <w:tc>
+          <w:tcPr>
+            <w:tcW w:w="833" w:type="pct"/>
+          </w:tcPr>
+          <w:p>
+            <w:pPr>
+              <w:spacing w:line="259" w:lineRule="auto"/>
+              <w:cnfStyle w:val="000000100000" w:firstRow="0" w:lastRow="0" w:firstColumn="0" w:lastColumn="0" w:oddVBand="0" w:evenVBand="0" w:oddHBand="1" w:evenHBand="0" w:firstRowFirstColumn="0" w:firstRowLastColumn="0" w:lastRowFirstColumn="0" w:lastRowLastColumn="0"/>
+            </w:pPr>
+            <w:r>
+              <w:t>https://www.stm.info/fr/a-propos/developpeurs</w:t>
+            </w:r>
           </w:p>
         </w:tc>
         <w:tc>
@@ -1676,6 +1900,210 @@
           <w:p>
             <w:pPr>
               <w:spacing w:line="259" w:lineRule="auto"/>
+              <w:cnfStyle w:val="000000100000" w:firstRow="0" w:lastRow="0" w:firstColumn="0" w:lastColumn="0" w:oddVBand="0" w:evenVBand="0" w:oddHBand="1" w:evenHBand="0" w:firstRowFirstColumn="0" w:firstRowLastColumn="0" w:lastRowFirstColumn="0" w:lastRowLastColumn="0"/>
+            </w:pPr>
+            <w:r>
+              <w:t>Serait très bon à utiliser, car il est gratuit et est déjà fait donc pas besoin de faire un API mais de l’utiliser pour nos fins</w:t>
+            </w:r>
+          </w:p>
+        </w:tc>
+      </w:tr>
+      <w:tr>
+        <w:tc>
+          <w:tcPr>
+            <w:cnfStyle w:val="001000000000" w:firstRow="0" w:lastRow="0" w:firstColumn="1" w:lastColumn="0" w:oddVBand="0" w:evenVBand="0" w:oddHBand="0" w:evenHBand="0" w:firstRowFirstColumn="0" w:firstRowLastColumn="0" w:lastRowFirstColumn="0" w:lastRowLastColumn="0"/>
+            <w:tcW w:w="833" w:type="pct"/>
+          </w:tcPr>
+          <w:p>
+            <w:r>
+              <w:t>PostgreSQL</w:t>
+            </w:r>
+          </w:p>
+        </w:tc>
+        <w:tc>
+          <w:tcPr>
+            <w:tcW w:w="833" w:type="pct"/>
+          </w:tcPr>
+          <w:p>
+            <w:pPr>
+              <w:cnfStyle w:val="000000000000" w:firstRow="0" w:lastRow="0" w:firstColumn="0" w:lastColumn="0" w:oddVBand="0" w:evenVBand="0" w:oddHBand="0" w:evenHBand="0" w:firstRowFirstColumn="0" w:firstRowLastColumn="0" w:lastRowFirstColumn="0" w:lastRowLastColumn="0"/>
+            </w:pPr>
+            <w:r>
+              <w:t>PostgreSQL est une puissante base de données relationnelle open source utilisée pour stocker, gérer et interroger efficacement</w:t>
+            </w:r>
+          </w:p>
+        </w:tc>
+        <w:tc>
+          <w:tcPr>
+            <w:tcW w:w="834" w:type="pct"/>
+          </w:tcPr>
+          <w:p>
+            <w:pPr>
+              <w:pStyle w:val="Paragraphedeliste"/>
+              <w:numPr>
+                <w:ilvl w:val="0"/>
+                <w:numId w:val="8"/>
+              </w:numPr>
+              <w:cnfStyle w:val="000000000000" w:firstRow="0" w:lastRow="0" w:firstColumn="0" w:lastColumn="0" w:oddVBand="0" w:evenVBand="0" w:oddHBand="0" w:evenHBand="0" w:firstRowFirstColumn="0" w:firstRowLastColumn="0" w:lastRowFirstColumn="0" w:lastRowLastColumn="0"/>
+            </w:pPr>
+            <w:r>
+              <w:t>Peut stocker de données Géospatiale</w:t>
+            </w:r>
+          </w:p>
+          <w:p>
+            <w:pPr>
+              <w:pStyle w:val="Paragraphedeliste"/>
+              <w:numPr>
+                <w:ilvl w:val="0"/>
+                <w:numId w:val="8"/>
+              </w:numPr>
+              <w:cnfStyle w:val="000000000000" w:firstRow="0" w:lastRow="0" w:firstColumn="0" w:lastColumn="0" w:oddVBand="0" w:evenVBand="0" w:oddHBand="0" w:evenHBand="0" w:firstRowFirstColumn="0" w:firstRowLastColumn="0" w:lastRowFirstColumn="0" w:lastRowLastColumn="0"/>
+            </w:pPr>
+            <w:r>
+              <w:t>Stabilité et Fiabilité</w:t>
+            </w:r>
+          </w:p>
+          <w:p>
+            <w:pPr>
+              <w:pStyle w:val="Paragraphedeliste"/>
+              <w:numPr>
+                <w:ilvl w:val="0"/>
+                <w:numId w:val="8"/>
+              </w:numPr>
+              <w:cnfStyle w:val="000000000000" w:firstRow="0" w:lastRow="0" w:firstColumn="0" w:lastColumn="0" w:oddVBand="0" w:evenVBand="0" w:oddHBand="0" w:evenHBand="0" w:firstRowFirstColumn="0" w:firstRowLastColumn="0" w:lastRowFirstColumn="0" w:lastRowLastColumn="0"/>
+            </w:pPr>
+            <w:r>
+              <w:t>Extensibilité et Polyvalence</w:t>
+            </w:r>
+          </w:p>
+        </w:tc>
+        <w:tc>
+          <w:tcPr>
+            <w:tcW w:w="833" w:type="pct"/>
+          </w:tcPr>
+          <w:p>
+            <w:pPr>
+              <w:cnfStyle w:val="000000000000" w:firstRow="0" w:lastRow="0" w:firstColumn="0" w:lastColumn="0" w:oddVBand="0" w:evenVBand="0" w:oddHBand="0" w:evenHBand="0" w:firstRowFirstColumn="0" w:firstRowLastColumn="0" w:lastRowFirstColumn="0" w:lastRowLastColumn="0"/>
+            </w:pPr>
+            <w:r>
+              <w:t>Potentiellement problème de p</w:t>
+            </w:r>
+            <w:r>
+              <w:t>erformance à Grande Échelle</w:t>
+            </w:r>
+          </w:p>
+          <w:p>
+            <w:pPr>
+              <w:cnfStyle w:val="000000000000" w:firstRow="0" w:lastRow="0" w:firstColumn="0" w:lastColumn="0" w:oddVBand="0" w:evenVBand="0" w:oddHBand="0" w:evenHBand="0" w:firstRowFirstColumn="0" w:firstRowLastColumn="0" w:lastRowFirstColumn="0" w:lastRowLastColumn="0"/>
+            </w:pPr>
+          </w:p>
+          <w:p>
+            <w:pPr>
+              <w:cnfStyle w:val="000000000000" w:firstRow="0" w:lastRow="0" w:firstColumn="0" w:lastColumn="0" w:oddVBand="0" w:evenVBand="0" w:oddHBand="0" w:evenHBand="0" w:firstRowFirstColumn="0" w:firstRowLastColumn="0" w:lastRowFirstColumn="0" w:lastRowLastColumn="0"/>
+            </w:pPr>
+            <w:r>
+              <w:t>Complexité de Configuration</w:t>
+            </w:r>
+          </w:p>
+        </w:tc>
+        <w:tc>
+          <w:tcPr>
+            <w:tcW w:w="833" w:type="pct"/>
+          </w:tcPr>
+          <w:p>
+            <w:pPr>
+              <w:cnfStyle w:val="000000000000" w:firstRow="0" w:lastRow="0" w:firstColumn="0" w:lastColumn="0" w:oddVBand="0" w:evenVBand="0" w:oddHBand="0" w:evenHBand="0" w:firstRowFirstColumn="0" w:firstRowLastColumn="0" w:lastRowFirstColumn="0" w:lastRowLastColumn="0"/>
+            </w:pPr>
+            <w:r>
+              <w:t>https://www.postgresql.org/</w:t>
+            </w:r>
+          </w:p>
+        </w:tc>
+        <w:tc>
+          <w:tcPr>
+            <w:tcW w:w="834" w:type="pct"/>
+          </w:tcPr>
+          <w:p>
+            <w:pPr>
+              <w:cnfStyle w:val="000000000000" w:firstRow="0" w:lastRow="0" w:firstColumn="0" w:lastColumn="0" w:oddVBand="0" w:evenVBand="0" w:oddHBand="0" w:evenHBand="0" w:firstRowFirstColumn="0" w:firstRowLastColumn="0" w:lastRowFirstColumn="0" w:lastRowLastColumn="0"/>
+            </w:pPr>
+            <w:r>
+              <w:t xml:space="preserve">Permettrais de stocker des donné autant utilisateur que provenant de l’API et on </w:t>
+            </w:r>
+            <w:proofErr w:type="gramStart"/>
+            <w:r>
+              <w:t>pourrais</w:t>
+            </w:r>
+            <w:proofErr w:type="gramEnd"/>
+            <w:r>
+              <w:t xml:space="preserve"> le mettre sur le VPS</w:t>
+            </w:r>
+          </w:p>
+        </w:tc>
+      </w:tr>
+      <w:tr>
+        <w:trPr>
+          <w:cnfStyle w:val="000000100000" w:firstRow="0" w:lastRow="0" w:firstColumn="0" w:lastColumn="0" w:oddVBand="0" w:evenVBand="0" w:oddHBand="1" w:evenHBand="0" w:firstRowFirstColumn="0" w:firstRowLastColumn="0" w:lastRowFirstColumn="0" w:lastRowLastColumn="0"/>
+        </w:trPr>
+        <w:tc>
+          <w:tcPr>
+            <w:cnfStyle w:val="001000000000" w:firstRow="0" w:lastRow="0" w:firstColumn="1" w:lastColumn="0" w:oddVBand="0" w:evenVBand="0" w:oddHBand="0" w:evenHBand="0" w:firstRowFirstColumn="0" w:firstRowLastColumn="0" w:lastRowFirstColumn="0" w:lastRowLastColumn="0"/>
+            <w:tcW w:w="833" w:type="pct"/>
+          </w:tcPr>
+          <w:p/>
+        </w:tc>
+        <w:tc>
+          <w:tcPr>
+            <w:tcW w:w="833" w:type="pct"/>
+          </w:tcPr>
+          <w:p>
+            <w:pPr>
+              <w:cnfStyle w:val="000000100000" w:firstRow="0" w:lastRow="0" w:firstColumn="0" w:lastColumn="0" w:oddVBand="0" w:evenVBand="0" w:oddHBand="1" w:evenHBand="0" w:firstRowFirstColumn="0" w:firstRowLastColumn="0" w:lastRowFirstColumn="0" w:lastRowLastColumn="0"/>
+            </w:pPr>
+          </w:p>
+        </w:tc>
+        <w:tc>
+          <w:tcPr>
+            <w:tcW w:w="834" w:type="pct"/>
+          </w:tcPr>
+          <w:p>
+            <w:pPr>
+              <w:pStyle w:val="Paragraphedeliste"/>
+              <w:numPr>
+                <w:ilvl w:val="0"/>
+                <w:numId w:val="0"/>
+              </w:numPr>
+              <w:ind w:left="720"/>
+              <w:cnfStyle w:val="000000100000" w:firstRow="0" w:lastRow="0" w:firstColumn="0" w:lastColumn="0" w:oddVBand="0" w:evenVBand="0" w:oddHBand="1" w:evenHBand="0" w:firstRowFirstColumn="0" w:firstRowLastColumn="0" w:lastRowFirstColumn="0" w:lastRowLastColumn="0"/>
+            </w:pPr>
+          </w:p>
+        </w:tc>
+        <w:tc>
+          <w:tcPr>
+            <w:tcW w:w="833" w:type="pct"/>
+          </w:tcPr>
+          <w:p>
+            <w:pPr>
+              <w:cnfStyle w:val="000000100000" w:firstRow="0" w:lastRow="0" w:firstColumn="0" w:lastColumn="0" w:oddVBand="0" w:evenVBand="0" w:oddHBand="1" w:evenHBand="0" w:firstRowFirstColumn="0" w:firstRowLastColumn="0" w:lastRowFirstColumn="0" w:lastRowLastColumn="0"/>
+            </w:pPr>
+          </w:p>
+        </w:tc>
+        <w:tc>
+          <w:tcPr>
+            <w:tcW w:w="833" w:type="pct"/>
+          </w:tcPr>
+          <w:p>
+            <w:pPr>
+              <w:cnfStyle w:val="000000100000" w:firstRow="0" w:lastRow="0" w:firstColumn="0" w:lastColumn="0" w:oddVBand="0" w:evenVBand="0" w:oddHBand="1" w:evenHBand="0" w:firstRowFirstColumn="0" w:firstRowLastColumn="0" w:lastRowFirstColumn="0" w:lastRowLastColumn="0"/>
+            </w:pPr>
+          </w:p>
+        </w:tc>
+        <w:tc>
+          <w:tcPr>
+            <w:tcW w:w="834" w:type="pct"/>
+          </w:tcPr>
+          <w:p>
+            <w:pPr>
               <w:cnfStyle w:val="000000100000" w:firstRow="0" w:lastRow="0" w:firstColumn="0" w:lastColumn="0" w:oddVBand="0" w:evenVBand="0" w:oddHBand="1" w:evenHBand="0" w:firstRowFirstColumn="0" w:firstRowLastColumn="0" w:lastRowFirstColumn="0" w:lastRowLastColumn="0"/>
             </w:pPr>
           </w:p>
@@ -1928,6 +2356,9 @@
             <w:pPr>
               <w:spacing w:line="259" w:lineRule="auto"/>
             </w:pPr>
+            <w:r>
+              <w:t>Python</w:t>
+            </w:r>
           </w:p>
         </w:tc>
         <w:tc>
@@ -1939,6 +2370,15 @@
               <w:spacing w:line="259" w:lineRule="auto"/>
               <w:cnfStyle w:val="000000100000" w:firstRow="0" w:lastRow="0" w:firstColumn="0" w:lastColumn="0" w:oddVBand="0" w:evenVBand="0" w:oddHBand="1" w:evenHBand="0" w:firstRowFirstColumn="0" w:firstRowLastColumn="0" w:lastRowFirstColumn="0" w:lastRowLastColumn="0"/>
             </w:pPr>
+            <w:r>
+              <w:t xml:space="preserve">Python est un langage de programmation polyvalent, largement utilisé pour </w:t>
+            </w:r>
+            <w:r>
+              <w:t>sa lisibilité</w:t>
+            </w:r>
+            <w:r>
+              <w:t>, sa simplicité syntaxique et sa polyvalence dans de nombreux domaines, de la programmation web à la science des données.</w:t>
+            </w:r>
           </w:p>
         </w:tc>
         <w:tc>
@@ -1947,31 +2387,70 @@
           </w:tcPr>
           <w:p>
             <w:pPr>
-              <w:spacing w:line="259" w:lineRule="auto"/>
+              <w:pStyle w:val="Paragraphedeliste"/>
+              <w:numPr>
+                <w:ilvl w:val="0"/>
+                <w:numId w:val="9"/>
+              </w:numPr>
               <w:cnfStyle w:val="000000100000" w:firstRow="0" w:lastRow="0" w:firstColumn="0" w:lastColumn="0" w:oddVBand="0" w:evenVBand="0" w:oddHBand="1" w:evenHBand="0" w:firstRowFirstColumn="0" w:firstRowLastColumn="0" w:lastRowFirstColumn="0" w:lastRowLastColumn="0"/>
             </w:pPr>
-          </w:p>
-        </w:tc>
-        <w:tc>
-          <w:tcPr>
-            <w:tcW w:w="833" w:type="pct"/>
-          </w:tcPr>
-          <w:p>
-            <w:pPr>
-              <w:spacing w:line="259" w:lineRule="auto"/>
+            <w:r>
+              <w:t>Facilité d'apprentissage et de lecture</w:t>
+            </w:r>
+          </w:p>
+          <w:p>
+            <w:pPr>
+              <w:pStyle w:val="Paragraphedeliste"/>
+              <w:numPr>
+                <w:ilvl w:val="0"/>
+                <w:numId w:val="9"/>
+              </w:numPr>
               <w:cnfStyle w:val="000000100000" w:firstRow="0" w:lastRow="0" w:firstColumn="0" w:lastColumn="0" w:oddVBand="0" w:evenVBand="0" w:oddHBand="1" w:evenHBand="0" w:firstRowFirstColumn="0" w:firstRowLastColumn="0" w:lastRowFirstColumn="0" w:lastRowLastColumn="0"/>
             </w:pPr>
-          </w:p>
-        </w:tc>
-        <w:tc>
-          <w:tcPr>
-            <w:tcW w:w="833" w:type="pct"/>
-          </w:tcPr>
-          <w:p>
-            <w:pPr>
-              <w:spacing w:line="259" w:lineRule="auto"/>
+            <w:r>
+              <w:t>Large écosystème de bibliothèques</w:t>
+            </w:r>
+          </w:p>
+          <w:p>
+            <w:pPr>
+              <w:pStyle w:val="Paragraphedeliste"/>
+              <w:numPr>
+                <w:ilvl w:val="0"/>
+                <w:numId w:val="9"/>
+              </w:numPr>
               <w:cnfStyle w:val="000000100000" w:firstRow="0" w:lastRow="0" w:firstColumn="0" w:lastColumn="0" w:oddVBand="0" w:evenVBand="0" w:oddHBand="1" w:evenHBand="0" w:firstRowFirstColumn="0" w:firstRowLastColumn="0" w:lastRowFirstColumn="0" w:lastRowLastColumn="0"/>
             </w:pPr>
+            <w:r>
+              <w:t>Communauté</w:t>
+            </w:r>
+            <w:r>
+              <w:t xml:space="preserve"> active</w:t>
+            </w:r>
+          </w:p>
+        </w:tc>
+        <w:tc>
+          <w:tcPr>
+            <w:tcW w:w="833" w:type="pct"/>
+          </w:tcPr>
+          <w:p>
+            <w:pPr>
+              <w:spacing w:line="259" w:lineRule="auto"/>
+              <w:cnfStyle w:val="000000100000" w:firstRow="0" w:lastRow="0" w:firstColumn="0" w:lastColumn="0" w:oddVBand="0" w:evenVBand="0" w:oddHBand="1" w:evenHBand="0" w:firstRowFirstColumn="0" w:firstRowLastColumn="0" w:lastRowFirstColumn="0" w:lastRowLastColumn="0"/>
+            </w:pPr>
+            <w:r>
+              <w:t>Peut potentiellement avoir de moins bonnes performances que JavaScript et peut être moins bon si on doit avoir une haute vitesse pour traiter beaucoup de données</w:t>
+            </w:r>
+          </w:p>
+        </w:tc>
+        <w:tc>
+          <w:tcPr>
+            <w:tcW w:w="833" w:type="pct"/>
+          </w:tcPr>
+          <w:p>
+            <w:pPr>
+              <w:spacing w:line="259" w:lineRule="auto"/>
+              <w:cnfStyle w:val="000000100000" w:firstRow="0" w:lastRow="0" w:firstColumn="0" w:lastColumn="0" w:oddVBand="0" w:evenVBand="0" w:oddHBand="1" w:evenHBand="0" w:firstRowFirstColumn="0" w:firstRowLastColumn="0" w:lastRowFirstColumn="0" w:lastRowLastColumn="0"/>
+            </w:pPr>
           </w:p>
         </w:tc>
         <w:tc>
@@ -1983,6 +2462,288 @@
               <w:spacing w:line="259" w:lineRule="auto"/>
               <w:cnfStyle w:val="000000100000" w:firstRow="0" w:lastRow="0" w:firstColumn="0" w:lastColumn="0" w:oddVBand="0" w:evenVBand="0" w:oddHBand="1" w:evenHBand="0" w:firstRowFirstColumn="0" w:firstRowLastColumn="0" w:lastRowFirstColumn="0" w:lastRowLastColumn="0"/>
             </w:pPr>
+            <w:r>
+              <w:t xml:space="preserve">Ce langage permet de faire le backend avec beaucoup de librairies accessibles et de l’aide est disponible si nécessaire. </w:t>
+            </w:r>
+          </w:p>
+        </w:tc>
+      </w:tr>
+      <w:tr>
+        <w:tc>
+          <w:tcPr>
+            <w:cnfStyle w:val="001000000000" w:firstRow="0" w:lastRow="0" w:firstColumn="1" w:lastColumn="0" w:oddVBand="0" w:evenVBand="0" w:oddHBand="0" w:evenHBand="0" w:firstRowFirstColumn="0" w:firstRowLastColumn="0" w:lastRowFirstColumn="0" w:lastRowLastColumn="0"/>
+            <w:tcW w:w="833" w:type="pct"/>
+          </w:tcPr>
+          <w:p>
+            <w:proofErr w:type="spellStart"/>
+            <w:r>
+              <w:t>GeoPandas</w:t>
+            </w:r>
+            <w:proofErr w:type="spellEnd"/>
+          </w:p>
+        </w:tc>
+        <w:tc>
+          <w:tcPr>
+            <w:tcW w:w="833" w:type="pct"/>
+          </w:tcPr>
+          <w:p>
+            <w:pPr>
+              <w:cnfStyle w:val="000000000000" w:firstRow="0" w:lastRow="0" w:firstColumn="0" w:lastColumn="0" w:oddVBand="0" w:evenVBand="0" w:oddHBand="0" w:evenHBand="0" w:firstRowFirstColumn="0" w:firstRowLastColumn="0" w:lastRowFirstColumn="0" w:lastRowLastColumn="0"/>
+            </w:pPr>
+            <w:proofErr w:type="spellStart"/>
+            <w:r>
+              <w:t>GeoPandas</w:t>
+            </w:r>
+            <w:proofErr w:type="spellEnd"/>
+            <w:r>
+              <w:t xml:space="preserve"> est une bibliothèque Python qui facilite la manipulation et l'analyse de données géospatiales en fournissant des structures de données géographiques et des outils d'analyse spatiale.</w:t>
+            </w:r>
+          </w:p>
+        </w:tc>
+        <w:tc>
+          <w:tcPr>
+            <w:tcW w:w="834" w:type="pct"/>
+          </w:tcPr>
+          <w:p>
+            <w:pPr>
+              <w:pStyle w:val="Paragraphedeliste"/>
+              <w:numPr>
+                <w:ilvl w:val="0"/>
+                <w:numId w:val="10"/>
+              </w:numPr>
+              <w:cnfStyle w:val="000000000000" w:firstRow="0" w:lastRow="0" w:firstColumn="0" w:lastColumn="0" w:oddVBand="0" w:evenVBand="0" w:oddHBand="0" w:evenHBand="0" w:firstRowFirstColumn="0" w:firstRowLastColumn="0" w:lastRowFirstColumn="0" w:lastRowLastColumn="0"/>
+            </w:pPr>
+            <w:r>
+              <w:t>Facilité d'utilisation</w:t>
+            </w:r>
+          </w:p>
+          <w:p>
+            <w:pPr>
+              <w:pStyle w:val="Paragraphedeliste"/>
+              <w:numPr>
+                <w:ilvl w:val="0"/>
+                <w:numId w:val="10"/>
+              </w:numPr>
+              <w:cnfStyle w:val="000000000000" w:firstRow="0" w:lastRow="0" w:firstColumn="0" w:lastColumn="0" w:oddVBand="0" w:evenVBand="0" w:oddHBand="0" w:evenHBand="0" w:firstRowFirstColumn="0" w:firstRowLastColumn="0" w:lastRowFirstColumn="0" w:lastRowLastColumn="0"/>
+            </w:pPr>
+            <w:r>
+              <w:t>Traitement de données géospatiales complètes</w:t>
+            </w:r>
+          </w:p>
+          <w:p>
+            <w:pPr>
+              <w:pStyle w:val="Paragraphedeliste"/>
+              <w:numPr>
+                <w:ilvl w:val="0"/>
+                <w:numId w:val="10"/>
+              </w:numPr>
+              <w:cnfStyle w:val="000000000000" w:firstRow="0" w:lastRow="0" w:firstColumn="0" w:lastColumn="0" w:oddVBand="0" w:evenVBand="0" w:oddHBand="0" w:evenHBand="0" w:firstRowFirstColumn="0" w:firstRowLastColumn="0" w:lastRowFirstColumn="0" w:lastRowLastColumn="0"/>
+            </w:pPr>
+            <w:r>
+              <w:t xml:space="preserve">Intégration </w:t>
+            </w:r>
+            <w:r>
+              <w:t>facile</w:t>
+            </w:r>
+            <w:r>
+              <w:t xml:space="preserve"> avec d'autres bibliothèques</w:t>
+            </w:r>
+          </w:p>
+        </w:tc>
+        <w:tc>
+          <w:tcPr>
+            <w:tcW w:w="833" w:type="pct"/>
+          </w:tcPr>
+          <w:p>
+            <w:pPr>
+              <w:cnfStyle w:val="000000000000" w:firstRow="0" w:lastRow="0" w:firstColumn="0" w:lastColumn="0" w:oddVBand="0" w:evenVBand="0" w:oddHBand="0" w:evenHBand="0" w:firstRowFirstColumn="0" w:firstRowLastColumn="0" w:lastRowFirstColumn="0" w:lastRowLastColumn="0"/>
+            </w:pPr>
+            <w:r>
+              <w:t>Certaines opérations géospatiales avancées peuvent nécessiter une connaissance approfondie des concepts géospatiaux, ce qui peut rendre complexe la mise en œuvre de certaines tâches</w:t>
+            </w:r>
+          </w:p>
+        </w:tc>
+        <w:tc>
+          <w:tcPr>
+            <w:tcW w:w="833" w:type="pct"/>
+          </w:tcPr>
+          <w:p>
+            <w:pPr>
+              <w:cnfStyle w:val="000000000000" w:firstRow="0" w:lastRow="0" w:firstColumn="0" w:lastColumn="0" w:oddVBand="0" w:evenVBand="0" w:oddHBand="0" w:evenHBand="0" w:firstRowFirstColumn="0" w:firstRowLastColumn="0" w:lastRowFirstColumn="0" w:lastRowLastColumn="0"/>
+              <w:rPr>
+                <w:lang w:val="en-CA"/>
+              </w:rPr>
+            </w:pPr>
+          </w:p>
+        </w:tc>
+        <w:tc>
+          <w:tcPr>
+            <w:tcW w:w="834" w:type="pct"/>
+          </w:tcPr>
+          <w:p>
+            <w:pPr>
+              <w:cnfStyle w:val="000000000000" w:firstRow="0" w:lastRow="0" w:firstColumn="0" w:lastColumn="0" w:oddVBand="0" w:evenVBand="0" w:oddHBand="0" w:evenHBand="0" w:firstRowFirstColumn="0" w:firstRowLastColumn="0" w:lastRowFirstColumn="0" w:lastRowLastColumn="0"/>
+            </w:pPr>
+            <w:r>
+              <w:t>Librairie qui facilite la manipulation de données GTFS qui provient de Python et donc utilisable au niveau backend</w:t>
+            </w:r>
+          </w:p>
+        </w:tc>
+      </w:tr>
+      <w:tr>
+        <w:trPr>
+          <w:cnfStyle w:val="000000100000" w:firstRow="0" w:lastRow="0" w:firstColumn="0" w:lastColumn="0" w:oddVBand="0" w:evenVBand="0" w:oddHBand="1" w:evenHBand="0" w:firstRowFirstColumn="0" w:firstRowLastColumn="0" w:lastRowFirstColumn="0" w:lastRowLastColumn="0"/>
+        </w:trPr>
+        <w:tc>
+          <w:tcPr>
+            <w:cnfStyle w:val="001000000000" w:firstRow="0" w:lastRow="0" w:firstColumn="1" w:lastColumn="0" w:oddVBand="0" w:evenVBand="0" w:oddHBand="0" w:evenHBand="0" w:firstRowFirstColumn="0" w:firstRowLastColumn="0" w:lastRowFirstColumn="0" w:lastRowLastColumn="0"/>
+            <w:tcW w:w="833" w:type="pct"/>
+          </w:tcPr>
+          <w:p>
+            <w:proofErr w:type="spellStart"/>
+            <w:r>
+              <w:t>Angular</w:t>
+            </w:r>
+            <w:proofErr w:type="spellEnd"/>
+          </w:p>
+        </w:tc>
+        <w:tc>
+          <w:tcPr>
+            <w:tcW w:w="833" w:type="pct"/>
+          </w:tcPr>
+          <w:p>
+            <w:pPr>
+              <w:cnfStyle w:val="000000100000" w:firstRow="0" w:lastRow="0" w:firstColumn="0" w:lastColumn="0" w:oddVBand="0" w:evenVBand="0" w:oddHBand="1" w:evenHBand="0" w:firstRowFirstColumn="0" w:firstRowLastColumn="0" w:lastRowFirstColumn="0" w:lastRowLastColumn="0"/>
+            </w:pPr>
+            <w:proofErr w:type="spellStart"/>
+            <w:r>
+              <w:t>Angular</w:t>
+            </w:r>
+            <w:proofErr w:type="spellEnd"/>
+            <w:r>
+              <w:t xml:space="preserve"> est un </w:t>
+            </w:r>
+            <w:proofErr w:type="spellStart"/>
+            <w:r>
+              <w:t>framework</w:t>
+            </w:r>
+            <w:proofErr w:type="spellEnd"/>
+            <w:r>
+              <w:t xml:space="preserve"> de développement web open source basé sur </w:t>
+            </w:r>
+            <w:proofErr w:type="spellStart"/>
+            <w:r>
+              <w:t>TypeScript</w:t>
+            </w:r>
+            <w:proofErr w:type="spellEnd"/>
+            <w:r>
+              <w:t>, utilisé pour créer des applications web interactives, dynamiques et évolutives.</w:t>
+            </w:r>
+          </w:p>
+        </w:tc>
+        <w:tc>
+          <w:tcPr>
+            <w:tcW w:w="834" w:type="pct"/>
+          </w:tcPr>
+          <w:p>
+            <w:pPr>
+              <w:pStyle w:val="Paragraphedeliste"/>
+              <w:numPr>
+                <w:ilvl w:val="0"/>
+                <w:numId w:val="10"/>
+              </w:numPr>
+              <w:cnfStyle w:val="000000100000" w:firstRow="0" w:lastRow="0" w:firstColumn="0" w:lastColumn="0" w:oddVBand="0" w:evenVBand="0" w:oddHBand="1" w:evenHBand="0" w:firstRowFirstColumn="0" w:firstRowLastColumn="0" w:lastRowFirstColumn="0" w:lastRowLastColumn="0"/>
+            </w:pPr>
+            <w:r>
+              <w:t>Structure organisée</w:t>
+            </w:r>
+          </w:p>
+          <w:p>
+            <w:pPr>
+              <w:pStyle w:val="Paragraphedeliste"/>
+              <w:numPr>
+                <w:ilvl w:val="0"/>
+                <w:numId w:val="10"/>
+              </w:numPr>
+              <w:cnfStyle w:val="000000100000" w:firstRow="0" w:lastRow="0" w:firstColumn="0" w:lastColumn="0" w:oddVBand="0" w:evenVBand="0" w:oddHBand="1" w:evenHBand="0" w:firstRowFirstColumn="0" w:firstRowLastColumn="0" w:lastRowFirstColumn="0" w:lastRowLastColumn="0"/>
+            </w:pPr>
+            <w:r>
+              <w:t>Optimisation des performances</w:t>
+            </w:r>
+          </w:p>
+        </w:tc>
+        <w:tc>
+          <w:tcPr>
+            <w:tcW w:w="833" w:type="pct"/>
+          </w:tcPr>
+          <w:p>
+            <w:pPr>
+              <w:pStyle w:val="Paragraphedeliste"/>
+              <w:numPr>
+                <w:ilvl w:val="0"/>
+                <w:numId w:val="10"/>
+              </w:numPr>
+              <w:cnfStyle w:val="000000100000" w:firstRow="0" w:lastRow="0" w:firstColumn="0" w:lastColumn="0" w:oddVBand="0" w:evenVBand="0" w:oddHBand="1" w:evenHBand="0" w:firstRowFirstColumn="0" w:firstRowLastColumn="0" w:lastRowFirstColumn="0" w:lastRowLastColumn="0"/>
+            </w:pPr>
+            <w:r>
+              <w:t>Poids de la taille du bundle</w:t>
+            </w:r>
+          </w:p>
+          <w:p>
+            <w:pPr>
+              <w:pStyle w:val="Paragraphedeliste"/>
+              <w:numPr>
+                <w:ilvl w:val="0"/>
+                <w:numId w:val="10"/>
+              </w:numPr>
+              <w:cnfStyle w:val="000000100000" w:firstRow="0" w:lastRow="0" w:firstColumn="0" w:lastColumn="0" w:oddVBand="0" w:evenVBand="0" w:oddHBand="1" w:evenHBand="0" w:firstRowFirstColumn="0" w:firstRowLastColumn="0" w:lastRowFirstColumn="0" w:lastRowLastColumn="0"/>
+            </w:pPr>
+            <w:r>
+              <w:t>Mises à jour majeures</w:t>
+            </w:r>
+            <w:r>
+              <w:t xml:space="preserve"> </w:t>
+            </w:r>
+            <w:r>
+              <w:t>nécessite</w:t>
+            </w:r>
+            <w:r>
+              <w:t xml:space="preserve"> des changements </w:t>
+            </w:r>
+            <w:r>
+              <w:t>parfois</w:t>
+            </w:r>
+          </w:p>
+        </w:tc>
+        <w:tc>
+          <w:tcPr>
+            <w:tcW w:w="833" w:type="pct"/>
+          </w:tcPr>
+          <w:p>
+            <w:pPr>
+              <w:cnfStyle w:val="000000100000" w:firstRow="0" w:lastRow="0" w:firstColumn="0" w:lastColumn="0" w:oddVBand="0" w:evenVBand="0" w:oddHBand="1" w:evenHBand="0" w:firstRowFirstColumn="0" w:firstRowLastColumn="0" w:lastRowFirstColumn="0" w:lastRowLastColumn="0"/>
+            </w:pPr>
+          </w:p>
+        </w:tc>
+        <w:tc>
+          <w:tcPr>
+            <w:tcW w:w="834" w:type="pct"/>
+          </w:tcPr>
+          <w:p>
+            <w:pPr>
+              <w:cnfStyle w:val="000000100000" w:firstRow="0" w:lastRow="0" w:firstColumn="0" w:lastColumn="0" w:oddVBand="0" w:evenVBand="0" w:oddHBand="1" w:evenHBand="0" w:firstRowFirstColumn="0" w:firstRowLastColumn="0" w:lastRowFirstColumn="0" w:lastRowLastColumn="0"/>
+            </w:pPr>
+            <w:r>
+              <w:t xml:space="preserve">Sera adéquat pour faire un frontend pour les utilisateurs qui se mélange bien à </w:t>
+            </w:r>
+            <w:proofErr w:type="spellStart"/>
+            <w:r>
+              <w:t>bootstrap</w:t>
+            </w:r>
+            <w:proofErr w:type="spellEnd"/>
+            <w:r>
+              <w:t xml:space="preserve"> pour faire un site web attrayant héberger sur le VPS</w:t>
+            </w:r>
           </w:p>
         </w:tc>
       </w:tr>
@@ -1994,6 +2755,7 @@
       </w:pPr>
       <w:bookmarkStart w:id="5" w:name="_Toc144118373"/>
       <w:r>
+        <w:lastRenderedPageBreak/>
         <w:t>Environnement de développement</w:t>
       </w:r>
       <w:bookmarkEnd w:id="5"/>
@@ -2185,6 +2947,9 @@
             <w:pPr>
               <w:spacing w:line="259" w:lineRule="auto"/>
             </w:pPr>
+            <w:r>
+              <w:t>Visual Studio Code</w:t>
+            </w:r>
           </w:p>
         </w:tc>
         <w:tc>
@@ -2196,6 +2961,9 @@
               <w:spacing w:line="259" w:lineRule="auto"/>
               <w:cnfStyle w:val="000000100000" w:firstRow="0" w:lastRow="0" w:firstColumn="0" w:lastColumn="0" w:oddVBand="0" w:evenVBand="0" w:oddHBand="1" w:evenHBand="0" w:firstRowFirstColumn="0" w:firstRowLastColumn="0" w:lastRowFirstColumn="0" w:lastRowLastColumn="0"/>
             </w:pPr>
+            <w:r>
+              <w:t>VS Code est un environnement de développement intégré (IDE) léger et open source, développé par Microsoft, qui offre des fonctionnalités avancées pour la programmation et la gestion de projets informatiques.</w:t>
+            </w:r>
           </w:p>
         </w:tc>
         <w:tc>
@@ -2204,31 +2972,103 @@
           </w:tcPr>
           <w:p>
             <w:pPr>
-              <w:spacing w:line="259" w:lineRule="auto"/>
+              <w:pStyle w:val="Paragraphedeliste"/>
+              <w:numPr>
+                <w:ilvl w:val="0"/>
+                <w:numId w:val="11"/>
+              </w:numPr>
               <w:cnfStyle w:val="000000100000" w:firstRow="0" w:lastRow="0" w:firstColumn="0" w:lastColumn="0" w:oddVBand="0" w:evenVBand="0" w:oddHBand="1" w:evenHBand="0" w:firstRowFirstColumn="0" w:firstRowLastColumn="0" w:lastRowFirstColumn="0" w:lastRowLastColumn="0"/>
             </w:pPr>
-          </w:p>
-        </w:tc>
-        <w:tc>
-          <w:tcPr>
-            <w:tcW w:w="833" w:type="pct"/>
-          </w:tcPr>
-          <w:p>
-            <w:pPr>
-              <w:spacing w:line="259" w:lineRule="auto"/>
+            <w:r>
+              <w:t>Légèreté et Rapidité</w:t>
+            </w:r>
+          </w:p>
+          <w:p>
+            <w:pPr>
+              <w:pStyle w:val="Paragraphedeliste"/>
+              <w:numPr>
+                <w:ilvl w:val="0"/>
+                <w:numId w:val="11"/>
+              </w:numPr>
               <w:cnfStyle w:val="000000100000" w:firstRow="0" w:lastRow="0" w:firstColumn="0" w:lastColumn="0" w:oddVBand="0" w:evenVBand="0" w:oddHBand="1" w:evenHBand="0" w:firstRowFirstColumn="0" w:firstRowLastColumn="0" w:lastRowFirstColumn="0" w:lastRowLastColumn="0"/>
             </w:pPr>
-          </w:p>
-        </w:tc>
-        <w:tc>
-          <w:tcPr>
-            <w:tcW w:w="833" w:type="pct"/>
-          </w:tcPr>
-          <w:p>
-            <w:pPr>
-              <w:spacing w:line="259" w:lineRule="auto"/>
+            <w:r>
+              <w:t>Extensions Puissantes</w:t>
+            </w:r>
+            <w:r>
+              <w:t xml:space="preserve"> et en abondances</w:t>
+            </w:r>
+          </w:p>
+          <w:p>
+            <w:pPr>
+              <w:pStyle w:val="Paragraphedeliste"/>
+              <w:numPr>
+                <w:ilvl w:val="0"/>
+                <w:numId w:val="11"/>
+              </w:numPr>
               <w:cnfStyle w:val="000000100000" w:firstRow="0" w:lastRow="0" w:firstColumn="0" w:lastColumn="0" w:oddVBand="0" w:evenVBand="0" w:oddHBand="1" w:evenHBand="0" w:firstRowFirstColumn="0" w:firstRowLastColumn="0" w:lastRowFirstColumn="0" w:lastRowLastColumn="0"/>
             </w:pPr>
+            <w:r>
+              <w:t>Intégration Git</w:t>
+            </w:r>
+          </w:p>
+          <w:p>
+            <w:pPr>
+              <w:pStyle w:val="Paragraphedeliste"/>
+              <w:numPr>
+                <w:ilvl w:val="0"/>
+                <w:numId w:val="11"/>
+              </w:numPr>
+              <w:cnfStyle w:val="000000100000" w:firstRow="0" w:lastRow="0" w:firstColumn="0" w:lastColumn="0" w:oddVBand="0" w:evenVBand="0" w:oddHBand="1" w:evenHBand="0" w:firstRowFirstColumn="0" w:firstRowLastColumn="0" w:lastRowFirstColumn="0" w:lastRowLastColumn="0"/>
+            </w:pPr>
+            <w:r>
+              <w:t>Modification de l’IDE selon les préférences</w:t>
+            </w:r>
+          </w:p>
+          <w:p>
+            <w:pPr>
+              <w:pStyle w:val="Paragraphedeliste"/>
+              <w:numPr>
+                <w:ilvl w:val="0"/>
+                <w:numId w:val="11"/>
+              </w:numPr>
+              <w:cnfStyle w:val="000000100000" w:firstRow="0" w:lastRow="0" w:firstColumn="0" w:lastColumn="0" w:oddVBand="0" w:evenVBand="0" w:oddHBand="1" w:evenHBand="0" w:firstRowFirstColumn="0" w:firstRowLastColumn="0" w:lastRowFirstColumn="0" w:lastRowLastColumn="0"/>
+            </w:pPr>
+            <w:r>
+              <w:t>Permet d’avoir un code style pareil pour tous</w:t>
+            </w:r>
+          </w:p>
+        </w:tc>
+        <w:tc>
+          <w:tcPr>
+            <w:tcW w:w="833" w:type="pct"/>
+          </w:tcPr>
+          <w:p>
+            <w:pPr>
+              <w:pStyle w:val="Paragraphedeliste"/>
+              <w:numPr>
+                <w:ilvl w:val="0"/>
+                <w:numId w:val="11"/>
+              </w:numPr>
+              <w:cnfStyle w:val="000000100000" w:firstRow="0" w:lastRow="0" w:firstColumn="0" w:lastColumn="0" w:oddVBand="0" w:evenVBand="0" w:oddHBand="1" w:evenHBand="0" w:firstRowFirstColumn="0" w:firstRowLastColumn="0" w:lastRowFirstColumn="0" w:lastRowLastColumn="0"/>
+            </w:pPr>
+            <w:r>
+              <w:t>Consommation de Mémoire</w:t>
+            </w:r>
+            <w:r>
+              <w:t xml:space="preserve"> peut être parfois haute si les projets ont beaucoup à charger</w:t>
+            </w:r>
+          </w:p>
+        </w:tc>
+        <w:tc>
+          <w:tcPr>
+            <w:tcW w:w="833" w:type="pct"/>
+          </w:tcPr>
+          <w:p>
+            <w:pPr>
+              <w:spacing w:line="259" w:lineRule="auto"/>
+              <w:cnfStyle w:val="000000100000" w:firstRow="0" w:lastRow="0" w:firstColumn="0" w:lastColumn="0" w:oddVBand="0" w:evenVBand="0" w:oddHBand="1" w:evenHBand="0" w:firstRowFirstColumn="0" w:firstRowLastColumn="0" w:lastRowFirstColumn="0" w:lastRowLastColumn="0"/>
+            </w:pPr>
           </w:p>
         </w:tc>
         <w:tc>
@@ -2240,6 +3080,150 @@
               <w:spacing w:line="259" w:lineRule="auto"/>
               <w:cnfStyle w:val="000000100000" w:firstRow="0" w:lastRow="0" w:firstColumn="0" w:lastColumn="0" w:oddVBand="0" w:evenVBand="0" w:oddHBand="1" w:evenHBand="0" w:firstRowFirstColumn="0" w:firstRowLastColumn="0" w:lastRowFirstColumn="0" w:lastRowLastColumn="0"/>
             </w:pPr>
+            <w:proofErr w:type="gramStart"/>
+            <w:r>
+              <w:t>IDE gratuit</w:t>
+            </w:r>
+            <w:proofErr w:type="gramEnd"/>
+            <w:r>
+              <w:t xml:space="preserve"> qui peut nous mettre un code style et qui comprend très bien Python, </w:t>
+            </w:r>
+            <w:proofErr w:type="spellStart"/>
+            <w:r>
+              <w:t>Angular</w:t>
+            </w:r>
+            <w:proofErr w:type="spellEnd"/>
+            <w:r>
+              <w:t xml:space="preserve">, </w:t>
+            </w:r>
+            <w:proofErr w:type="spellStart"/>
+            <w:r>
+              <w:t>TypeScript</w:t>
+            </w:r>
+            <w:proofErr w:type="spellEnd"/>
+            <w:r>
+              <w:t xml:space="preserve"> et intègre même Git pour que le projet soit à jour</w:t>
+            </w:r>
+          </w:p>
+        </w:tc>
+      </w:tr>
+      <w:tr>
+        <w:tc>
+          <w:tcPr>
+            <w:cnfStyle w:val="001000000000" w:firstRow="0" w:lastRow="0" w:firstColumn="1" w:lastColumn="0" w:oddVBand="0" w:evenVBand="0" w:oddHBand="0" w:evenHBand="0" w:firstRowFirstColumn="0" w:firstRowLastColumn="0" w:lastRowFirstColumn="0" w:lastRowLastColumn="0"/>
+            <w:tcW w:w="833" w:type="pct"/>
+          </w:tcPr>
+          <w:p>
+            <w:r>
+              <w:t>Git</w:t>
+            </w:r>
+          </w:p>
+        </w:tc>
+        <w:tc>
+          <w:tcPr>
+            <w:tcW w:w="833" w:type="pct"/>
+          </w:tcPr>
+          <w:p>
+            <w:pPr>
+              <w:cnfStyle w:val="000000000000" w:firstRow="0" w:lastRow="0" w:firstColumn="0" w:lastColumn="0" w:oddVBand="0" w:evenVBand="0" w:oddHBand="0" w:evenHBand="0" w:firstRowFirstColumn="0" w:firstRowLastColumn="0" w:lastRowFirstColumn="0" w:lastRowLastColumn="0"/>
+            </w:pPr>
+            <w:r>
+              <w:t>Git est un système de gestion de version distribué largement utilisé qui permet de suivre les modifications apportées à un ensemble de fichiers, facilitant la collaboration, la gestion des versions et le suivi des changements dans un projet de développement.</w:t>
+            </w:r>
+          </w:p>
+        </w:tc>
+        <w:tc>
+          <w:tcPr>
+            <w:tcW w:w="834" w:type="pct"/>
+          </w:tcPr>
+          <w:p>
+            <w:pPr>
+              <w:pStyle w:val="Paragraphedeliste"/>
+              <w:numPr>
+                <w:ilvl w:val="0"/>
+                <w:numId w:val="12"/>
+              </w:numPr>
+              <w:cnfStyle w:val="000000000000" w:firstRow="0" w:lastRow="0" w:firstColumn="0" w:lastColumn="0" w:oddVBand="0" w:evenVBand="0" w:oddHBand="0" w:evenHBand="0" w:firstRowFirstColumn="0" w:firstRowLastColumn="0" w:lastRowFirstColumn="0" w:lastRowLastColumn="0"/>
+            </w:pPr>
+            <w:r>
+              <w:t>Gestion de Versions Efficace</w:t>
+            </w:r>
+          </w:p>
+          <w:p>
+            <w:pPr>
+              <w:pStyle w:val="Paragraphedeliste"/>
+              <w:numPr>
+                <w:ilvl w:val="0"/>
+                <w:numId w:val="12"/>
+              </w:numPr>
+              <w:cnfStyle w:val="000000000000" w:firstRow="0" w:lastRow="0" w:firstColumn="0" w:lastColumn="0" w:oddVBand="0" w:evenVBand="0" w:oddHBand="0" w:evenHBand="0" w:firstRowFirstColumn="0" w:firstRowLastColumn="0" w:lastRowFirstColumn="0" w:lastRowLastColumn="0"/>
+            </w:pPr>
+            <w:r>
+              <w:t>Chaque</w:t>
+            </w:r>
+            <w:r>
+              <w:t xml:space="preserve"> développeur a une copie complète de l'historique du projet. Cela favorise la flexibilité, la résilience et la possibilité de travailler hors ligne.</w:t>
+            </w:r>
+          </w:p>
+        </w:tc>
+        <w:tc>
+          <w:tcPr>
+            <w:tcW w:w="833" w:type="pct"/>
+          </w:tcPr>
+          <w:p>
+            <w:pPr>
+              <w:pStyle w:val="Paragraphedeliste"/>
+              <w:numPr>
+                <w:ilvl w:val="0"/>
+                <w:numId w:val="12"/>
+              </w:numPr>
+              <w:cnfStyle w:val="000000000000" w:firstRow="0" w:lastRow="0" w:firstColumn="0" w:lastColumn="0" w:oddVBand="0" w:evenVBand="0" w:oddHBand="0" w:evenHBand="0" w:firstRowFirstColumn="0" w:firstRowLastColumn="0" w:lastRowFirstColumn="0" w:lastRowLastColumn="0"/>
+            </w:pPr>
+            <w:r>
+              <w:t xml:space="preserve">Git </w:t>
+            </w:r>
+            <w:proofErr w:type="gramStart"/>
+            <w:r>
+              <w:t>peut être</w:t>
+            </w:r>
+            <w:proofErr w:type="gramEnd"/>
+            <w:r>
+              <w:t xml:space="preserve"> assez dure a comprendre au départ pour les nouveaux utilisateurs</w:t>
+            </w:r>
+          </w:p>
+        </w:tc>
+        <w:tc>
+          <w:tcPr>
+            <w:tcW w:w="833" w:type="pct"/>
+          </w:tcPr>
+          <w:p>
+            <w:pPr>
+              <w:cnfStyle w:val="000000000000" w:firstRow="0" w:lastRow="0" w:firstColumn="0" w:lastColumn="0" w:oddVBand="0" w:evenVBand="0" w:oddHBand="0" w:evenHBand="0" w:firstRowFirstColumn="0" w:firstRowLastColumn="0" w:lastRowFirstColumn="0" w:lastRowLastColumn="0"/>
+            </w:pPr>
+          </w:p>
+        </w:tc>
+        <w:tc>
+          <w:tcPr>
+            <w:tcW w:w="834" w:type="pct"/>
+          </w:tcPr>
+          <w:p>
+            <w:pPr>
+              <w:cnfStyle w:val="000000000000" w:firstRow="0" w:lastRow="0" w:firstColumn="0" w:lastColumn="0" w:oddVBand="0" w:evenVBand="0" w:oddHBand="0" w:evenHBand="0" w:firstRowFirstColumn="0" w:firstRowLastColumn="0" w:lastRowFirstColumn="0" w:lastRowLastColumn="0"/>
+            </w:pPr>
+            <w:r>
+              <w:t xml:space="preserve">Permet à l’équipe de travailler sur des parties différentes du projet asynchrone ou </w:t>
+            </w:r>
+            <w:r>
+              <w:t xml:space="preserve">synchronisé et de le réunir en un à la fin du projet. Permet aussi de garder </w:t>
+            </w:r>
+            <w:proofErr w:type="gramStart"/>
+            <w:r>
+              <w:t>les anciennes version</w:t>
+            </w:r>
+            <w:proofErr w:type="gramEnd"/>
+            <w:r>
+              <w:t xml:space="preserve"> et de rester à jour.</w:t>
+            </w:r>
           </w:p>
         </w:tc>
       </w:tr>
@@ -2605,6 +3589,161 @@
     <w:p/>
     <w:p>
       <w:pPr>
+        <w:pStyle w:val="Paragraphedeliste"/>
+        <w:numPr>
+          <w:ilvl w:val="0"/>
+          <w:numId w:val="13"/>
+        </w:numPr>
+        <w:ind w:left="360"/>
+      </w:pPr>
+      <w:r>
+        <w:t>Nous utiliserons OVH Cloud VPS</w:t>
+      </w:r>
+      <w:r>
+        <w:t xml:space="preserve"> et </w:t>
+      </w:r>
+      <w:r>
+        <w:t>pour le déploiement de l'application. OVH Cloud VPS offre la flexibilité nécessaire pour héberger l'application et peut être adapté en fonction des besoins de l'application.</w:t>
+      </w:r>
+      <w:r>
+        <w:t xml:space="preserve"> </w:t>
+      </w:r>
+    </w:p>
+    <w:p>
+      <w:pPr>
+        <w:pStyle w:val="Paragraphedeliste"/>
+        <w:numPr>
+          <w:ilvl w:val="0"/>
+          <w:numId w:val="13"/>
+        </w:numPr>
+        <w:ind w:left="360"/>
+      </w:pPr>
+      <w:r>
+        <w:t>Nous utiliserons l'API web de la STM pour accéder aux données en temps réel sur les transports en commun de Montréal. Cette API fournit les informations essentielles pour notre projet, notamment les horaires des autobus et des stations de métro.</w:t>
+      </w:r>
+    </w:p>
+    <w:p>
+      <w:pPr>
+        <w:pStyle w:val="Paragraphedeliste"/>
+        <w:numPr>
+          <w:ilvl w:val="0"/>
+          <w:numId w:val="13"/>
+        </w:numPr>
+        <w:ind w:left="360"/>
+      </w:pPr>
+      <w:r>
+        <w:t xml:space="preserve">Nous utiliserons PostgreSQL avec </w:t>
+      </w:r>
+      <w:proofErr w:type="spellStart"/>
+      <w:r>
+        <w:t>PostGIS</w:t>
+      </w:r>
+      <w:proofErr w:type="spellEnd"/>
+      <w:r>
+        <w:t xml:space="preserve"> comme base de données relationnelle pour stocker et gérer les données GTFS et géospatiales. PostgreSQL est un choix solide pour la gestion de données géospatiales, ce qui est essentiel pour notre projet.</w:t>
+      </w:r>
+    </w:p>
+    <w:p>
+      <w:pPr>
+        <w:pStyle w:val="Paragraphedeliste"/>
+        <w:numPr>
+          <w:ilvl w:val="0"/>
+          <w:numId w:val="13"/>
+        </w:numPr>
+        <w:ind w:left="360"/>
+      </w:pPr>
+      <w:r>
+        <w:t>Nous utiliserons Python comme langage principal de programmation pour son adaptabilité aux tâches de manipulation de données et d'analyse géospatiale.</w:t>
+      </w:r>
+    </w:p>
+    <w:p>
+      <w:pPr>
+        <w:pStyle w:val="Paragraphedeliste"/>
+        <w:numPr>
+          <w:ilvl w:val="0"/>
+          <w:numId w:val="13"/>
+        </w:numPr>
+        <w:ind w:left="360"/>
+      </w:pPr>
+      <w:proofErr w:type="spellStart"/>
+      <w:r>
+        <w:t>GeoPandas</w:t>
+      </w:r>
+      <w:proofErr w:type="spellEnd"/>
+      <w:r>
+        <w:t xml:space="preserve"> sera utilisé pour la manipulation de données géospatiales, car il simplifie le traitement de ces données.</w:t>
+      </w:r>
+    </w:p>
+    <w:p>
+      <w:pPr>
+        <w:pStyle w:val="Paragraphedeliste"/>
+        <w:numPr>
+          <w:ilvl w:val="0"/>
+          <w:numId w:val="13"/>
+        </w:numPr>
+        <w:ind w:left="360"/>
+      </w:pPr>
+      <w:proofErr w:type="spellStart"/>
+      <w:r>
+        <w:t>Angular</w:t>
+      </w:r>
+      <w:proofErr w:type="spellEnd"/>
+      <w:r>
+        <w:t xml:space="preserve"> sera utilisé pour développer l'interface utilisateur web interactive, le cas échéant. </w:t>
+      </w:r>
+      <w:proofErr w:type="spellStart"/>
+      <w:r>
+        <w:t>Angular</w:t>
+      </w:r>
+      <w:proofErr w:type="spellEnd"/>
+      <w:r>
+        <w:t xml:space="preserve"> est un </w:t>
+      </w:r>
+      <w:proofErr w:type="spellStart"/>
+      <w:r>
+        <w:t>framework</w:t>
+      </w:r>
+      <w:proofErr w:type="spellEnd"/>
+      <w:r>
+        <w:t xml:space="preserve"> populaire pour la création d'applications web dynamiques.</w:t>
+      </w:r>
+    </w:p>
+    <w:p>
+      <w:pPr>
+        <w:pStyle w:val="Paragraphedeliste"/>
+        <w:numPr>
+          <w:ilvl w:val="0"/>
+          <w:numId w:val="13"/>
+        </w:numPr>
+        <w:ind w:left="360"/>
+      </w:pPr>
+      <w:r>
+        <w:t>Nous utiliserons Visual Studio Code comme environnement de développement intégré (IDE) pour sa légèreté, sa polyvalence et sa prise en charge de Python et d'</w:t>
+      </w:r>
+      <w:proofErr w:type="spellStart"/>
+      <w:r>
+        <w:t>Angular</w:t>
+      </w:r>
+      <w:proofErr w:type="spellEnd"/>
+      <w:r>
+        <w:t>.</w:t>
+      </w:r>
+    </w:p>
+    <w:p>
+      <w:pPr>
+        <w:pStyle w:val="Paragraphedeliste"/>
+        <w:numPr>
+          <w:ilvl w:val="0"/>
+          <w:numId w:val="13"/>
+        </w:numPr>
+        <w:ind w:left="360"/>
+      </w:pPr>
+      <w:r>
+        <w:t>Git sera utilisé pour le suivi des versions et la gestion de code source collaboratif, ce qui est essentiel pour un développement efficace en équipe.</w:t>
+      </w:r>
+    </w:p>
+    <w:p>
+      <w:pPr>
         <w:pStyle w:val="Titre1"/>
       </w:pPr>
       <w:r>
@@ -2731,7 +3870,7 @@
     </w:p>
     <w:p/>
     <w:sectPr>
-      <w:headerReference w:type="default" r:id="rId13"/>
+      <w:headerReference w:type="default" r:id="rId14"/>
       <w:pgSz w:w="20160" w:h="12240" w:orient="landscape" w:code="5"/>
       <w:pgMar w:top="1440" w:right="1440" w:bottom="1440" w:left="1440" w:header="709" w:footer="709" w:gutter="0"/>
       <w:cols w:space="708"/>
@@ -2846,6 +3985,345 @@
 <file path=word/numbering.xml><?xml version="1.0" encoding="utf-8"?>
 <w:numbering xmlns:wpc="http://schemas.microsoft.com/office/word/2010/wordprocessingCanvas" xmlns:cx="http://schemas.microsoft.com/office/drawing/2014/chartex" xmlns:cx1="http://schemas.microsoft.com/office/drawing/2015/9/8/chartex" xmlns:cx2="http://schemas.microsoft.com/office/drawing/2015/10/21/chartex" xmlns:cx3="http://schemas.microsoft.com/office/drawing/2016/5/9/chartex" xmlns:cx4="http://schemas.microsoft.com/office/drawing/2016/5/10/chartex" xmlns:cx5="http://schemas.microsoft.com/office/drawing/2016/5/11/chartex" xmlns:cx6="http://schemas.microsoft.com/office/drawing/2016/5/12/chartex" xmlns:cx7="http://schemas.microsoft.com/office/drawing/2016/5/13/chartex" xmlns:cx8="http://schemas.microsoft.com/office/drawing/2016/5/14/chartex" xmlns:mc="http://schemas.openxmlformats.org/markup-compatibility/2006" xmlns:aink="http://schemas.microsoft.com/office/drawing/2016/ink" xmlns:am3d="http://schemas.microsoft.com/office/drawing/2017/model3d" xmlns:o="urn:schemas-microsoft-com:office:office" xmlns:oel="http://schemas.microsoft.com/office/2019/extlst" xmlns:r="http://schemas.openxmlformats.org/officeDocument/2006/relationships" xmlns:m="http://schemas.openxmlformats.org/officeDocument/2006/math" xmlns:v="urn:schemas-microsoft-com:vml" xmlns:wp14="http://schemas.microsoft.com/office/word/2010/wordprocessingDrawing" xmlns:wp="http://schemas.openxmlformats.org/drawingml/2006/wordprocessingDrawing" xmlns:w10="urn:schemas-microsoft-com:office:word" xmlns:w="http://schemas.openxmlformats.org/wordprocessingml/2006/main" xmlns:w14="http://schemas.microsoft.com/office/word/2010/wordml" xmlns:w15="http://schemas.microsoft.com/office/word/2012/wordml" xmlns:w16cex="http://schemas.microsoft.com/office/word/2018/wordml/cex" xmlns:w16cid="http://schemas.microsoft.com/office/word/2016/wordml/cid" xmlns:w16="http://schemas.microsoft.com/office/word/2018/wordml" xmlns:w16sdtdh="http://schemas.microsoft.com/office/word/2020/wordml/sdtdatahash" xmlns:w16se="http://schemas.microsoft.com/office/word/2015/wordml/symex" xmlns:wpg="http://schemas.microsoft.com/office/word/2010/wordprocessingGroup" xmlns:wpi="http://schemas.microsoft.com/office/word/2010/wordprocessingInk" xmlns:wne="http://schemas.microsoft.com/office/word/2006/wordml" xmlns:wps="http://schemas.microsoft.com/office/word/2010/wordprocessingShape" mc:Ignorable="w14 w15 w16se w16cid w16 w16cex w16sdtdh wp14">
   <w:abstractNum w:abstractNumId="0" w15:restartNumberingAfterBreak="0">
+    <w:nsid w:val="211021D5"/>
+    <w:multiLevelType w:val="hybridMultilevel"/>
+    <w:tmpl w:val="EF649162"/>
+    <w:lvl w:ilvl="0" w:tplc="04090001">
+      <w:start w:val="1"/>
+      <w:numFmt w:val="bullet"/>
+      <w:lvlText w:val=""/>
+      <w:lvlJc w:val="left"/>
+      <w:pPr>
+        <w:ind w:left="720" w:hanging="360"/>
+      </w:pPr>
+      <w:rPr>
+        <w:rFonts w:ascii="Symbol" w:hAnsi="Symbol" w:hint="default"/>
+      </w:rPr>
+    </w:lvl>
+    <w:lvl w:ilvl="1" w:tplc="04090003" w:tentative="1">
+      <w:start w:val="1"/>
+      <w:numFmt w:val="bullet"/>
+      <w:lvlText w:val="o"/>
+      <w:lvlJc w:val="left"/>
+      <w:pPr>
+        <w:ind w:left="1440" w:hanging="360"/>
+      </w:pPr>
+      <w:rPr>
+        <w:rFonts w:ascii="Courier New" w:hAnsi="Courier New" w:cs="Courier New" w:hint="default"/>
+      </w:rPr>
+    </w:lvl>
+    <w:lvl w:ilvl="2" w:tplc="04090005" w:tentative="1">
+      <w:start w:val="1"/>
+      <w:numFmt w:val="bullet"/>
+      <w:lvlText w:val=""/>
+      <w:lvlJc w:val="left"/>
+      <w:pPr>
+        <w:ind w:left="2160" w:hanging="360"/>
+      </w:pPr>
+      <w:rPr>
+        <w:rFonts w:ascii="Wingdings" w:hAnsi="Wingdings" w:hint="default"/>
+      </w:rPr>
+    </w:lvl>
+    <w:lvl w:ilvl="3" w:tplc="04090001" w:tentative="1">
+      <w:start w:val="1"/>
+      <w:numFmt w:val="bullet"/>
+      <w:lvlText w:val=""/>
+      <w:lvlJc w:val="left"/>
+      <w:pPr>
+        <w:ind w:left="2880" w:hanging="360"/>
+      </w:pPr>
+      <w:rPr>
+        <w:rFonts w:ascii="Symbol" w:hAnsi="Symbol" w:hint="default"/>
+      </w:rPr>
+    </w:lvl>
+    <w:lvl w:ilvl="4" w:tplc="04090003" w:tentative="1">
+      <w:start w:val="1"/>
+      <w:numFmt w:val="bullet"/>
+      <w:lvlText w:val="o"/>
+      <w:lvlJc w:val="left"/>
+      <w:pPr>
+        <w:ind w:left="3600" w:hanging="360"/>
+      </w:pPr>
+      <w:rPr>
+        <w:rFonts w:ascii="Courier New" w:hAnsi="Courier New" w:cs="Courier New" w:hint="default"/>
+      </w:rPr>
+    </w:lvl>
+    <w:lvl w:ilvl="5" w:tplc="04090005" w:tentative="1">
+      <w:start w:val="1"/>
+      <w:numFmt w:val="bullet"/>
+      <w:lvlText w:val=""/>
+      <w:lvlJc w:val="left"/>
+      <w:pPr>
+        <w:ind w:left="4320" w:hanging="360"/>
+      </w:pPr>
+      <w:rPr>
+        <w:rFonts w:ascii="Wingdings" w:hAnsi="Wingdings" w:hint="default"/>
+      </w:rPr>
+    </w:lvl>
+    <w:lvl w:ilvl="6" w:tplc="04090001" w:tentative="1">
+      <w:start w:val="1"/>
+      <w:numFmt w:val="bullet"/>
+      <w:lvlText w:val=""/>
+      <w:lvlJc w:val="left"/>
+      <w:pPr>
+        <w:ind w:left="5040" w:hanging="360"/>
+      </w:pPr>
+      <w:rPr>
+        <w:rFonts w:ascii="Symbol" w:hAnsi="Symbol" w:hint="default"/>
+      </w:rPr>
+    </w:lvl>
+    <w:lvl w:ilvl="7" w:tplc="04090003" w:tentative="1">
+      <w:start w:val="1"/>
+      <w:numFmt w:val="bullet"/>
+      <w:lvlText w:val="o"/>
+      <w:lvlJc w:val="left"/>
+      <w:pPr>
+        <w:ind w:left="5760" w:hanging="360"/>
+      </w:pPr>
+      <w:rPr>
+        <w:rFonts w:ascii="Courier New" w:hAnsi="Courier New" w:cs="Courier New" w:hint="default"/>
+      </w:rPr>
+    </w:lvl>
+    <w:lvl w:ilvl="8" w:tplc="04090005" w:tentative="1">
+      <w:start w:val="1"/>
+      <w:numFmt w:val="bullet"/>
+      <w:lvlText w:val=""/>
+      <w:lvlJc w:val="left"/>
+      <w:pPr>
+        <w:ind w:left="6480" w:hanging="360"/>
+      </w:pPr>
+      <w:rPr>
+        <w:rFonts w:ascii="Wingdings" w:hAnsi="Wingdings" w:hint="default"/>
+      </w:rPr>
+    </w:lvl>
+  </w:abstractNum>
+  <w:abstractNum w:abstractNumId="1" w15:restartNumberingAfterBreak="0">
+    <w:nsid w:val="2C2A02C6"/>
+    <w:multiLevelType w:val="hybridMultilevel"/>
+    <w:tmpl w:val="2A50BEA8"/>
+    <w:lvl w:ilvl="0" w:tplc="04090001">
+      <w:start w:val="1"/>
+      <w:numFmt w:val="bullet"/>
+      <w:lvlText w:val=""/>
+      <w:lvlJc w:val="left"/>
+      <w:pPr>
+        <w:ind w:left="720" w:hanging="360"/>
+      </w:pPr>
+      <w:rPr>
+        <w:rFonts w:ascii="Symbol" w:hAnsi="Symbol" w:hint="default"/>
+      </w:rPr>
+    </w:lvl>
+    <w:lvl w:ilvl="1" w:tplc="04090003" w:tentative="1">
+      <w:start w:val="1"/>
+      <w:numFmt w:val="bullet"/>
+      <w:lvlText w:val="o"/>
+      <w:lvlJc w:val="left"/>
+      <w:pPr>
+        <w:ind w:left="1440" w:hanging="360"/>
+      </w:pPr>
+      <w:rPr>
+        <w:rFonts w:ascii="Courier New" w:hAnsi="Courier New" w:cs="Courier New" w:hint="default"/>
+      </w:rPr>
+    </w:lvl>
+    <w:lvl w:ilvl="2" w:tplc="04090005" w:tentative="1">
+      <w:start w:val="1"/>
+      <w:numFmt w:val="bullet"/>
+      <w:lvlText w:val=""/>
+      <w:lvlJc w:val="left"/>
+      <w:pPr>
+        <w:ind w:left="2160" w:hanging="360"/>
+      </w:pPr>
+      <w:rPr>
+        <w:rFonts w:ascii="Wingdings" w:hAnsi="Wingdings" w:hint="default"/>
+      </w:rPr>
+    </w:lvl>
+    <w:lvl w:ilvl="3" w:tplc="04090001" w:tentative="1">
+      <w:start w:val="1"/>
+      <w:numFmt w:val="bullet"/>
+      <w:lvlText w:val=""/>
+      <w:lvlJc w:val="left"/>
+      <w:pPr>
+        <w:ind w:left="2880" w:hanging="360"/>
+      </w:pPr>
+      <w:rPr>
+        <w:rFonts w:ascii="Symbol" w:hAnsi="Symbol" w:hint="default"/>
+      </w:rPr>
+    </w:lvl>
+    <w:lvl w:ilvl="4" w:tplc="04090003" w:tentative="1">
+      <w:start w:val="1"/>
+      <w:numFmt w:val="bullet"/>
+      <w:lvlText w:val="o"/>
+      <w:lvlJc w:val="left"/>
+      <w:pPr>
+        <w:ind w:left="3600" w:hanging="360"/>
+      </w:pPr>
+      <w:rPr>
+        <w:rFonts w:ascii="Courier New" w:hAnsi="Courier New" w:cs="Courier New" w:hint="default"/>
+      </w:rPr>
+    </w:lvl>
+    <w:lvl w:ilvl="5" w:tplc="04090005" w:tentative="1">
+      <w:start w:val="1"/>
+      <w:numFmt w:val="bullet"/>
+      <w:lvlText w:val=""/>
+      <w:lvlJc w:val="left"/>
+      <w:pPr>
+        <w:ind w:left="4320" w:hanging="360"/>
+      </w:pPr>
+      <w:rPr>
+        <w:rFonts w:ascii="Wingdings" w:hAnsi="Wingdings" w:hint="default"/>
+      </w:rPr>
+    </w:lvl>
+    <w:lvl w:ilvl="6" w:tplc="04090001" w:tentative="1">
+      <w:start w:val="1"/>
+      <w:numFmt w:val="bullet"/>
+      <w:lvlText w:val=""/>
+      <w:lvlJc w:val="left"/>
+      <w:pPr>
+        <w:ind w:left="5040" w:hanging="360"/>
+      </w:pPr>
+      <w:rPr>
+        <w:rFonts w:ascii="Symbol" w:hAnsi="Symbol" w:hint="default"/>
+      </w:rPr>
+    </w:lvl>
+    <w:lvl w:ilvl="7" w:tplc="04090003" w:tentative="1">
+      <w:start w:val="1"/>
+      <w:numFmt w:val="bullet"/>
+      <w:lvlText w:val="o"/>
+      <w:lvlJc w:val="left"/>
+      <w:pPr>
+        <w:ind w:left="5760" w:hanging="360"/>
+      </w:pPr>
+      <w:rPr>
+        <w:rFonts w:ascii="Courier New" w:hAnsi="Courier New" w:cs="Courier New" w:hint="default"/>
+      </w:rPr>
+    </w:lvl>
+    <w:lvl w:ilvl="8" w:tplc="04090005" w:tentative="1">
+      <w:start w:val="1"/>
+      <w:numFmt w:val="bullet"/>
+      <w:lvlText w:val=""/>
+      <w:lvlJc w:val="left"/>
+      <w:pPr>
+        <w:ind w:left="6480" w:hanging="360"/>
+      </w:pPr>
+      <w:rPr>
+        <w:rFonts w:ascii="Wingdings" w:hAnsi="Wingdings" w:hint="default"/>
+      </w:rPr>
+    </w:lvl>
+  </w:abstractNum>
+  <w:abstractNum w:abstractNumId="2" w15:restartNumberingAfterBreak="0">
+    <w:nsid w:val="457720B5"/>
+    <w:multiLevelType w:val="hybridMultilevel"/>
+    <w:tmpl w:val="0AA0F436"/>
+    <w:lvl w:ilvl="0" w:tplc="04090001">
+      <w:start w:val="1"/>
+      <w:numFmt w:val="bullet"/>
+      <w:lvlText w:val=""/>
+      <w:lvlJc w:val="left"/>
+      <w:pPr>
+        <w:ind w:left="720" w:hanging="360"/>
+      </w:pPr>
+      <w:rPr>
+        <w:rFonts w:ascii="Symbol" w:hAnsi="Symbol" w:hint="default"/>
+      </w:rPr>
+    </w:lvl>
+    <w:lvl w:ilvl="1" w:tplc="04090003" w:tentative="1">
+      <w:start w:val="1"/>
+      <w:numFmt w:val="bullet"/>
+      <w:lvlText w:val="o"/>
+      <w:lvlJc w:val="left"/>
+      <w:pPr>
+        <w:ind w:left="1440" w:hanging="360"/>
+      </w:pPr>
+      <w:rPr>
+        <w:rFonts w:ascii="Courier New" w:hAnsi="Courier New" w:cs="Courier New" w:hint="default"/>
+      </w:rPr>
+    </w:lvl>
+    <w:lvl w:ilvl="2" w:tplc="04090005" w:tentative="1">
+      <w:start w:val="1"/>
+      <w:numFmt w:val="bullet"/>
+      <w:lvlText w:val=""/>
+      <w:lvlJc w:val="left"/>
+      <w:pPr>
+        <w:ind w:left="2160" w:hanging="360"/>
+      </w:pPr>
+      <w:rPr>
+        <w:rFonts w:ascii="Wingdings" w:hAnsi="Wingdings" w:hint="default"/>
+      </w:rPr>
+    </w:lvl>
+    <w:lvl w:ilvl="3" w:tplc="04090001" w:tentative="1">
+      <w:start w:val="1"/>
+      <w:numFmt w:val="bullet"/>
+      <w:lvlText w:val=""/>
+      <w:lvlJc w:val="left"/>
+      <w:pPr>
+        <w:ind w:left="2880" w:hanging="360"/>
+      </w:pPr>
+      <w:rPr>
+        <w:rFonts w:ascii="Symbol" w:hAnsi="Symbol" w:hint="default"/>
+      </w:rPr>
+    </w:lvl>
+    <w:lvl w:ilvl="4" w:tplc="04090003" w:tentative="1">
+      <w:start w:val="1"/>
+      <w:numFmt w:val="bullet"/>
+      <w:lvlText w:val="o"/>
+      <w:lvlJc w:val="left"/>
+      <w:pPr>
+        <w:ind w:left="3600" w:hanging="360"/>
+      </w:pPr>
+      <w:rPr>
+        <w:rFonts w:ascii="Courier New" w:hAnsi="Courier New" w:cs="Courier New" w:hint="default"/>
+      </w:rPr>
+    </w:lvl>
+    <w:lvl w:ilvl="5" w:tplc="04090005" w:tentative="1">
+      <w:start w:val="1"/>
+      <w:numFmt w:val="bullet"/>
+      <w:lvlText w:val=""/>
+      <w:lvlJc w:val="left"/>
+      <w:pPr>
+        <w:ind w:left="4320" w:hanging="360"/>
+      </w:pPr>
+      <w:rPr>
+        <w:rFonts w:ascii="Wingdings" w:hAnsi="Wingdings" w:hint="default"/>
+      </w:rPr>
+    </w:lvl>
+    <w:lvl w:ilvl="6" w:tplc="04090001" w:tentative="1">
+      <w:start w:val="1"/>
+      <w:numFmt w:val="bullet"/>
+      <w:lvlText w:val=""/>
+      <w:lvlJc w:val="left"/>
+      <w:pPr>
+        <w:ind w:left="5040" w:hanging="360"/>
+      </w:pPr>
+      <w:rPr>
+        <w:rFonts w:ascii="Symbol" w:hAnsi="Symbol" w:hint="default"/>
+      </w:rPr>
+    </w:lvl>
+    <w:lvl w:ilvl="7" w:tplc="04090003" w:tentative="1">
+      <w:start w:val="1"/>
+      <w:numFmt w:val="bullet"/>
+      <w:lvlText w:val="o"/>
+      <w:lvlJc w:val="left"/>
+      <w:pPr>
+        <w:ind w:left="5760" w:hanging="360"/>
+      </w:pPr>
+      <w:rPr>
+        <w:rFonts w:ascii="Courier New" w:hAnsi="Courier New" w:cs="Courier New" w:hint="default"/>
+      </w:rPr>
+    </w:lvl>
+    <w:lvl w:ilvl="8" w:tplc="04090005" w:tentative="1">
+      <w:start w:val="1"/>
+      <w:numFmt w:val="bullet"/>
+      <w:lvlText w:val=""/>
+      <w:lvlJc w:val="left"/>
+      <w:pPr>
+        <w:ind w:left="6480" w:hanging="360"/>
+      </w:pPr>
+      <w:rPr>
+        <w:rFonts w:ascii="Wingdings" w:hAnsi="Wingdings" w:hint="default"/>
+      </w:rPr>
+    </w:lvl>
+  </w:abstractNum>
+  <w:abstractNum w:abstractNumId="3" w15:restartNumberingAfterBreak="0">
     <w:nsid w:val="459C3564"/>
     <w:multiLevelType w:val="hybridMultilevel"/>
     <w:tmpl w:val="071C0388"/>
@@ -2958,7 +4436,7 @@
       </w:rPr>
     </w:lvl>
   </w:abstractNum>
-  <w:abstractNum w:abstractNumId="1" w15:restartNumberingAfterBreak="0">
+  <w:abstractNum w:abstractNumId="4" w15:restartNumberingAfterBreak="0">
     <w:nsid w:val="4B6E0D72"/>
     <w:multiLevelType w:val="hybridMultilevel"/>
     <w:tmpl w:val="A1467204"/>
@@ -3071,7 +4549,233 @@
       </w:rPr>
     </w:lvl>
   </w:abstractNum>
-  <w:abstractNum w:abstractNumId="2" w15:restartNumberingAfterBreak="0">
+  <w:abstractNum w:abstractNumId="5" w15:restartNumberingAfterBreak="0">
+    <w:nsid w:val="4B803481"/>
+    <w:multiLevelType w:val="hybridMultilevel"/>
+    <w:tmpl w:val="D736F0B2"/>
+    <w:lvl w:ilvl="0" w:tplc="04090001">
+      <w:start w:val="1"/>
+      <w:numFmt w:val="bullet"/>
+      <w:lvlText w:val=""/>
+      <w:lvlJc w:val="left"/>
+      <w:pPr>
+        <w:ind w:left="720" w:hanging="360"/>
+      </w:pPr>
+      <w:rPr>
+        <w:rFonts w:ascii="Symbol" w:hAnsi="Symbol" w:hint="default"/>
+      </w:rPr>
+    </w:lvl>
+    <w:lvl w:ilvl="1" w:tplc="04090003" w:tentative="1">
+      <w:start w:val="1"/>
+      <w:numFmt w:val="bullet"/>
+      <w:lvlText w:val="o"/>
+      <w:lvlJc w:val="left"/>
+      <w:pPr>
+        <w:ind w:left="1440" w:hanging="360"/>
+      </w:pPr>
+      <w:rPr>
+        <w:rFonts w:ascii="Courier New" w:hAnsi="Courier New" w:cs="Courier New" w:hint="default"/>
+      </w:rPr>
+    </w:lvl>
+    <w:lvl w:ilvl="2" w:tplc="04090005" w:tentative="1">
+      <w:start w:val="1"/>
+      <w:numFmt w:val="bullet"/>
+      <w:lvlText w:val=""/>
+      <w:lvlJc w:val="left"/>
+      <w:pPr>
+        <w:ind w:left="2160" w:hanging="360"/>
+      </w:pPr>
+      <w:rPr>
+        <w:rFonts w:ascii="Wingdings" w:hAnsi="Wingdings" w:hint="default"/>
+      </w:rPr>
+    </w:lvl>
+    <w:lvl w:ilvl="3" w:tplc="04090001" w:tentative="1">
+      <w:start w:val="1"/>
+      <w:numFmt w:val="bullet"/>
+      <w:lvlText w:val=""/>
+      <w:lvlJc w:val="left"/>
+      <w:pPr>
+        <w:ind w:left="2880" w:hanging="360"/>
+      </w:pPr>
+      <w:rPr>
+        <w:rFonts w:ascii="Symbol" w:hAnsi="Symbol" w:hint="default"/>
+      </w:rPr>
+    </w:lvl>
+    <w:lvl w:ilvl="4" w:tplc="04090003" w:tentative="1">
+      <w:start w:val="1"/>
+      <w:numFmt w:val="bullet"/>
+      <w:lvlText w:val="o"/>
+      <w:lvlJc w:val="left"/>
+      <w:pPr>
+        <w:ind w:left="3600" w:hanging="360"/>
+      </w:pPr>
+      <w:rPr>
+        <w:rFonts w:ascii="Courier New" w:hAnsi="Courier New" w:cs="Courier New" w:hint="default"/>
+      </w:rPr>
+    </w:lvl>
+    <w:lvl w:ilvl="5" w:tplc="04090005" w:tentative="1">
+      <w:start w:val="1"/>
+      <w:numFmt w:val="bullet"/>
+      <w:lvlText w:val=""/>
+      <w:lvlJc w:val="left"/>
+      <w:pPr>
+        <w:ind w:left="4320" w:hanging="360"/>
+      </w:pPr>
+      <w:rPr>
+        <w:rFonts w:ascii="Wingdings" w:hAnsi="Wingdings" w:hint="default"/>
+      </w:rPr>
+    </w:lvl>
+    <w:lvl w:ilvl="6" w:tplc="04090001" w:tentative="1">
+      <w:start w:val="1"/>
+      <w:numFmt w:val="bullet"/>
+      <w:lvlText w:val=""/>
+      <w:lvlJc w:val="left"/>
+      <w:pPr>
+        <w:ind w:left="5040" w:hanging="360"/>
+      </w:pPr>
+      <w:rPr>
+        <w:rFonts w:ascii="Symbol" w:hAnsi="Symbol" w:hint="default"/>
+      </w:rPr>
+    </w:lvl>
+    <w:lvl w:ilvl="7" w:tplc="04090003" w:tentative="1">
+      <w:start w:val="1"/>
+      <w:numFmt w:val="bullet"/>
+      <w:lvlText w:val="o"/>
+      <w:lvlJc w:val="left"/>
+      <w:pPr>
+        <w:ind w:left="5760" w:hanging="360"/>
+      </w:pPr>
+      <w:rPr>
+        <w:rFonts w:ascii="Courier New" w:hAnsi="Courier New" w:cs="Courier New" w:hint="default"/>
+      </w:rPr>
+    </w:lvl>
+    <w:lvl w:ilvl="8" w:tplc="04090005" w:tentative="1">
+      <w:start w:val="1"/>
+      <w:numFmt w:val="bullet"/>
+      <w:lvlText w:val=""/>
+      <w:lvlJc w:val="left"/>
+      <w:pPr>
+        <w:ind w:left="6480" w:hanging="360"/>
+      </w:pPr>
+      <w:rPr>
+        <w:rFonts w:ascii="Wingdings" w:hAnsi="Wingdings" w:hint="default"/>
+      </w:rPr>
+    </w:lvl>
+  </w:abstractNum>
+  <w:abstractNum w:abstractNumId="6" w15:restartNumberingAfterBreak="0">
+    <w:nsid w:val="50243E1A"/>
+    <w:multiLevelType w:val="hybridMultilevel"/>
+    <w:tmpl w:val="6FEACBDE"/>
+    <w:lvl w:ilvl="0" w:tplc="04090001">
+      <w:start w:val="1"/>
+      <w:numFmt w:val="bullet"/>
+      <w:lvlText w:val=""/>
+      <w:lvlJc w:val="left"/>
+      <w:pPr>
+        <w:ind w:left="720" w:hanging="360"/>
+      </w:pPr>
+      <w:rPr>
+        <w:rFonts w:ascii="Symbol" w:hAnsi="Symbol" w:hint="default"/>
+      </w:rPr>
+    </w:lvl>
+    <w:lvl w:ilvl="1" w:tplc="04090003" w:tentative="1">
+      <w:start w:val="1"/>
+      <w:numFmt w:val="bullet"/>
+      <w:lvlText w:val="o"/>
+      <w:lvlJc w:val="left"/>
+      <w:pPr>
+        <w:ind w:left="1440" w:hanging="360"/>
+      </w:pPr>
+      <w:rPr>
+        <w:rFonts w:ascii="Courier New" w:hAnsi="Courier New" w:cs="Courier New" w:hint="default"/>
+      </w:rPr>
+    </w:lvl>
+    <w:lvl w:ilvl="2" w:tplc="04090005" w:tentative="1">
+      <w:start w:val="1"/>
+      <w:numFmt w:val="bullet"/>
+      <w:lvlText w:val=""/>
+      <w:lvlJc w:val="left"/>
+      <w:pPr>
+        <w:ind w:left="2160" w:hanging="360"/>
+      </w:pPr>
+      <w:rPr>
+        <w:rFonts w:ascii="Wingdings" w:hAnsi="Wingdings" w:hint="default"/>
+      </w:rPr>
+    </w:lvl>
+    <w:lvl w:ilvl="3" w:tplc="04090001" w:tentative="1">
+      <w:start w:val="1"/>
+      <w:numFmt w:val="bullet"/>
+      <w:lvlText w:val=""/>
+      <w:lvlJc w:val="left"/>
+      <w:pPr>
+        <w:ind w:left="2880" w:hanging="360"/>
+      </w:pPr>
+      <w:rPr>
+        <w:rFonts w:ascii="Symbol" w:hAnsi="Symbol" w:hint="default"/>
+      </w:rPr>
+    </w:lvl>
+    <w:lvl w:ilvl="4" w:tplc="04090003" w:tentative="1">
+      <w:start w:val="1"/>
+      <w:numFmt w:val="bullet"/>
+      <w:lvlText w:val="o"/>
+      <w:lvlJc w:val="left"/>
+      <w:pPr>
+        <w:ind w:left="3600" w:hanging="360"/>
+      </w:pPr>
+      <w:rPr>
+        <w:rFonts w:ascii="Courier New" w:hAnsi="Courier New" w:cs="Courier New" w:hint="default"/>
+      </w:rPr>
+    </w:lvl>
+    <w:lvl w:ilvl="5" w:tplc="04090005" w:tentative="1">
+      <w:start w:val="1"/>
+      <w:numFmt w:val="bullet"/>
+      <w:lvlText w:val=""/>
+      <w:lvlJc w:val="left"/>
+      <w:pPr>
+        <w:ind w:left="4320" w:hanging="360"/>
+      </w:pPr>
+      <w:rPr>
+        <w:rFonts w:ascii="Wingdings" w:hAnsi="Wingdings" w:hint="default"/>
+      </w:rPr>
+    </w:lvl>
+    <w:lvl w:ilvl="6" w:tplc="04090001" w:tentative="1">
+      <w:start w:val="1"/>
+      <w:numFmt w:val="bullet"/>
+      <w:lvlText w:val=""/>
+      <w:lvlJc w:val="left"/>
+      <w:pPr>
+        <w:ind w:left="5040" w:hanging="360"/>
+      </w:pPr>
+      <w:rPr>
+        <w:rFonts w:ascii="Symbol" w:hAnsi="Symbol" w:hint="default"/>
+      </w:rPr>
+    </w:lvl>
+    <w:lvl w:ilvl="7" w:tplc="04090003" w:tentative="1">
+      <w:start w:val="1"/>
+      <w:numFmt w:val="bullet"/>
+      <w:lvlText w:val="o"/>
+      <w:lvlJc w:val="left"/>
+      <w:pPr>
+        <w:ind w:left="5760" w:hanging="360"/>
+      </w:pPr>
+      <w:rPr>
+        <w:rFonts w:ascii="Courier New" w:hAnsi="Courier New" w:cs="Courier New" w:hint="default"/>
+      </w:rPr>
+    </w:lvl>
+    <w:lvl w:ilvl="8" w:tplc="04090005" w:tentative="1">
+      <w:start w:val="1"/>
+      <w:numFmt w:val="bullet"/>
+      <w:lvlText w:val=""/>
+      <w:lvlJc w:val="left"/>
+      <w:pPr>
+        <w:ind w:left="6480" w:hanging="360"/>
+      </w:pPr>
+      <w:rPr>
+        <w:rFonts w:ascii="Wingdings" w:hAnsi="Wingdings" w:hint="default"/>
+      </w:rPr>
+    </w:lvl>
+  </w:abstractNum>
+  <w:abstractNum w:abstractNumId="7" w15:restartNumberingAfterBreak="0">
     <w:nsid w:val="560E2886"/>
     <w:multiLevelType w:val="hybridMultilevel"/>
     <w:tmpl w:val="6CC42C9E"/>
@@ -3185,14 +4889,609 @@
       </w:rPr>
     </w:lvl>
   </w:abstractNum>
+  <w:abstractNum w:abstractNumId="8" w15:restartNumberingAfterBreak="0">
+    <w:nsid w:val="63AD3D47"/>
+    <w:multiLevelType w:val="hybridMultilevel"/>
+    <w:tmpl w:val="121611D8"/>
+    <w:lvl w:ilvl="0" w:tplc="04090001">
+      <w:start w:val="1"/>
+      <w:numFmt w:val="bullet"/>
+      <w:lvlText w:val=""/>
+      <w:lvlJc w:val="left"/>
+      <w:pPr>
+        <w:ind w:left="720" w:hanging="360"/>
+      </w:pPr>
+      <w:rPr>
+        <w:rFonts w:ascii="Symbol" w:hAnsi="Symbol" w:hint="default"/>
+      </w:rPr>
+    </w:lvl>
+    <w:lvl w:ilvl="1" w:tplc="04090003" w:tentative="1">
+      <w:start w:val="1"/>
+      <w:numFmt w:val="bullet"/>
+      <w:lvlText w:val="o"/>
+      <w:lvlJc w:val="left"/>
+      <w:pPr>
+        <w:ind w:left="1440" w:hanging="360"/>
+      </w:pPr>
+      <w:rPr>
+        <w:rFonts w:ascii="Courier New" w:hAnsi="Courier New" w:cs="Courier New" w:hint="default"/>
+      </w:rPr>
+    </w:lvl>
+    <w:lvl w:ilvl="2" w:tplc="04090005" w:tentative="1">
+      <w:start w:val="1"/>
+      <w:numFmt w:val="bullet"/>
+      <w:lvlText w:val=""/>
+      <w:lvlJc w:val="left"/>
+      <w:pPr>
+        <w:ind w:left="2160" w:hanging="360"/>
+      </w:pPr>
+      <w:rPr>
+        <w:rFonts w:ascii="Wingdings" w:hAnsi="Wingdings" w:hint="default"/>
+      </w:rPr>
+    </w:lvl>
+    <w:lvl w:ilvl="3" w:tplc="04090001" w:tentative="1">
+      <w:start w:val="1"/>
+      <w:numFmt w:val="bullet"/>
+      <w:lvlText w:val=""/>
+      <w:lvlJc w:val="left"/>
+      <w:pPr>
+        <w:ind w:left="2880" w:hanging="360"/>
+      </w:pPr>
+      <w:rPr>
+        <w:rFonts w:ascii="Symbol" w:hAnsi="Symbol" w:hint="default"/>
+      </w:rPr>
+    </w:lvl>
+    <w:lvl w:ilvl="4" w:tplc="04090003" w:tentative="1">
+      <w:start w:val="1"/>
+      <w:numFmt w:val="bullet"/>
+      <w:lvlText w:val="o"/>
+      <w:lvlJc w:val="left"/>
+      <w:pPr>
+        <w:ind w:left="3600" w:hanging="360"/>
+      </w:pPr>
+      <w:rPr>
+        <w:rFonts w:ascii="Courier New" w:hAnsi="Courier New" w:cs="Courier New" w:hint="default"/>
+      </w:rPr>
+    </w:lvl>
+    <w:lvl w:ilvl="5" w:tplc="04090005" w:tentative="1">
+      <w:start w:val="1"/>
+      <w:numFmt w:val="bullet"/>
+      <w:lvlText w:val=""/>
+      <w:lvlJc w:val="left"/>
+      <w:pPr>
+        <w:ind w:left="4320" w:hanging="360"/>
+      </w:pPr>
+      <w:rPr>
+        <w:rFonts w:ascii="Wingdings" w:hAnsi="Wingdings" w:hint="default"/>
+      </w:rPr>
+    </w:lvl>
+    <w:lvl w:ilvl="6" w:tplc="04090001" w:tentative="1">
+      <w:start w:val="1"/>
+      <w:numFmt w:val="bullet"/>
+      <w:lvlText w:val=""/>
+      <w:lvlJc w:val="left"/>
+      <w:pPr>
+        <w:ind w:left="5040" w:hanging="360"/>
+      </w:pPr>
+      <w:rPr>
+        <w:rFonts w:ascii="Symbol" w:hAnsi="Symbol" w:hint="default"/>
+      </w:rPr>
+    </w:lvl>
+    <w:lvl w:ilvl="7" w:tplc="04090003" w:tentative="1">
+      <w:start w:val="1"/>
+      <w:numFmt w:val="bullet"/>
+      <w:lvlText w:val="o"/>
+      <w:lvlJc w:val="left"/>
+      <w:pPr>
+        <w:ind w:left="5760" w:hanging="360"/>
+      </w:pPr>
+      <w:rPr>
+        <w:rFonts w:ascii="Courier New" w:hAnsi="Courier New" w:cs="Courier New" w:hint="default"/>
+      </w:rPr>
+    </w:lvl>
+    <w:lvl w:ilvl="8" w:tplc="04090005" w:tentative="1">
+      <w:start w:val="1"/>
+      <w:numFmt w:val="bullet"/>
+      <w:lvlText w:val=""/>
+      <w:lvlJc w:val="left"/>
+      <w:pPr>
+        <w:ind w:left="6480" w:hanging="360"/>
+      </w:pPr>
+      <w:rPr>
+        <w:rFonts w:ascii="Wingdings" w:hAnsi="Wingdings" w:hint="default"/>
+      </w:rPr>
+    </w:lvl>
+  </w:abstractNum>
+  <w:abstractNum w:abstractNumId="9" w15:restartNumberingAfterBreak="0">
+    <w:nsid w:val="668D7EB5"/>
+    <w:multiLevelType w:val="hybridMultilevel"/>
+    <w:tmpl w:val="5120CEE8"/>
+    <w:lvl w:ilvl="0" w:tplc="04090001">
+      <w:start w:val="1"/>
+      <w:numFmt w:val="bullet"/>
+      <w:lvlText w:val=""/>
+      <w:lvlJc w:val="left"/>
+      <w:pPr>
+        <w:ind w:left="1440" w:hanging="360"/>
+      </w:pPr>
+      <w:rPr>
+        <w:rFonts w:ascii="Symbol" w:hAnsi="Symbol" w:hint="default"/>
+      </w:rPr>
+    </w:lvl>
+    <w:lvl w:ilvl="1" w:tplc="04090003" w:tentative="1">
+      <w:start w:val="1"/>
+      <w:numFmt w:val="bullet"/>
+      <w:lvlText w:val="o"/>
+      <w:lvlJc w:val="left"/>
+      <w:pPr>
+        <w:ind w:left="2160" w:hanging="360"/>
+      </w:pPr>
+      <w:rPr>
+        <w:rFonts w:ascii="Courier New" w:hAnsi="Courier New" w:cs="Courier New" w:hint="default"/>
+      </w:rPr>
+    </w:lvl>
+    <w:lvl w:ilvl="2" w:tplc="04090005" w:tentative="1">
+      <w:start w:val="1"/>
+      <w:numFmt w:val="bullet"/>
+      <w:lvlText w:val=""/>
+      <w:lvlJc w:val="left"/>
+      <w:pPr>
+        <w:ind w:left="2880" w:hanging="360"/>
+      </w:pPr>
+      <w:rPr>
+        <w:rFonts w:ascii="Wingdings" w:hAnsi="Wingdings" w:hint="default"/>
+      </w:rPr>
+    </w:lvl>
+    <w:lvl w:ilvl="3" w:tplc="04090001" w:tentative="1">
+      <w:start w:val="1"/>
+      <w:numFmt w:val="bullet"/>
+      <w:lvlText w:val=""/>
+      <w:lvlJc w:val="left"/>
+      <w:pPr>
+        <w:ind w:left="3600" w:hanging="360"/>
+      </w:pPr>
+      <w:rPr>
+        <w:rFonts w:ascii="Symbol" w:hAnsi="Symbol" w:hint="default"/>
+      </w:rPr>
+    </w:lvl>
+    <w:lvl w:ilvl="4" w:tplc="04090003" w:tentative="1">
+      <w:start w:val="1"/>
+      <w:numFmt w:val="bullet"/>
+      <w:lvlText w:val="o"/>
+      <w:lvlJc w:val="left"/>
+      <w:pPr>
+        <w:ind w:left="4320" w:hanging="360"/>
+      </w:pPr>
+      <w:rPr>
+        <w:rFonts w:ascii="Courier New" w:hAnsi="Courier New" w:cs="Courier New" w:hint="default"/>
+      </w:rPr>
+    </w:lvl>
+    <w:lvl w:ilvl="5" w:tplc="04090005" w:tentative="1">
+      <w:start w:val="1"/>
+      <w:numFmt w:val="bullet"/>
+      <w:lvlText w:val=""/>
+      <w:lvlJc w:val="left"/>
+      <w:pPr>
+        <w:ind w:left="5040" w:hanging="360"/>
+      </w:pPr>
+      <w:rPr>
+        <w:rFonts w:ascii="Wingdings" w:hAnsi="Wingdings" w:hint="default"/>
+      </w:rPr>
+    </w:lvl>
+    <w:lvl w:ilvl="6" w:tplc="04090001" w:tentative="1">
+      <w:start w:val="1"/>
+      <w:numFmt w:val="bullet"/>
+      <w:lvlText w:val=""/>
+      <w:lvlJc w:val="left"/>
+      <w:pPr>
+        <w:ind w:left="5760" w:hanging="360"/>
+      </w:pPr>
+      <w:rPr>
+        <w:rFonts w:ascii="Symbol" w:hAnsi="Symbol" w:hint="default"/>
+      </w:rPr>
+    </w:lvl>
+    <w:lvl w:ilvl="7" w:tplc="04090003" w:tentative="1">
+      <w:start w:val="1"/>
+      <w:numFmt w:val="bullet"/>
+      <w:lvlText w:val="o"/>
+      <w:lvlJc w:val="left"/>
+      <w:pPr>
+        <w:ind w:left="6480" w:hanging="360"/>
+      </w:pPr>
+      <w:rPr>
+        <w:rFonts w:ascii="Courier New" w:hAnsi="Courier New" w:cs="Courier New" w:hint="default"/>
+      </w:rPr>
+    </w:lvl>
+    <w:lvl w:ilvl="8" w:tplc="04090005" w:tentative="1">
+      <w:start w:val="1"/>
+      <w:numFmt w:val="bullet"/>
+      <w:lvlText w:val=""/>
+      <w:lvlJc w:val="left"/>
+      <w:pPr>
+        <w:ind w:left="7200" w:hanging="360"/>
+      </w:pPr>
+      <w:rPr>
+        <w:rFonts w:ascii="Wingdings" w:hAnsi="Wingdings" w:hint="default"/>
+      </w:rPr>
+    </w:lvl>
+  </w:abstractNum>
+  <w:abstractNum w:abstractNumId="10" w15:restartNumberingAfterBreak="0">
+    <w:nsid w:val="69AC34DC"/>
+    <w:multiLevelType w:val="hybridMultilevel"/>
+    <w:tmpl w:val="44E6846E"/>
+    <w:lvl w:ilvl="0" w:tplc="04090001">
+      <w:start w:val="1"/>
+      <w:numFmt w:val="bullet"/>
+      <w:lvlText w:val=""/>
+      <w:lvlJc w:val="left"/>
+      <w:pPr>
+        <w:ind w:left="720" w:hanging="360"/>
+      </w:pPr>
+      <w:rPr>
+        <w:rFonts w:ascii="Symbol" w:hAnsi="Symbol" w:hint="default"/>
+      </w:rPr>
+    </w:lvl>
+    <w:lvl w:ilvl="1" w:tplc="04090003" w:tentative="1">
+      <w:start w:val="1"/>
+      <w:numFmt w:val="bullet"/>
+      <w:lvlText w:val="o"/>
+      <w:lvlJc w:val="left"/>
+      <w:pPr>
+        <w:ind w:left="1440" w:hanging="360"/>
+      </w:pPr>
+      <w:rPr>
+        <w:rFonts w:ascii="Courier New" w:hAnsi="Courier New" w:cs="Courier New" w:hint="default"/>
+      </w:rPr>
+    </w:lvl>
+    <w:lvl w:ilvl="2" w:tplc="04090005" w:tentative="1">
+      <w:start w:val="1"/>
+      <w:numFmt w:val="bullet"/>
+      <w:lvlText w:val=""/>
+      <w:lvlJc w:val="left"/>
+      <w:pPr>
+        <w:ind w:left="2160" w:hanging="360"/>
+      </w:pPr>
+      <w:rPr>
+        <w:rFonts w:ascii="Wingdings" w:hAnsi="Wingdings" w:hint="default"/>
+      </w:rPr>
+    </w:lvl>
+    <w:lvl w:ilvl="3" w:tplc="04090001" w:tentative="1">
+      <w:start w:val="1"/>
+      <w:numFmt w:val="bullet"/>
+      <w:lvlText w:val=""/>
+      <w:lvlJc w:val="left"/>
+      <w:pPr>
+        <w:ind w:left="2880" w:hanging="360"/>
+      </w:pPr>
+      <w:rPr>
+        <w:rFonts w:ascii="Symbol" w:hAnsi="Symbol" w:hint="default"/>
+      </w:rPr>
+    </w:lvl>
+    <w:lvl w:ilvl="4" w:tplc="04090003" w:tentative="1">
+      <w:start w:val="1"/>
+      <w:numFmt w:val="bullet"/>
+      <w:lvlText w:val="o"/>
+      <w:lvlJc w:val="left"/>
+      <w:pPr>
+        <w:ind w:left="3600" w:hanging="360"/>
+      </w:pPr>
+      <w:rPr>
+        <w:rFonts w:ascii="Courier New" w:hAnsi="Courier New" w:cs="Courier New" w:hint="default"/>
+      </w:rPr>
+    </w:lvl>
+    <w:lvl w:ilvl="5" w:tplc="04090005" w:tentative="1">
+      <w:start w:val="1"/>
+      <w:numFmt w:val="bullet"/>
+      <w:lvlText w:val=""/>
+      <w:lvlJc w:val="left"/>
+      <w:pPr>
+        <w:ind w:left="4320" w:hanging="360"/>
+      </w:pPr>
+      <w:rPr>
+        <w:rFonts w:ascii="Wingdings" w:hAnsi="Wingdings" w:hint="default"/>
+      </w:rPr>
+    </w:lvl>
+    <w:lvl w:ilvl="6" w:tplc="04090001" w:tentative="1">
+      <w:start w:val="1"/>
+      <w:numFmt w:val="bullet"/>
+      <w:lvlText w:val=""/>
+      <w:lvlJc w:val="left"/>
+      <w:pPr>
+        <w:ind w:left="5040" w:hanging="360"/>
+      </w:pPr>
+      <w:rPr>
+        <w:rFonts w:ascii="Symbol" w:hAnsi="Symbol" w:hint="default"/>
+      </w:rPr>
+    </w:lvl>
+    <w:lvl w:ilvl="7" w:tplc="04090003" w:tentative="1">
+      <w:start w:val="1"/>
+      <w:numFmt w:val="bullet"/>
+      <w:lvlText w:val="o"/>
+      <w:lvlJc w:val="left"/>
+      <w:pPr>
+        <w:ind w:left="5760" w:hanging="360"/>
+      </w:pPr>
+      <w:rPr>
+        <w:rFonts w:ascii="Courier New" w:hAnsi="Courier New" w:cs="Courier New" w:hint="default"/>
+      </w:rPr>
+    </w:lvl>
+    <w:lvl w:ilvl="8" w:tplc="04090005" w:tentative="1">
+      <w:start w:val="1"/>
+      <w:numFmt w:val="bullet"/>
+      <w:lvlText w:val=""/>
+      <w:lvlJc w:val="left"/>
+      <w:pPr>
+        <w:ind w:left="6480" w:hanging="360"/>
+      </w:pPr>
+      <w:rPr>
+        <w:rFonts w:ascii="Wingdings" w:hAnsi="Wingdings" w:hint="default"/>
+      </w:rPr>
+    </w:lvl>
+  </w:abstractNum>
+  <w:abstractNum w:abstractNumId="11" w15:restartNumberingAfterBreak="0">
+    <w:nsid w:val="756E5BA5"/>
+    <w:multiLevelType w:val="hybridMultilevel"/>
+    <w:tmpl w:val="C0E248FC"/>
+    <w:lvl w:ilvl="0" w:tplc="04090001">
+      <w:start w:val="1"/>
+      <w:numFmt w:val="bullet"/>
+      <w:lvlText w:val=""/>
+      <w:lvlJc w:val="left"/>
+      <w:pPr>
+        <w:ind w:left="720" w:hanging="360"/>
+      </w:pPr>
+      <w:rPr>
+        <w:rFonts w:ascii="Symbol" w:hAnsi="Symbol" w:hint="default"/>
+      </w:rPr>
+    </w:lvl>
+    <w:lvl w:ilvl="1" w:tplc="04090003" w:tentative="1">
+      <w:start w:val="1"/>
+      <w:numFmt w:val="bullet"/>
+      <w:lvlText w:val="o"/>
+      <w:lvlJc w:val="left"/>
+      <w:pPr>
+        <w:ind w:left="1440" w:hanging="360"/>
+      </w:pPr>
+      <w:rPr>
+        <w:rFonts w:ascii="Courier New" w:hAnsi="Courier New" w:cs="Courier New" w:hint="default"/>
+      </w:rPr>
+    </w:lvl>
+    <w:lvl w:ilvl="2" w:tplc="04090005" w:tentative="1">
+      <w:start w:val="1"/>
+      <w:numFmt w:val="bullet"/>
+      <w:lvlText w:val=""/>
+      <w:lvlJc w:val="left"/>
+      <w:pPr>
+        <w:ind w:left="2160" w:hanging="360"/>
+      </w:pPr>
+      <w:rPr>
+        <w:rFonts w:ascii="Wingdings" w:hAnsi="Wingdings" w:hint="default"/>
+      </w:rPr>
+    </w:lvl>
+    <w:lvl w:ilvl="3" w:tplc="04090001" w:tentative="1">
+      <w:start w:val="1"/>
+      <w:numFmt w:val="bullet"/>
+      <w:lvlText w:val=""/>
+      <w:lvlJc w:val="left"/>
+      <w:pPr>
+        <w:ind w:left="2880" w:hanging="360"/>
+      </w:pPr>
+      <w:rPr>
+        <w:rFonts w:ascii="Symbol" w:hAnsi="Symbol" w:hint="default"/>
+      </w:rPr>
+    </w:lvl>
+    <w:lvl w:ilvl="4" w:tplc="04090003" w:tentative="1">
+      <w:start w:val="1"/>
+      <w:numFmt w:val="bullet"/>
+      <w:lvlText w:val="o"/>
+      <w:lvlJc w:val="left"/>
+      <w:pPr>
+        <w:ind w:left="3600" w:hanging="360"/>
+      </w:pPr>
+      <w:rPr>
+        <w:rFonts w:ascii="Courier New" w:hAnsi="Courier New" w:cs="Courier New" w:hint="default"/>
+      </w:rPr>
+    </w:lvl>
+    <w:lvl w:ilvl="5" w:tplc="04090005" w:tentative="1">
+      <w:start w:val="1"/>
+      <w:numFmt w:val="bullet"/>
+      <w:lvlText w:val=""/>
+      <w:lvlJc w:val="left"/>
+      <w:pPr>
+        <w:ind w:left="4320" w:hanging="360"/>
+      </w:pPr>
+      <w:rPr>
+        <w:rFonts w:ascii="Wingdings" w:hAnsi="Wingdings" w:hint="default"/>
+      </w:rPr>
+    </w:lvl>
+    <w:lvl w:ilvl="6" w:tplc="04090001" w:tentative="1">
+      <w:start w:val="1"/>
+      <w:numFmt w:val="bullet"/>
+      <w:lvlText w:val=""/>
+      <w:lvlJc w:val="left"/>
+      <w:pPr>
+        <w:ind w:left="5040" w:hanging="360"/>
+      </w:pPr>
+      <w:rPr>
+        <w:rFonts w:ascii="Symbol" w:hAnsi="Symbol" w:hint="default"/>
+      </w:rPr>
+    </w:lvl>
+    <w:lvl w:ilvl="7" w:tplc="04090003" w:tentative="1">
+      <w:start w:val="1"/>
+      <w:numFmt w:val="bullet"/>
+      <w:lvlText w:val="o"/>
+      <w:lvlJc w:val="left"/>
+      <w:pPr>
+        <w:ind w:left="5760" w:hanging="360"/>
+      </w:pPr>
+      <w:rPr>
+        <w:rFonts w:ascii="Courier New" w:hAnsi="Courier New" w:cs="Courier New" w:hint="default"/>
+      </w:rPr>
+    </w:lvl>
+    <w:lvl w:ilvl="8" w:tplc="04090005" w:tentative="1">
+      <w:start w:val="1"/>
+      <w:numFmt w:val="bullet"/>
+      <w:lvlText w:val=""/>
+      <w:lvlJc w:val="left"/>
+      <w:pPr>
+        <w:ind w:left="6480" w:hanging="360"/>
+      </w:pPr>
+      <w:rPr>
+        <w:rFonts w:ascii="Wingdings" w:hAnsi="Wingdings" w:hint="default"/>
+      </w:rPr>
+    </w:lvl>
+  </w:abstractNum>
+  <w:abstractNum w:abstractNumId="12" w15:restartNumberingAfterBreak="0">
+    <w:nsid w:val="7E1656AC"/>
+    <w:multiLevelType w:val="hybridMultilevel"/>
+    <w:tmpl w:val="39F25346"/>
+    <w:lvl w:ilvl="0" w:tplc="04090001">
+      <w:start w:val="1"/>
+      <w:numFmt w:val="bullet"/>
+      <w:lvlText w:val=""/>
+      <w:lvlJc w:val="left"/>
+      <w:pPr>
+        <w:ind w:left="720" w:hanging="360"/>
+      </w:pPr>
+      <w:rPr>
+        <w:rFonts w:ascii="Symbol" w:hAnsi="Symbol" w:hint="default"/>
+      </w:rPr>
+    </w:lvl>
+    <w:lvl w:ilvl="1" w:tplc="04090003" w:tentative="1">
+      <w:start w:val="1"/>
+      <w:numFmt w:val="bullet"/>
+      <w:lvlText w:val="o"/>
+      <w:lvlJc w:val="left"/>
+      <w:pPr>
+        <w:ind w:left="1440" w:hanging="360"/>
+      </w:pPr>
+      <w:rPr>
+        <w:rFonts w:ascii="Courier New" w:hAnsi="Courier New" w:cs="Courier New" w:hint="default"/>
+      </w:rPr>
+    </w:lvl>
+    <w:lvl w:ilvl="2" w:tplc="04090005" w:tentative="1">
+      <w:start w:val="1"/>
+      <w:numFmt w:val="bullet"/>
+      <w:lvlText w:val=""/>
+      <w:lvlJc w:val="left"/>
+      <w:pPr>
+        <w:ind w:left="2160" w:hanging="360"/>
+      </w:pPr>
+      <w:rPr>
+        <w:rFonts w:ascii="Wingdings" w:hAnsi="Wingdings" w:hint="default"/>
+      </w:rPr>
+    </w:lvl>
+    <w:lvl w:ilvl="3" w:tplc="04090001" w:tentative="1">
+      <w:start w:val="1"/>
+      <w:numFmt w:val="bullet"/>
+      <w:lvlText w:val=""/>
+      <w:lvlJc w:val="left"/>
+      <w:pPr>
+        <w:ind w:left="2880" w:hanging="360"/>
+      </w:pPr>
+      <w:rPr>
+        <w:rFonts w:ascii="Symbol" w:hAnsi="Symbol" w:hint="default"/>
+      </w:rPr>
+    </w:lvl>
+    <w:lvl w:ilvl="4" w:tplc="04090003" w:tentative="1">
+      <w:start w:val="1"/>
+      <w:numFmt w:val="bullet"/>
+      <w:lvlText w:val="o"/>
+      <w:lvlJc w:val="left"/>
+      <w:pPr>
+        <w:ind w:left="3600" w:hanging="360"/>
+      </w:pPr>
+      <w:rPr>
+        <w:rFonts w:ascii="Courier New" w:hAnsi="Courier New" w:cs="Courier New" w:hint="default"/>
+      </w:rPr>
+    </w:lvl>
+    <w:lvl w:ilvl="5" w:tplc="04090005" w:tentative="1">
+      <w:start w:val="1"/>
+      <w:numFmt w:val="bullet"/>
+      <w:lvlText w:val=""/>
+      <w:lvlJc w:val="left"/>
+      <w:pPr>
+        <w:ind w:left="4320" w:hanging="360"/>
+      </w:pPr>
+      <w:rPr>
+        <w:rFonts w:ascii="Wingdings" w:hAnsi="Wingdings" w:hint="default"/>
+      </w:rPr>
+    </w:lvl>
+    <w:lvl w:ilvl="6" w:tplc="04090001" w:tentative="1">
+      <w:start w:val="1"/>
+      <w:numFmt w:val="bullet"/>
+      <w:lvlText w:val=""/>
+      <w:lvlJc w:val="left"/>
+      <w:pPr>
+        <w:ind w:left="5040" w:hanging="360"/>
+      </w:pPr>
+      <w:rPr>
+        <w:rFonts w:ascii="Symbol" w:hAnsi="Symbol" w:hint="default"/>
+      </w:rPr>
+    </w:lvl>
+    <w:lvl w:ilvl="7" w:tplc="04090003" w:tentative="1">
+      <w:start w:val="1"/>
+      <w:numFmt w:val="bullet"/>
+      <w:lvlText w:val="o"/>
+      <w:lvlJc w:val="left"/>
+      <w:pPr>
+        <w:ind w:left="5760" w:hanging="360"/>
+      </w:pPr>
+      <w:rPr>
+        <w:rFonts w:ascii="Courier New" w:hAnsi="Courier New" w:cs="Courier New" w:hint="default"/>
+      </w:rPr>
+    </w:lvl>
+    <w:lvl w:ilvl="8" w:tplc="04090005" w:tentative="1">
+      <w:start w:val="1"/>
+      <w:numFmt w:val="bullet"/>
+      <w:lvlText w:val=""/>
+      <w:lvlJc w:val="left"/>
+      <w:pPr>
+        <w:ind w:left="6480" w:hanging="360"/>
+      </w:pPr>
+      <w:rPr>
+        <w:rFonts w:ascii="Wingdings" w:hAnsi="Wingdings" w:hint="default"/>
+      </w:rPr>
+    </w:lvl>
+  </w:abstractNum>
   <w:num w:numId="1" w16cid:durableId="715738762">
+    <w:abstractNumId w:val="4"/>
+  </w:num>
+  <w:num w:numId="2" w16cid:durableId="644238697">
+    <w:abstractNumId w:val="7"/>
+  </w:num>
+  <w:num w:numId="3" w16cid:durableId="620378886">
+    <w:abstractNumId w:val="3"/>
+  </w:num>
+  <w:num w:numId="4" w16cid:durableId="362823299">
+    <w:abstractNumId w:val="10"/>
+  </w:num>
+  <w:num w:numId="5" w16cid:durableId="413554721">
+    <w:abstractNumId w:val="2"/>
+  </w:num>
+  <w:num w:numId="6" w16cid:durableId="866992453">
     <w:abstractNumId w:val="1"/>
   </w:num>
-  <w:num w:numId="2" w16cid:durableId="644238697">
-    <w:abstractNumId w:val="2"/>
+  <w:num w:numId="7" w16cid:durableId="763888245">
+    <w:abstractNumId w:val="9"/>
   </w:num>
-  <w:num w:numId="3" w16cid:durableId="620378886">
+  <w:num w:numId="8" w16cid:durableId="46954198">
+    <w:abstractNumId w:val="6"/>
+  </w:num>
+  <w:num w:numId="9" w16cid:durableId="661129004">
+    <w:abstractNumId w:val="8"/>
+  </w:num>
+  <w:num w:numId="10" w16cid:durableId="1962878435">
     <w:abstractNumId w:val="0"/>
+  </w:num>
+  <w:num w:numId="11" w16cid:durableId="138378064">
+    <w:abstractNumId w:val="12"/>
+  </w:num>
+  <w:num w:numId="12" w16cid:durableId="668599909">
+    <w:abstractNumId w:val="11"/>
+  </w:num>
+  <w:num w:numId="13" w16cid:durableId="844785465">
+    <w:abstractNumId w:val="5"/>
   </w:num>
 </w:numbering>
 </file>
@@ -3946,6 +6245,30 @@
     <w:basedOn w:val="Policepardfaut"/>
     <w:rsid w:val="0069139A"/>
   </w:style>
+  <w:style w:type="character" w:styleId="Lienhypertextesuivivisit">
+    <w:name w:val="FollowedHyperlink"/>
+    <w:basedOn w:val="Policepardfaut"/>
+    <w:uiPriority w:val="99"/>
+    <w:semiHidden/>
+    <w:unhideWhenUsed/>
+    <w:rsid w:val="003B2415"/>
+    <w:rPr>
+      <w:color w:val="954F72" w:themeColor="followedHyperlink"/>
+      <w:u w:val="single"/>
+    </w:rPr>
+  </w:style>
+  <w:style w:type="character" w:styleId="Mentionnonrsolue">
+    <w:name w:val="Unresolved Mention"/>
+    <w:basedOn w:val="Policepardfaut"/>
+    <w:uiPriority w:val="99"/>
+    <w:semiHidden/>
+    <w:unhideWhenUsed/>
+    <w:rsid w:val="00614AED"/>
+    <w:rPr>
+      <w:color w:val="605E5C"/>
+      <w:shd w:val="clear" w:color="auto" w:fill="E1DFDD"/>
+    </w:rPr>
+  </w:style>
 </w:styles>
 </file>
 
@@ -4245,23 +6568,6 @@
 </file>
 
 <file path=customXml/item1.xml><?xml version="1.0" encoding="utf-8"?>
-<p:properties xmlns:p="http://schemas.microsoft.com/office/2006/metadata/properties" xmlns:xsi="http://www.w3.org/2001/XMLSchema-instance" xmlns:pc="http://schemas.microsoft.com/office/infopath/2007/PartnerControls">
-  <documentManagement>
-    <ReferenceId xmlns="42257c34-c77f-467d-905d-75a97d547138" xsi:nil="true"/>
-  </documentManagement>
-</p:properties>
-</file>
-
-<file path=customXml/item2.xml><?xml version="1.0" encoding="utf-8"?>
-<?mso-contentType ?>
-<FormTemplates xmlns="http://schemas.microsoft.com/sharepoint/v3/contenttype/forms">
-  <Display>DocumentLibraryForm</Display>
-  <Edit>DocumentLibraryForm</Edit>
-  <New>DocumentLibraryForm</New>
-</FormTemplates>
-</file>
-
-<file path=customXml/item3.xml><?xml version="1.0" encoding="utf-8"?>
 <ct:contentTypeSchema xmlns:ct="http://schemas.microsoft.com/office/2006/metadata/contentType" xmlns:ma="http://schemas.microsoft.com/office/2006/metadata/properties/metaAttributes" ct:_="" ma:_="" ma:contentTypeName="Document" ma:contentTypeID="0x010100551D635FAC5C8C40B6758ED46EE74085" ma:contentTypeVersion="1" ma:contentTypeDescription="Crée un document." ma:contentTypeScope="" ma:versionID="0c523bf75113fe7fa38646be70e883a9">
   <xsd:schema xmlns:xsd="http://www.w3.org/2001/XMLSchema" xmlns:xs="http://www.w3.org/2001/XMLSchema" xmlns:p="http://schemas.microsoft.com/office/2006/metadata/properties" xmlns:ns2="42257c34-c77f-467d-905d-75a97d547138" targetNamespace="http://schemas.microsoft.com/office/2006/metadata/properties" ma:root="true" ma:fieldsID="7a54401c2abbf958be344a21e651011b" ns2:_="">
     <xsd:import namespace="42257c34-c77f-467d-905d-75a97d547138"/>
@@ -4387,29 +6693,28 @@
 </ct:contentTypeSchema>
 </file>
 
+<file path=customXml/item2.xml><?xml version="1.0" encoding="utf-8"?>
+<?mso-contentType ?>
+<FormTemplates xmlns="http://schemas.microsoft.com/sharepoint/v3/contenttype/forms">
+  <Display>DocumentLibraryForm</Display>
+  <Edit>DocumentLibraryForm</Edit>
+  <New>DocumentLibraryForm</New>
+</FormTemplates>
+</file>
+
+<file path=customXml/item3.xml><?xml version="1.0" encoding="utf-8"?>
+<p:properties xmlns:p="http://schemas.microsoft.com/office/2006/metadata/properties" xmlns:xsi="http://www.w3.org/2001/XMLSchema-instance" xmlns:pc="http://schemas.microsoft.com/office/infopath/2007/PartnerControls">
+  <documentManagement>
+    <ReferenceId xmlns="42257c34-c77f-467d-905d-75a97d547138" xsi:nil="true"/>
+  </documentManagement>
+</p:properties>
+</file>
+
 <file path=customXml/item4.xml><?xml version="1.0" encoding="utf-8"?>
 <b:Sources xmlns:b="http://schemas.openxmlformats.org/officeDocument/2006/bibliography" xmlns="http://schemas.openxmlformats.org/officeDocument/2006/bibliography" SelectedStyle="\APASixthEditionOfficeOnline.xsl" StyleName="APA" Version="6"/>
 </file>
 
 <file path=customXml/itemProps1.xml><?xml version="1.0" encoding="utf-8"?>
-<ds:datastoreItem xmlns:ds="http://schemas.openxmlformats.org/officeDocument/2006/customXml" ds:itemID="{9F598CD7-6DF5-442C-BC9D-4EF79CA37EA3}">
-  <ds:schemaRefs>
-    <ds:schemaRef ds:uri="http://schemas.microsoft.com/office/2006/metadata/properties"/>
-    <ds:schemaRef ds:uri="http://schemas.microsoft.com/office/infopath/2007/PartnerControls"/>
-    <ds:schemaRef ds:uri="42257c34-c77f-467d-905d-75a97d547138"/>
-  </ds:schemaRefs>
-</ds:datastoreItem>
-</file>
-
-<file path=customXml/itemProps2.xml><?xml version="1.0" encoding="utf-8"?>
-<ds:datastoreItem xmlns:ds="http://schemas.openxmlformats.org/officeDocument/2006/customXml" ds:itemID="{3FD6EF8E-ADF0-4C4F-B817-D3959536959B}">
-  <ds:schemaRefs>
-    <ds:schemaRef ds:uri="http://schemas.microsoft.com/sharepoint/v3/contenttype/forms"/>
-  </ds:schemaRefs>
-</ds:datastoreItem>
-</file>
-
-<file path=customXml/itemProps3.xml><?xml version="1.0" encoding="utf-8"?>
 <ds:datastoreItem xmlns:ds="http://schemas.openxmlformats.org/officeDocument/2006/customXml" ds:itemID="{57C2D642-B5AC-40E5-8AC8-1A6F08B0B667}">
   <ds:schemaRefs>
     <ds:schemaRef ds:uri="http://schemas.microsoft.com/office/2006/metadata/contentType"/>
@@ -4427,6 +6732,24 @@
 </ds:datastoreItem>
 </file>
 
+<file path=customXml/itemProps2.xml><?xml version="1.0" encoding="utf-8"?>
+<ds:datastoreItem xmlns:ds="http://schemas.openxmlformats.org/officeDocument/2006/customXml" ds:itemID="{3FD6EF8E-ADF0-4C4F-B817-D3959536959B}">
+  <ds:schemaRefs>
+    <ds:schemaRef ds:uri="http://schemas.microsoft.com/sharepoint/v3/contenttype/forms"/>
+  </ds:schemaRefs>
+</ds:datastoreItem>
+</file>
+
+<file path=customXml/itemProps3.xml><?xml version="1.0" encoding="utf-8"?>
+<ds:datastoreItem xmlns:ds="http://schemas.openxmlformats.org/officeDocument/2006/customXml" ds:itemID="{9F598CD7-6DF5-442C-BC9D-4EF79CA37EA3}">
+  <ds:schemaRefs>
+    <ds:schemaRef ds:uri="http://schemas.microsoft.com/office/2006/metadata/properties"/>
+    <ds:schemaRef ds:uri="http://schemas.microsoft.com/office/infopath/2007/PartnerControls"/>
+    <ds:schemaRef ds:uri="42257c34-c77f-467d-905d-75a97d547138"/>
+  </ds:schemaRefs>
+</ds:datastoreItem>
+</file>
+
 <file path=customXml/itemProps4.xml><?xml version="1.0" encoding="utf-8"?>
 <ds:datastoreItem xmlns:ds="http://schemas.openxmlformats.org/officeDocument/2006/customXml" ds:itemID="{C5E14211-7814-4068-AEC0-194C3A425F86}">
   <ds:schemaRefs>

</xml_diff>

<commit_message>
finition du analyse projet 1 veille techno
</commit_message>
<xml_diff>
--- a/veille_techno/projet_1/Gabarit analyse projet 1.docx
+++ b/veille_techno/projet_1/Gabarit analyse projet 1.docx
@@ -51,13 +51,7 @@
           <w:rPr>
             <w:rStyle w:val="Lienhypertexte"/>
           </w:rPr>
-          <w:t xml:space="preserve"> format GTFS</w:t>
-        </w:r>
-        <w:r>
-          <w:rPr>
-            <w:rStyle w:val="Lienhypertexte"/>
-          </w:rPr>
-          <w:t xml:space="preserve"> </w:t>
+          <w:t xml:space="preserve"> format GTFS </w:t>
         </w:r>
         <w:r>
           <w:rPr>
@@ -306,13 +300,48 @@
         <w:t xml:space="preserve"> et j’y répondrai</w:t>
       </w:r>
     </w:p>
-    <w:p/>
     <w:p>
       <w:pPr>
+        <w:pStyle w:val="Paragraphedeliste"/>
+        <w:numPr>
+          <w:ilvl w:val="0"/>
+          <w:numId w:val="0"/>
+        </w:numPr>
+        <w:ind w:left="720"/>
+      </w:pPr>
+    </w:p>
+    <w:p>
+      <w:r>
+        <w:lastRenderedPageBreak/>
+        <w:t xml:space="preserve">Est-ce que tu vous </w:t>
+      </w:r>
+      <w:proofErr w:type="gramStart"/>
+      <w:r>
+        <w:t>voulez</w:t>
+      </w:r>
+      <w:proofErr w:type="gramEnd"/>
+      <w:r>
+        <w:t xml:space="preserve"> un carte graphique comme Google </w:t>
+      </w:r>
+      <w:proofErr w:type="spellStart"/>
+      <w:r>
+        <w:t>Map</w:t>
+      </w:r>
+      <w:proofErr w:type="spellEnd"/>
+      <w:r>
+        <w:t xml:space="preserve"> où l’on voit la ville ou seulement comme des statistiques?</w:t>
+      </w:r>
+    </w:p>
+    <w:p>
+      <w:r>
+        <w:t>Comment définissez-vous la "qualité du service" ? Avez-vous des critères spécifiques en tête, tels que la fréquence des bus, la ponctualité, ou d'autres facteurs ?</w:t>
+      </w:r>
+    </w:p>
+    <w:p>
+      <w:pPr>
         <w:pStyle w:val="Titre1"/>
       </w:pPr>
       <w:r>
-        <w:lastRenderedPageBreak/>
         <w:t xml:space="preserve">Technologies </w:t>
       </w:r>
       <w:r>
@@ -1325,6 +1354,7 @@
               <w:spacing w:line="259" w:lineRule="auto"/>
             </w:pPr>
             <w:r>
+              <w:lastRenderedPageBreak/>
               <w:t>OVH Cloud (VPS)</w:t>
             </w:r>
           </w:p>
@@ -1339,11 +1369,7 @@
               <w:cnfStyle w:val="000000100000" w:firstRow="0" w:lastRow="0" w:firstColumn="0" w:lastColumn="0" w:oddVBand="0" w:evenVBand="0" w:oddHBand="1" w:evenHBand="0" w:firstRowFirstColumn="0" w:firstRowLastColumn="0" w:lastRowFirstColumn="0" w:lastRowLastColumn="0"/>
             </w:pPr>
             <w:r>
-              <w:t xml:space="preserve">OVH Cloud VPS est un service d'hébergement virtuel privé qui offre des ressources serveur flexibles et </w:t>
-            </w:r>
-            <w:r>
-              <w:lastRenderedPageBreak/>
-              <w:t xml:space="preserve">évolutives, permettant aux utilisateurs de déployer des applications et des sites web sur des serveurs virtuels isolés au sein de l'infrastructure cloud d'OVH. </w:t>
+              <w:t xml:space="preserve">OVH Cloud VPS est un service d'hébergement virtuel privé qui offre des ressources serveur flexibles et évolutives, permettant aux utilisateurs de déployer des applications et des sites web sur des serveurs virtuels isolés au sein de l'infrastructure cloud d'OVH. </w:t>
             </w:r>
           </w:p>
         </w:tc>
@@ -1361,7 +1387,6 @@
               <w:cnfStyle w:val="000000100000" w:firstRow="0" w:lastRow="0" w:firstColumn="0" w:lastColumn="0" w:oddVBand="0" w:evenVBand="0" w:oddHBand="1" w:evenHBand="0" w:firstRowFirstColumn="0" w:firstRowLastColumn="0" w:lastRowFirstColumn="0" w:lastRowLastColumn="0"/>
             </w:pPr>
             <w:r>
-              <w:lastRenderedPageBreak/>
               <w:t>Évolutivité et Flexibilité</w:t>
             </w:r>
           </w:p>
@@ -1402,11 +1427,7 @@
               <w:cnfStyle w:val="000000100000" w:firstRow="0" w:lastRow="0" w:firstColumn="0" w:lastColumn="0" w:oddVBand="0" w:evenVBand="0" w:oddHBand="1" w:evenHBand="0" w:firstRowFirstColumn="0" w:firstRowLastColumn="0" w:lastRowFirstColumn="0" w:lastRowLastColumn="0"/>
             </w:pPr>
             <w:r>
-              <w:t xml:space="preserve">Pas gratuit et peu potentiellement avoir des pannes. Doit faire un back-up </w:t>
-            </w:r>
-            <w:r>
-              <w:lastRenderedPageBreak/>
-              <w:t>des services ou applications en cas de problèmes majeurs</w:t>
+              <w:t>Pas gratuit et peu potentiellement avoir des pannes. Doit faire un back-up des services ou applications en cas de problèmes majeurs</w:t>
             </w:r>
           </w:p>
           <w:p>
@@ -1436,7 +1457,6 @@
               <w:cnfStyle w:val="000000100000" w:firstRow="0" w:lastRow="0" w:firstColumn="0" w:lastColumn="0" w:oddVBand="0" w:evenVBand="0" w:oddHBand="1" w:evenHBand="0" w:firstRowFirstColumn="0" w:firstRowLastColumn="0" w:lastRowFirstColumn="0" w:lastRowLastColumn="0"/>
             </w:pPr>
             <w:r>
-              <w:lastRenderedPageBreak/>
               <w:t>https://www.ovhcloud.com/fr-ca/vps/</w:t>
             </w:r>
           </w:p>
@@ -1451,11 +1471,7 @@
               <w:cnfStyle w:val="000000100000" w:firstRow="0" w:lastRow="0" w:firstColumn="0" w:lastColumn="0" w:oddVBand="0" w:evenVBand="0" w:oddHBand="1" w:evenHBand="0" w:firstRowFirstColumn="0" w:firstRowLastColumn="0" w:lastRowFirstColumn="0" w:lastRowLastColumn="0"/>
             </w:pPr>
             <w:r>
-              <w:t xml:space="preserve">Serait adéquat pour héberger notre site qui serait accessible sur internet à un prix modeste et peut aussi </w:t>
-            </w:r>
-            <w:r>
-              <w:lastRenderedPageBreak/>
-              <w:t>faire la tâche backend. Cependant, on devra débourser pour accéder à un site web</w:t>
+              <w:t>Serait adéquat pour héberger notre site qui serait accessible sur internet à un prix modeste et peut aussi faire la tâche backend. Cependant, on devra débourser pour accéder à un site web</w:t>
             </w:r>
           </w:p>
         </w:tc>
@@ -1799,7 +1815,6 @@
             <w:r>
               <w:t xml:space="preserve">L'API web de la </w:t>
             </w:r>
-            <w:proofErr w:type="gramStart"/>
             <w:r>
               <w:t>STM</w:t>
             </w:r>
@@ -1807,9 +1822,8 @@
               <w:t xml:space="preserve"> </w:t>
             </w:r>
             <w:r>
-              <w:t xml:space="preserve"> permet</w:t>
-            </w:r>
-            <w:proofErr w:type="gramEnd"/>
+              <w:t>permet</w:t>
+            </w:r>
             <w:r>
               <w:t xml:space="preserve"> aux développeurs d'accéder aux données et aux fonctionnalités liées au réseau de transport en commun de Montréal.</w:t>
             </w:r>
@@ -1916,6 +1930,7 @@
           </w:tcPr>
           <w:p>
             <w:r>
+              <w:lastRenderedPageBreak/>
               <w:t>PostgreSQL</w:t>
             </w:r>
           </w:p>
@@ -2223,6 +2238,1186 @@
           <w:iCs/>
         </w:rPr>
         <w:t xml:space="preserve"> par là.</w:t>
+      </w:r>
+    </w:p>
+    <w:tbl>
+      <w:tblPr>
+        <w:tblStyle w:val="TableauGrille4-Accentuation5"/>
+        <w:tblW w:w="5000" w:type="pct"/>
+        <w:tblLook w:val="04A0" w:firstRow="1" w:lastRow="0" w:firstColumn="1" w:lastColumn="0" w:noHBand="0" w:noVBand="1"/>
+      </w:tblPr>
+      <w:tblGrid>
+        <w:gridCol w:w="2301"/>
+        <w:gridCol w:w="2301"/>
+        <w:gridCol w:w="2345"/>
+        <w:gridCol w:w="2261"/>
+        <w:gridCol w:w="5757"/>
+        <w:gridCol w:w="2305"/>
+      </w:tblGrid>
+      <w:tr>
+        <w:trPr>
+          <w:cnfStyle w:val="100000000000" w:firstRow="1" w:lastRow="0" w:firstColumn="0" w:lastColumn="0" w:oddVBand="0" w:evenVBand="0" w:oddHBand="0" w:evenHBand="0" w:firstRowFirstColumn="0" w:firstRowLastColumn="0" w:lastRowFirstColumn="0" w:lastRowLastColumn="0"/>
+        </w:trPr>
+        <w:tc>
+          <w:tcPr>
+            <w:cnfStyle w:val="001000000000" w:firstRow="0" w:lastRow="0" w:firstColumn="1" w:lastColumn="0" w:oddVBand="0" w:evenVBand="0" w:oddHBand="0" w:evenHBand="0" w:firstRowFirstColumn="0" w:firstRowLastColumn="0" w:lastRowFirstColumn="0" w:lastRowLastColumn="0"/>
+            <w:tcW w:w="833" w:type="pct"/>
+          </w:tcPr>
+          <w:p>
+            <w:pPr>
+              <w:spacing w:line="259" w:lineRule="auto"/>
+            </w:pPr>
+            <w:r>
+              <w:t>Nom</w:t>
+            </w:r>
+            <w:r>
+              <w:t xml:space="preserve"> de la technologie</w:t>
+            </w:r>
+          </w:p>
+        </w:tc>
+        <w:tc>
+          <w:tcPr>
+            <w:tcW w:w="833" w:type="pct"/>
+          </w:tcPr>
+          <w:p>
+            <w:pPr>
+              <w:spacing w:line="259" w:lineRule="auto"/>
+              <w:cnfStyle w:val="100000000000" w:firstRow="1" w:lastRow="0" w:firstColumn="0" w:lastColumn="0" w:oddVBand="0" w:evenVBand="0" w:oddHBand="0" w:evenHBand="0" w:firstRowFirstColumn="0" w:firstRowLastColumn="0" w:lastRowFirstColumn="0" w:lastRowLastColumn="0"/>
+            </w:pPr>
+            <w:r>
+              <w:t>Description</w:t>
+            </w:r>
+            <w:r>
+              <w:t xml:space="preserve"> sommaire</w:t>
+            </w:r>
+          </w:p>
+        </w:tc>
+        <w:tc>
+          <w:tcPr>
+            <w:tcW w:w="834" w:type="pct"/>
+          </w:tcPr>
+          <w:p>
+            <w:pPr>
+              <w:spacing w:line="259" w:lineRule="auto"/>
+              <w:cnfStyle w:val="100000000000" w:firstRow="1" w:lastRow="0" w:firstColumn="0" w:lastColumn="0" w:oddVBand="0" w:evenVBand="0" w:oddHBand="0" w:evenHBand="0" w:firstRowFirstColumn="0" w:firstRowLastColumn="0" w:lastRowFirstColumn="0" w:lastRowLastColumn="0"/>
+            </w:pPr>
+            <w:r>
+              <w:t>Avantages</w:t>
+            </w:r>
+          </w:p>
+        </w:tc>
+        <w:tc>
+          <w:tcPr>
+            <w:tcW w:w="833" w:type="pct"/>
+          </w:tcPr>
+          <w:p>
+            <w:pPr>
+              <w:spacing w:line="259" w:lineRule="auto"/>
+              <w:cnfStyle w:val="100000000000" w:firstRow="1" w:lastRow="0" w:firstColumn="0" w:lastColumn="0" w:oddVBand="0" w:evenVBand="0" w:oddHBand="0" w:evenHBand="0" w:firstRowFirstColumn="0" w:firstRowLastColumn="0" w:lastRowFirstColumn="0" w:lastRowLastColumn="0"/>
+            </w:pPr>
+            <w:r>
+              <w:t>Limitations</w:t>
+            </w:r>
+            <w:r>
+              <w:t xml:space="preserve"> ou </w:t>
+            </w:r>
+            <w:r>
+              <w:t>incertitudes</w:t>
+            </w:r>
+          </w:p>
+        </w:tc>
+        <w:tc>
+          <w:tcPr>
+            <w:tcW w:w="833" w:type="pct"/>
+          </w:tcPr>
+          <w:p>
+            <w:pPr>
+              <w:spacing w:line="259" w:lineRule="auto"/>
+              <w:cnfStyle w:val="100000000000" w:firstRow="1" w:lastRow="0" w:firstColumn="0" w:lastColumn="0" w:oddVBand="0" w:evenVBand="0" w:oddHBand="0" w:evenHBand="0" w:firstRowFirstColumn="0" w:firstRowLastColumn="0" w:lastRowFirstColumn="0" w:lastRowLastColumn="0"/>
+            </w:pPr>
+            <w:r>
+              <w:t>Références et exemples</w:t>
+            </w:r>
+          </w:p>
+        </w:tc>
+        <w:tc>
+          <w:tcPr>
+            <w:tcW w:w="834" w:type="pct"/>
+          </w:tcPr>
+          <w:p>
+            <w:pPr>
+              <w:spacing w:line="259" w:lineRule="auto"/>
+              <w:cnfStyle w:val="100000000000" w:firstRow="1" w:lastRow="0" w:firstColumn="0" w:lastColumn="0" w:oddVBand="0" w:evenVBand="0" w:oddHBand="0" w:evenHBand="0" w:firstRowFirstColumn="0" w:firstRowLastColumn="0" w:lastRowFirstColumn="0" w:lastRowLastColumn="0"/>
+            </w:pPr>
+            <w:r>
+              <w:t>Analyse</w:t>
+            </w:r>
+            <w:r>
+              <w:t xml:space="preserve"> (votre jugement)</w:t>
+            </w:r>
+          </w:p>
+        </w:tc>
+      </w:tr>
+      <w:tr>
+        <w:trPr>
+          <w:cnfStyle w:val="000000100000" w:firstRow="0" w:lastRow="0" w:firstColumn="0" w:lastColumn="0" w:oddVBand="0" w:evenVBand="0" w:oddHBand="1" w:evenHBand="0" w:firstRowFirstColumn="0" w:firstRowLastColumn="0" w:lastRowFirstColumn="0" w:lastRowLastColumn="0"/>
+        </w:trPr>
+        <w:tc>
+          <w:tcPr>
+            <w:cnfStyle w:val="001000000000" w:firstRow="0" w:lastRow="0" w:firstColumn="1" w:lastColumn="0" w:oddVBand="0" w:evenVBand="0" w:oddHBand="0" w:evenHBand="0" w:firstRowFirstColumn="0" w:firstRowLastColumn="0" w:lastRowFirstColumn="0" w:lastRowLastColumn="0"/>
+            <w:tcW w:w="833" w:type="pct"/>
+          </w:tcPr>
+          <w:p>
+            <w:pPr>
+              <w:spacing w:line="259" w:lineRule="auto"/>
+            </w:pPr>
+            <w:r>
+              <w:t>Python</w:t>
+            </w:r>
+          </w:p>
+        </w:tc>
+        <w:tc>
+          <w:tcPr>
+            <w:tcW w:w="833" w:type="pct"/>
+          </w:tcPr>
+          <w:p>
+            <w:pPr>
+              <w:spacing w:line="259" w:lineRule="auto"/>
+              <w:cnfStyle w:val="000000100000" w:firstRow="0" w:lastRow="0" w:firstColumn="0" w:lastColumn="0" w:oddVBand="0" w:evenVBand="0" w:oddHBand="1" w:evenHBand="0" w:firstRowFirstColumn="0" w:firstRowLastColumn="0" w:lastRowFirstColumn="0" w:lastRowLastColumn="0"/>
+            </w:pPr>
+            <w:r>
+              <w:t>Python est un langage de programmation polyvalent, largement utilisé pour sa lisibilité, sa simplicité syntaxique et sa polyvalence dans de nombreux domaines, de la programmation web à la science des données.</w:t>
+            </w:r>
+          </w:p>
+        </w:tc>
+        <w:tc>
+          <w:tcPr>
+            <w:tcW w:w="834" w:type="pct"/>
+          </w:tcPr>
+          <w:p>
+            <w:pPr>
+              <w:pStyle w:val="Paragraphedeliste"/>
+              <w:numPr>
+                <w:ilvl w:val="0"/>
+                <w:numId w:val="9"/>
+              </w:numPr>
+              <w:cnfStyle w:val="000000100000" w:firstRow="0" w:lastRow="0" w:firstColumn="0" w:lastColumn="0" w:oddVBand="0" w:evenVBand="0" w:oddHBand="1" w:evenHBand="0" w:firstRowFirstColumn="0" w:firstRowLastColumn="0" w:lastRowFirstColumn="0" w:lastRowLastColumn="0"/>
+            </w:pPr>
+            <w:r>
+              <w:t>Facilité d'apprentissage et de lecture</w:t>
+            </w:r>
+          </w:p>
+          <w:p>
+            <w:pPr>
+              <w:pStyle w:val="Paragraphedeliste"/>
+              <w:numPr>
+                <w:ilvl w:val="0"/>
+                <w:numId w:val="9"/>
+              </w:numPr>
+              <w:cnfStyle w:val="000000100000" w:firstRow="0" w:lastRow="0" w:firstColumn="0" w:lastColumn="0" w:oddVBand="0" w:evenVBand="0" w:oddHBand="1" w:evenHBand="0" w:firstRowFirstColumn="0" w:firstRowLastColumn="0" w:lastRowFirstColumn="0" w:lastRowLastColumn="0"/>
+            </w:pPr>
+            <w:r>
+              <w:t>Large écosystème de bibliothèques</w:t>
+            </w:r>
+          </w:p>
+          <w:p>
+            <w:pPr>
+              <w:pStyle w:val="Paragraphedeliste"/>
+              <w:numPr>
+                <w:ilvl w:val="0"/>
+                <w:numId w:val="9"/>
+              </w:numPr>
+              <w:cnfStyle w:val="000000100000" w:firstRow="0" w:lastRow="0" w:firstColumn="0" w:lastColumn="0" w:oddVBand="0" w:evenVBand="0" w:oddHBand="1" w:evenHBand="0" w:firstRowFirstColumn="0" w:firstRowLastColumn="0" w:lastRowFirstColumn="0" w:lastRowLastColumn="0"/>
+            </w:pPr>
+            <w:r>
+              <w:t>Communauté</w:t>
+            </w:r>
+            <w:r>
+              <w:t xml:space="preserve"> active</w:t>
+            </w:r>
+          </w:p>
+        </w:tc>
+        <w:tc>
+          <w:tcPr>
+            <w:tcW w:w="833" w:type="pct"/>
+          </w:tcPr>
+          <w:p>
+            <w:pPr>
+              <w:spacing w:line="259" w:lineRule="auto"/>
+              <w:cnfStyle w:val="000000100000" w:firstRow="0" w:lastRow="0" w:firstColumn="0" w:lastColumn="0" w:oddVBand="0" w:evenVBand="0" w:oddHBand="1" w:evenHBand="0" w:firstRowFirstColumn="0" w:firstRowLastColumn="0" w:lastRowFirstColumn="0" w:lastRowLastColumn="0"/>
+            </w:pPr>
+            <w:r>
+              <w:t>Peut potentiellement avoir de moins bonnes performances que JavaScript et peut être moins bon si on doit avoir une haute vitesse pour traiter beaucoup de données</w:t>
+            </w:r>
+          </w:p>
+        </w:tc>
+        <w:tc>
+          <w:tcPr>
+            <w:tcW w:w="833" w:type="pct"/>
+          </w:tcPr>
+          <w:p>
+            <w:pPr>
+              <w:spacing w:line="259" w:lineRule="auto"/>
+              <w:cnfStyle w:val="000000100000" w:firstRow="0" w:lastRow="0" w:firstColumn="0" w:lastColumn="0" w:oddVBand="0" w:evenVBand="0" w:oddHBand="1" w:evenHBand="0" w:firstRowFirstColumn="0" w:firstRowLastColumn="0" w:lastRowFirstColumn="0" w:lastRowLastColumn="0"/>
+            </w:pPr>
+            <w:hyperlink r:id="rId14" w:history="1">
+              <w:r>
+                <w:rPr>
+                  <w:rStyle w:val="Lienhypertexte"/>
+                </w:rPr>
+                <w:t>https://www.relataly.com/visualize-covid-19-data-on-a-geographic-heat-maps/291/</w:t>
+              </w:r>
+            </w:hyperlink>
+          </w:p>
+          <w:p>
+            <w:pPr>
+              <w:spacing w:line="259" w:lineRule="auto"/>
+              <w:cnfStyle w:val="000000100000" w:firstRow="0" w:lastRow="0" w:firstColumn="0" w:lastColumn="0" w:oddVBand="0" w:evenVBand="0" w:oddHBand="1" w:evenHBand="0" w:firstRowFirstColumn="0" w:firstRowLastColumn="0" w:lastRowFirstColumn="0" w:lastRowLastColumn="0"/>
+            </w:pPr>
+          </w:p>
+          <w:p>
+            <w:pPr>
+              <w:spacing w:line="259" w:lineRule="auto"/>
+              <w:cnfStyle w:val="000000100000" w:firstRow="0" w:lastRow="0" w:firstColumn="0" w:lastColumn="0" w:oddVBand="0" w:evenVBand="0" w:oddHBand="1" w:evenHBand="0" w:firstRowFirstColumn="0" w:firstRowLastColumn="0" w:lastRowFirstColumn="0" w:lastRowLastColumn="0"/>
+            </w:pPr>
+            <w:hyperlink r:id="rId15" w:history="1">
+              <w:r>
+                <w:rPr>
+                  <w:rStyle w:val="Lienhypertexte"/>
+                </w:rPr>
+                <w:t>https://seaborn.pydata.org/generated/seaborn.heatmap.html</w:t>
+              </w:r>
+            </w:hyperlink>
+          </w:p>
+          <w:p>
+            <w:pPr>
+              <w:spacing w:line="259" w:lineRule="auto"/>
+              <w:cnfStyle w:val="000000100000" w:firstRow="0" w:lastRow="0" w:firstColumn="0" w:lastColumn="0" w:oddVBand="0" w:evenVBand="0" w:oddHBand="1" w:evenHBand="0" w:firstRowFirstColumn="0" w:firstRowLastColumn="0" w:lastRowFirstColumn="0" w:lastRowLastColumn="0"/>
+            </w:pPr>
+          </w:p>
+        </w:tc>
+        <w:tc>
+          <w:tcPr>
+            <w:tcW w:w="834" w:type="pct"/>
+          </w:tcPr>
+          <w:p>
+            <w:pPr>
+              <w:spacing w:line="259" w:lineRule="auto"/>
+              <w:cnfStyle w:val="000000100000" w:firstRow="0" w:lastRow="0" w:firstColumn="0" w:lastColumn="0" w:oddVBand="0" w:evenVBand="0" w:oddHBand="1" w:evenHBand="0" w:firstRowFirstColumn="0" w:firstRowLastColumn="0" w:lastRowFirstColumn="0" w:lastRowLastColumn="0"/>
+            </w:pPr>
+            <w:r>
+              <w:t xml:space="preserve">Ce langage permet de faire le backend avec beaucoup de librairies accessibles et de l’aide est disponible si nécessaire. </w:t>
+            </w:r>
+          </w:p>
+        </w:tc>
+      </w:tr>
+      <w:tr>
+        <w:tc>
+          <w:tcPr>
+            <w:cnfStyle w:val="001000000000" w:firstRow="0" w:lastRow="0" w:firstColumn="1" w:lastColumn="0" w:oddVBand="0" w:evenVBand="0" w:oddHBand="0" w:evenHBand="0" w:firstRowFirstColumn="0" w:firstRowLastColumn="0" w:lastRowFirstColumn="0" w:lastRowLastColumn="0"/>
+            <w:tcW w:w="833" w:type="pct"/>
+          </w:tcPr>
+          <w:p>
+            <w:proofErr w:type="spellStart"/>
+            <w:r>
+              <w:t>GeoPandas</w:t>
+            </w:r>
+            <w:proofErr w:type="spellEnd"/>
+          </w:p>
+        </w:tc>
+        <w:tc>
+          <w:tcPr>
+            <w:tcW w:w="833" w:type="pct"/>
+          </w:tcPr>
+          <w:p>
+            <w:pPr>
+              <w:cnfStyle w:val="000000000000" w:firstRow="0" w:lastRow="0" w:firstColumn="0" w:lastColumn="0" w:oddVBand="0" w:evenVBand="0" w:oddHBand="0" w:evenHBand="0" w:firstRowFirstColumn="0" w:firstRowLastColumn="0" w:lastRowFirstColumn="0" w:lastRowLastColumn="0"/>
+            </w:pPr>
+            <w:proofErr w:type="spellStart"/>
+            <w:r>
+              <w:t>GeoPandas</w:t>
+            </w:r>
+            <w:proofErr w:type="spellEnd"/>
+            <w:r>
+              <w:t xml:space="preserve"> est une bibliothèque Python qui facilite la manipulation et l'analyse de données géospatiales en fournissant des </w:t>
+            </w:r>
+            <w:r>
+              <w:lastRenderedPageBreak/>
+              <w:t>structures de données géographiques et des outils d'analyse spatiale.</w:t>
+            </w:r>
+          </w:p>
+        </w:tc>
+        <w:tc>
+          <w:tcPr>
+            <w:tcW w:w="834" w:type="pct"/>
+          </w:tcPr>
+          <w:p>
+            <w:pPr>
+              <w:pStyle w:val="Paragraphedeliste"/>
+              <w:numPr>
+                <w:ilvl w:val="0"/>
+                <w:numId w:val="10"/>
+              </w:numPr>
+              <w:cnfStyle w:val="000000000000" w:firstRow="0" w:lastRow="0" w:firstColumn="0" w:lastColumn="0" w:oddVBand="0" w:evenVBand="0" w:oddHBand="0" w:evenHBand="0" w:firstRowFirstColumn="0" w:firstRowLastColumn="0" w:lastRowFirstColumn="0" w:lastRowLastColumn="0"/>
+            </w:pPr>
+            <w:r>
+              <w:lastRenderedPageBreak/>
+              <w:t>Facilité d'utilisation</w:t>
+            </w:r>
+          </w:p>
+          <w:p>
+            <w:pPr>
+              <w:pStyle w:val="Paragraphedeliste"/>
+              <w:numPr>
+                <w:ilvl w:val="0"/>
+                <w:numId w:val="10"/>
+              </w:numPr>
+              <w:cnfStyle w:val="000000000000" w:firstRow="0" w:lastRow="0" w:firstColumn="0" w:lastColumn="0" w:oddVBand="0" w:evenVBand="0" w:oddHBand="0" w:evenHBand="0" w:firstRowFirstColumn="0" w:firstRowLastColumn="0" w:lastRowFirstColumn="0" w:lastRowLastColumn="0"/>
+            </w:pPr>
+            <w:r>
+              <w:t>Traitement de données géospatiales complètes</w:t>
+            </w:r>
+          </w:p>
+          <w:p>
+            <w:pPr>
+              <w:pStyle w:val="Paragraphedeliste"/>
+              <w:numPr>
+                <w:ilvl w:val="0"/>
+                <w:numId w:val="10"/>
+              </w:numPr>
+              <w:cnfStyle w:val="000000000000" w:firstRow="0" w:lastRow="0" w:firstColumn="0" w:lastColumn="0" w:oddVBand="0" w:evenVBand="0" w:oddHBand="0" w:evenHBand="0" w:firstRowFirstColumn="0" w:firstRowLastColumn="0" w:lastRowFirstColumn="0" w:lastRowLastColumn="0"/>
+            </w:pPr>
+            <w:r>
+              <w:lastRenderedPageBreak/>
+              <w:t xml:space="preserve">Intégration </w:t>
+            </w:r>
+            <w:r>
+              <w:t>facile</w:t>
+            </w:r>
+            <w:r>
+              <w:t xml:space="preserve"> avec d'autres bibliothèques</w:t>
+            </w:r>
+          </w:p>
+        </w:tc>
+        <w:tc>
+          <w:tcPr>
+            <w:tcW w:w="833" w:type="pct"/>
+          </w:tcPr>
+          <w:p>
+            <w:pPr>
+              <w:cnfStyle w:val="000000000000" w:firstRow="0" w:lastRow="0" w:firstColumn="0" w:lastColumn="0" w:oddVBand="0" w:evenVBand="0" w:oddHBand="0" w:evenHBand="0" w:firstRowFirstColumn="0" w:firstRowLastColumn="0" w:lastRowFirstColumn="0" w:lastRowLastColumn="0"/>
+            </w:pPr>
+            <w:r>
+              <w:lastRenderedPageBreak/>
+              <w:t xml:space="preserve">Certaines opérations géospatiales avancées peuvent nécessiter une connaissance approfondie des concepts géospatiaux, ce qui peut rendre </w:t>
+            </w:r>
+            <w:r>
+              <w:lastRenderedPageBreak/>
+              <w:t>complexe la mise en œuvre de certaines tâches</w:t>
+            </w:r>
+          </w:p>
+        </w:tc>
+        <w:tc>
+          <w:tcPr>
+            <w:tcW w:w="833" w:type="pct"/>
+          </w:tcPr>
+          <w:p>
+            <w:pPr>
+              <w:cnfStyle w:val="000000000000" w:firstRow="0" w:lastRow="0" w:firstColumn="0" w:lastColumn="0" w:oddVBand="0" w:evenVBand="0" w:oddHBand="0" w:evenHBand="0" w:firstRowFirstColumn="0" w:firstRowLastColumn="0" w:lastRowFirstColumn="0" w:lastRowLastColumn="0"/>
+            </w:pPr>
+            <w:hyperlink r:id="rId16" w:history="1">
+              <w:r>
+                <w:rPr>
+                  <w:rStyle w:val="Lienhypertexte"/>
+                </w:rPr>
+                <w:t>https://www.relataly.com/visualize-covid-19-data-on-a-geographic-heat-maps/291/</w:t>
+              </w:r>
+            </w:hyperlink>
+          </w:p>
+          <w:p>
+            <w:pPr>
+              <w:cnfStyle w:val="000000000000" w:firstRow="0" w:lastRow="0" w:firstColumn="0" w:lastColumn="0" w:oddVBand="0" w:evenVBand="0" w:oddHBand="0" w:evenHBand="0" w:firstRowFirstColumn="0" w:firstRowLastColumn="0" w:lastRowFirstColumn="0" w:lastRowLastColumn="0"/>
+            </w:pPr>
+          </w:p>
+        </w:tc>
+        <w:tc>
+          <w:tcPr>
+            <w:tcW w:w="834" w:type="pct"/>
+          </w:tcPr>
+          <w:p>
+            <w:pPr>
+              <w:cnfStyle w:val="000000000000" w:firstRow="0" w:lastRow="0" w:firstColumn="0" w:lastColumn="0" w:oddVBand="0" w:evenVBand="0" w:oddHBand="0" w:evenHBand="0" w:firstRowFirstColumn="0" w:firstRowLastColumn="0" w:lastRowFirstColumn="0" w:lastRowLastColumn="0"/>
+            </w:pPr>
+            <w:r>
+              <w:t>Librairie qui facilite la manipulation de données GTFS qui provient de Python et donc utilisable au niveau backend</w:t>
+            </w:r>
+          </w:p>
+        </w:tc>
+      </w:tr>
+      <w:tr>
+        <w:trPr>
+          <w:cnfStyle w:val="000000100000" w:firstRow="0" w:lastRow="0" w:firstColumn="0" w:lastColumn="0" w:oddVBand="0" w:evenVBand="0" w:oddHBand="1" w:evenHBand="0" w:firstRowFirstColumn="0" w:firstRowLastColumn="0" w:lastRowFirstColumn="0" w:lastRowLastColumn="0"/>
+        </w:trPr>
+        <w:tc>
+          <w:tcPr>
+            <w:cnfStyle w:val="001000000000" w:firstRow="0" w:lastRow="0" w:firstColumn="1" w:lastColumn="0" w:oddVBand="0" w:evenVBand="0" w:oddHBand="0" w:evenHBand="0" w:firstRowFirstColumn="0" w:firstRowLastColumn="0" w:lastRowFirstColumn="0" w:lastRowLastColumn="0"/>
+            <w:tcW w:w="833" w:type="pct"/>
+          </w:tcPr>
+          <w:p>
+            <w:proofErr w:type="spellStart"/>
+            <w:r>
+              <w:t>Angular</w:t>
+            </w:r>
+            <w:proofErr w:type="spellEnd"/>
+          </w:p>
+        </w:tc>
+        <w:tc>
+          <w:tcPr>
+            <w:tcW w:w="833" w:type="pct"/>
+          </w:tcPr>
+          <w:p>
+            <w:pPr>
+              <w:cnfStyle w:val="000000100000" w:firstRow="0" w:lastRow="0" w:firstColumn="0" w:lastColumn="0" w:oddVBand="0" w:evenVBand="0" w:oddHBand="1" w:evenHBand="0" w:firstRowFirstColumn="0" w:firstRowLastColumn="0" w:lastRowFirstColumn="0" w:lastRowLastColumn="0"/>
+            </w:pPr>
+            <w:proofErr w:type="spellStart"/>
+            <w:r>
+              <w:t>Angular</w:t>
+            </w:r>
+            <w:proofErr w:type="spellEnd"/>
+            <w:r>
+              <w:t xml:space="preserve"> est un </w:t>
+            </w:r>
+            <w:proofErr w:type="spellStart"/>
+            <w:r>
+              <w:t>framework</w:t>
+            </w:r>
+            <w:proofErr w:type="spellEnd"/>
+            <w:r>
+              <w:t xml:space="preserve"> de développement web open source basé sur </w:t>
+            </w:r>
+            <w:proofErr w:type="spellStart"/>
+            <w:r>
+              <w:t>TypeScript</w:t>
+            </w:r>
+            <w:proofErr w:type="spellEnd"/>
+            <w:r>
+              <w:t>, utilisé pour créer des applications web interactives, dynamiques et évolutives.</w:t>
+            </w:r>
+          </w:p>
+        </w:tc>
+        <w:tc>
+          <w:tcPr>
+            <w:tcW w:w="834" w:type="pct"/>
+          </w:tcPr>
+          <w:p>
+            <w:pPr>
+              <w:pStyle w:val="Paragraphedeliste"/>
+              <w:numPr>
+                <w:ilvl w:val="0"/>
+                <w:numId w:val="10"/>
+              </w:numPr>
+              <w:cnfStyle w:val="000000100000" w:firstRow="0" w:lastRow="0" w:firstColumn="0" w:lastColumn="0" w:oddVBand="0" w:evenVBand="0" w:oddHBand="1" w:evenHBand="0" w:firstRowFirstColumn="0" w:firstRowLastColumn="0" w:lastRowFirstColumn="0" w:lastRowLastColumn="0"/>
+            </w:pPr>
+            <w:r>
+              <w:t>Structure organisée</w:t>
+            </w:r>
+          </w:p>
+          <w:p>
+            <w:pPr>
+              <w:pStyle w:val="Paragraphedeliste"/>
+              <w:numPr>
+                <w:ilvl w:val="0"/>
+                <w:numId w:val="10"/>
+              </w:numPr>
+              <w:cnfStyle w:val="000000100000" w:firstRow="0" w:lastRow="0" w:firstColumn="0" w:lastColumn="0" w:oddVBand="0" w:evenVBand="0" w:oddHBand="1" w:evenHBand="0" w:firstRowFirstColumn="0" w:firstRowLastColumn="0" w:lastRowFirstColumn="0" w:lastRowLastColumn="0"/>
+            </w:pPr>
+            <w:r>
+              <w:t>Optimisation des performances</w:t>
+            </w:r>
+          </w:p>
+        </w:tc>
+        <w:tc>
+          <w:tcPr>
+            <w:tcW w:w="833" w:type="pct"/>
+          </w:tcPr>
+          <w:p>
+            <w:pPr>
+              <w:pStyle w:val="Paragraphedeliste"/>
+              <w:numPr>
+                <w:ilvl w:val="0"/>
+                <w:numId w:val="10"/>
+              </w:numPr>
+              <w:cnfStyle w:val="000000100000" w:firstRow="0" w:lastRow="0" w:firstColumn="0" w:lastColumn="0" w:oddVBand="0" w:evenVBand="0" w:oddHBand="1" w:evenHBand="0" w:firstRowFirstColumn="0" w:firstRowLastColumn="0" w:lastRowFirstColumn="0" w:lastRowLastColumn="0"/>
+            </w:pPr>
+            <w:r>
+              <w:t>Poids de la taille du bundle</w:t>
+            </w:r>
+          </w:p>
+          <w:p>
+            <w:pPr>
+              <w:pStyle w:val="Paragraphedeliste"/>
+              <w:numPr>
+                <w:ilvl w:val="0"/>
+                <w:numId w:val="10"/>
+              </w:numPr>
+              <w:cnfStyle w:val="000000100000" w:firstRow="0" w:lastRow="0" w:firstColumn="0" w:lastColumn="0" w:oddVBand="0" w:evenVBand="0" w:oddHBand="1" w:evenHBand="0" w:firstRowFirstColumn="0" w:firstRowLastColumn="0" w:lastRowFirstColumn="0" w:lastRowLastColumn="0"/>
+            </w:pPr>
+            <w:r>
+              <w:t>Mises à jour majeures</w:t>
+            </w:r>
+            <w:r>
+              <w:t xml:space="preserve"> </w:t>
+            </w:r>
+            <w:r>
+              <w:t>nécessite</w:t>
+            </w:r>
+            <w:r>
+              <w:t xml:space="preserve"> des changements </w:t>
+            </w:r>
+            <w:r>
+              <w:t>parfois</w:t>
+            </w:r>
+          </w:p>
+        </w:tc>
+        <w:tc>
+          <w:tcPr>
+            <w:tcW w:w="833" w:type="pct"/>
+          </w:tcPr>
+          <w:p>
+            <w:pPr>
+              <w:cnfStyle w:val="000000100000" w:firstRow="0" w:lastRow="0" w:firstColumn="0" w:lastColumn="0" w:oddVBand="0" w:evenVBand="0" w:oddHBand="1" w:evenHBand="0" w:firstRowFirstColumn="0" w:firstRowLastColumn="0" w:lastRowFirstColumn="0" w:lastRowLastColumn="0"/>
+            </w:pPr>
+            <w:hyperlink r:id="rId17" w:history="1">
+              <w:r>
+                <w:rPr>
+                  <w:rStyle w:val="Lienhypertexte"/>
+                </w:rPr>
+                <w:t>https://stackoverflow.com/questions/48919237/how-to-use-google-maps-heatmap-feature-using-angular-agm</w:t>
+              </w:r>
+            </w:hyperlink>
+          </w:p>
+          <w:p>
+            <w:pPr>
+              <w:cnfStyle w:val="000000100000" w:firstRow="0" w:lastRow="0" w:firstColumn="0" w:lastColumn="0" w:oddVBand="0" w:evenVBand="0" w:oddHBand="1" w:evenHBand="0" w:firstRowFirstColumn="0" w:firstRowLastColumn="0" w:lastRowFirstColumn="0" w:lastRowLastColumn="0"/>
+            </w:pPr>
+          </w:p>
+          <w:p>
+            <w:pPr>
+              <w:cnfStyle w:val="000000100000" w:firstRow="0" w:lastRow="0" w:firstColumn="0" w:lastColumn="0" w:oddVBand="0" w:evenVBand="0" w:oddHBand="1" w:evenHBand="0" w:firstRowFirstColumn="0" w:firstRowLastColumn="0" w:lastRowFirstColumn="0" w:lastRowLastColumn="0"/>
+            </w:pPr>
+            <w:r>
+              <w:t>https://www.section.io/engineering-education/heatmap-concepts-in-angular/</w:t>
+            </w:r>
+          </w:p>
+        </w:tc>
+        <w:tc>
+          <w:tcPr>
+            <w:tcW w:w="834" w:type="pct"/>
+          </w:tcPr>
+          <w:p>
+            <w:pPr>
+              <w:cnfStyle w:val="000000100000" w:firstRow="0" w:lastRow="0" w:firstColumn="0" w:lastColumn="0" w:oddVBand="0" w:evenVBand="0" w:oddHBand="1" w:evenHBand="0" w:firstRowFirstColumn="0" w:firstRowLastColumn="0" w:lastRowFirstColumn="0" w:lastRowLastColumn="0"/>
+            </w:pPr>
+            <w:r>
+              <w:t xml:space="preserve">Sera adéquat pour faire un frontend pour les utilisateurs qui se mélange bien à </w:t>
+            </w:r>
+            <w:proofErr w:type="spellStart"/>
+            <w:r>
+              <w:t>bootstrap</w:t>
+            </w:r>
+            <w:proofErr w:type="spellEnd"/>
+            <w:r>
+              <w:t xml:space="preserve"> pour faire un site web attrayant héberger sur le VPS</w:t>
+            </w:r>
+          </w:p>
+        </w:tc>
+      </w:tr>
+    </w:tbl>
+    <w:p/>
+    <w:p>
+      <w:pPr>
+        <w:pStyle w:val="Titre2"/>
+      </w:pPr>
+      <w:bookmarkStart w:id="5" w:name="_Toc144118373"/>
+      <w:r>
+        <w:t>Environnement de développement</w:t>
+      </w:r>
+      <w:bookmarkEnd w:id="5"/>
+    </w:p>
+    <w:p>
+      <w:r>
+        <w:t>Pour développer l</w:t>
+      </w:r>
+      <w:r>
+        <w:t xml:space="preserve">e logiciel </w:t>
+      </w:r>
+      <w:r>
+        <w:t>répondant au besoin, quel</w:t>
+      </w:r>
+      <w:r>
+        <w:t>s</w:t>
+      </w:r>
+      <w:r>
+        <w:t xml:space="preserve"> </w:t>
+      </w:r>
+      <w:r>
+        <w:t>outils</w:t>
+      </w:r>
+      <w:r>
+        <w:t xml:space="preserve"> </w:t>
+      </w:r>
+      <w:r>
+        <w:t xml:space="preserve">ou processus </w:t>
+      </w:r>
+      <w:r>
+        <w:t>de développement serai</w:t>
+      </w:r>
+      <w:r>
+        <w:t>en</w:t>
+      </w:r>
+      <w:r>
+        <w:t xml:space="preserve">t </w:t>
+      </w:r>
+      <w:r>
+        <w:t>utiles</w:t>
+      </w:r>
+      <w:r>
+        <w:t xml:space="preserve"> ou nécessaires</w:t>
+      </w:r>
+      <w:r>
+        <w:t>?</w:t>
+      </w:r>
+      <w:r>
+        <w:br/>
+      </w:r>
+      <w:r>
+        <w:t>Certaines plateformes nécessitent parfois l’utilisation de logiciels spécifiques pour le développement d’application</w:t>
+      </w:r>
+      <w:r>
+        <w:t>s</w:t>
+      </w:r>
+      <w:r>
+        <w:t>; Si c’est le cas, il faut les identifier ici.</w:t>
+      </w:r>
+    </w:p>
+    <w:tbl>
+      <w:tblPr>
+        <w:tblStyle w:val="TableauGrille4-Accentuation5"/>
+        <w:tblW w:w="5000" w:type="pct"/>
+        <w:tblLook w:val="04A0" w:firstRow="1" w:lastRow="0" w:firstColumn="1" w:lastColumn="0" w:noHBand="0" w:noVBand="1"/>
+      </w:tblPr>
+      <w:tblGrid>
+        <w:gridCol w:w="2438"/>
+        <w:gridCol w:w="2438"/>
+        <w:gridCol w:w="2442"/>
+        <w:gridCol w:w="2439"/>
+        <w:gridCol w:w="5070"/>
+        <w:gridCol w:w="2443"/>
+      </w:tblGrid>
+      <w:tr>
+        <w:trPr>
+          <w:cnfStyle w:val="100000000000" w:firstRow="1" w:lastRow="0" w:firstColumn="0" w:lastColumn="0" w:oddVBand="0" w:evenVBand="0" w:oddHBand="0" w:evenHBand="0" w:firstRowFirstColumn="0" w:firstRowLastColumn="0" w:lastRowFirstColumn="0" w:lastRowLastColumn="0"/>
+        </w:trPr>
+        <w:tc>
+          <w:tcPr>
+            <w:cnfStyle w:val="001000000000" w:firstRow="0" w:lastRow="0" w:firstColumn="1" w:lastColumn="0" w:oddVBand="0" w:evenVBand="0" w:oddHBand="0" w:evenHBand="0" w:firstRowFirstColumn="0" w:firstRowLastColumn="0" w:lastRowFirstColumn="0" w:lastRowLastColumn="0"/>
+            <w:tcW w:w="833" w:type="pct"/>
+          </w:tcPr>
+          <w:p>
+            <w:pPr>
+              <w:spacing w:line="259" w:lineRule="auto"/>
+            </w:pPr>
+            <w:r>
+              <w:t>Nom</w:t>
+            </w:r>
+            <w:r>
+              <w:t xml:space="preserve"> de la technologie</w:t>
+            </w:r>
+          </w:p>
+        </w:tc>
+        <w:tc>
+          <w:tcPr>
+            <w:tcW w:w="833" w:type="pct"/>
+          </w:tcPr>
+          <w:p>
+            <w:pPr>
+              <w:spacing w:line="259" w:lineRule="auto"/>
+              <w:cnfStyle w:val="100000000000" w:firstRow="1" w:lastRow="0" w:firstColumn="0" w:lastColumn="0" w:oddVBand="0" w:evenVBand="0" w:oddHBand="0" w:evenHBand="0" w:firstRowFirstColumn="0" w:firstRowLastColumn="0" w:lastRowFirstColumn="0" w:lastRowLastColumn="0"/>
+            </w:pPr>
+            <w:r>
+              <w:t>Description</w:t>
+            </w:r>
+            <w:r>
+              <w:t xml:space="preserve"> sommaire</w:t>
+            </w:r>
+          </w:p>
+        </w:tc>
+        <w:tc>
+          <w:tcPr>
+            <w:tcW w:w="834" w:type="pct"/>
+          </w:tcPr>
+          <w:p>
+            <w:pPr>
+              <w:spacing w:line="259" w:lineRule="auto"/>
+              <w:cnfStyle w:val="100000000000" w:firstRow="1" w:lastRow="0" w:firstColumn="0" w:lastColumn="0" w:oddVBand="0" w:evenVBand="0" w:oddHBand="0" w:evenHBand="0" w:firstRowFirstColumn="0" w:firstRowLastColumn="0" w:lastRowFirstColumn="0" w:lastRowLastColumn="0"/>
+            </w:pPr>
+            <w:r>
+              <w:t>Avantages</w:t>
+            </w:r>
+          </w:p>
+        </w:tc>
+        <w:tc>
+          <w:tcPr>
+            <w:tcW w:w="833" w:type="pct"/>
+          </w:tcPr>
+          <w:p>
+            <w:pPr>
+              <w:spacing w:line="259" w:lineRule="auto"/>
+              <w:cnfStyle w:val="100000000000" w:firstRow="1" w:lastRow="0" w:firstColumn="0" w:lastColumn="0" w:oddVBand="0" w:evenVBand="0" w:oddHBand="0" w:evenHBand="0" w:firstRowFirstColumn="0" w:firstRowLastColumn="0" w:lastRowFirstColumn="0" w:lastRowLastColumn="0"/>
+            </w:pPr>
+            <w:r>
+              <w:t>Limitations</w:t>
+            </w:r>
+            <w:r>
+              <w:t xml:space="preserve"> ou </w:t>
+            </w:r>
+            <w:r>
+              <w:t>incertitudes</w:t>
+            </w:r>
+          </w:p>
+        </w:tc>
+        <w:tc>
+          <w:tcPr>
+            <w:tcW w:w="833" w:type="pct"/>
+          </w:tcPr>
+          <w:p>
+            <w:pPr>
+              <w:spacing w:line="259" w:lineRule="auto"/>
+              <w:cnfStyle w:val="100000000000" w:firstRow="1" w:lastRow="0" w:firstColumn="0" w:lastColumn="0" w:oddVBand="0" w:evenVBand="0" w:oddHBand="0" w:evenHBand="0" w:firstRowFirstColumn="0" w:firstRowLastColumn="0" w:lastRowFirstColumn="0" w:lastRowLastColumn="0"/>
+            </w:pPr>
+            <w:r>
+              <w:t>Références et exemples</w:t>
+            </w:r>
+          </w:p>
+        </w:tc>
+        <w:tc>
+          <w:tcPr>
+            <w:tcW w:w="834" w:type="pct"/>
+          </w:tcPr>
+          <w:p>
+            <w:pPr>
+              <w:spacing w:line="259" w:lineRule="auto"/>
+              <w:cnfStyle w:val="100000000000" w:firstRow="1" w:lastRow="0" w:firstColumn="0" w:lastColumn="0" w:oddVBand="0" w:evenVBand="0" w:oddHBand="0" w:evenHBand="0" w:firstRowFirstColumn="0" w:firstRowLastColumn="0" w:lastRowFirstColumn="0" w:lastRowLastColumn="0"/>
+            </w:pPr>
+            <w:r>
+              <w:t>Analyse</w:t>
+            </w:r>
+            <w:r>
+              <w:t xml:space="preserve"> (votre jugement)</w:t>
+            </w:r>
+          </w:p>
+        </w:tc>
+      </w:tr>
+      <w:tr>
+        <w:trPr>
+          <w:cnfStyle w:val="000000100000" w:firstRow="0" w:lastRow="0" w:firstColumn="0" w:lastColumn="0" w:oddVBand="0" w:evenVBand="0" w:oddHBand="1" w:evenHBand="0" w:firstRowFirstColumn="0" w:firstRowLastColumn="0" w:lastRowFirstColumn="0" w:lastRowLastColumn="0"/>
+        </w:trPr>
+        <w:tc>
+          <w:tcPr>
+            <w:cnfStyle w:val="001000000000" w:firstRow="0" w:lastRow="0" w:firstColumn="1" w:lastColumn="0" w:oddVBand="0" w:evenVBand="0" w:oddHBand="0" w:evenHBand="0" w:firstRowFirstColumn="0" w:firstRowLastColumn="0" w:lastRowFirstColumn="0" w:lastRowLastColumn="0"/>
+            <w:tcW w:w="833" w:type="pct"/>
+          </w:tcPr>
+          <w:p>
+            <w:pPr>
+              <w:spacing w:line="259" w:lineRule="auto"/>
+            </w:pPr>
+            <w:r>
+              <w:t>Visual Studio Code</w:t>
+            </w:r>
+          </w:p>
+        </w:tc>
+        <w:tc>
+          <w:tcPr>
+            <w:tcW w:w="833" w:type="pct"/>
+          </w:tcPr>
+          <w:p>
+            <w:pPr>
+              <w:spacing w:line="259" w:lineRule="auto"/>
+              <w:cnfStyle w:val="000000100000" w:firstRow="0" w:lastRow="0" w:firstColumn="0" w:lastColumn="0" w:oddVBand="0" w:evenVBand="0" w:oddHBand="1" w:evenHBand="0" w:firstRowFirstColumn="0" w:firstRowLastColumn="0" w:lastRowFirstColumn="0" w:lastRowLastColumn="0"/>
+            </w:pPr>
+            <w:r>
+              <w:t>VS Code est un environnement de développement intégré (IDE) léger et open source, développé par Microsoft, qui offre des fonctionnalités avancées pour la programmation et la gestion de projets informatiques.</w:t>
+            </w:r>
+          </w:p>
+        </w:tc>
+        <w:tc>
+          <w:tcPr>
+            <w:tcW w:w="834" w:type="pct"/>
+          </w:tcPr>
+          <w:p>
+            <w:pPr>
+              <w:pStyle w:val="Paragraphedeliste"/>
+              <w:numPr>
+                <w:ilvl w:val="0"/>
+                <w:numId w:val="11"/>
+              </w:numPr>
+              <w:cnfStyle w:val="000000100000" w:firstRow="0" w:lastRow="0" w:firstColumn="0" w:lastColumn="0" w:oddVBand="0" w:evenVBand="0" w:oddHBand="1" w:evenHBand="0" w:firstRowFirstColumn="0" w:firstRowLastColumn="0" w:lastRowFirstColumn="0" w:lastRowLastColumn="0"/>
+            </w:pPr>
+            <w:r>
+              <w:t>Légèreté et Rapidité</w:t>
+            </w:r>
+          </w:p>
+          <w:p>
+            <w:pPr>
+              <w:pStyle w:val="Paragraphedeliste"/>
+              <w:numPr>
+                <w:ilvl w:val="0"/>
+                <w:numId w:val="11"/>
+              </w:numPr>
+              <w:cnfStyle w:val="000000100000" w:firstRow="0" w:lastRow="0" w:firstColumn="0" w:lastColumn="0" w:oddVBand="0" w:evenVBand="0" w:oddHBand="1" w:evenHBand="0" w:firstRowFirstColumn="0" w:firstRowLastColumn="0" w:lastRowFirstColumn="0" w:lastRowLastColumn="0"/>
+            </w:pPr>
+            <w:r>
+              <w:t>Extensions Puissantes</w:t>
+            </w:r>
+            <w:r>
+              <w:t xml:space="preserve"> et en abondances</w:t>
+            </w:r>
+          </w:p>
+          <w:p>
+            <w:pPr>
+              <w:pStyle w:val="Paragraphedeliste"/>
+              <w:numPr>
+                <w:ilvl w:val="0"/>
+                <w:numId w:val="11"/>
+              </w:numPr>
+              <w:cnfStyle w:val="000000100000" w:firstRow="0" w:lastRow="0" w:firstColumn="0" w:lastColumn="0" w:oddVBand="0" w:evenVBand="0" w:oddHBand="1" w:evenHBand="0" w:firstRowFirstColumn="0" w:firstRowLastColumn="0" w:lastRowFirstColumn="0" w:lastRowLastColumn="0"/>
+            </w:pPr>
+            <w:r>
+              <w:t>Intégration Git</w:t>
+            </w:r>
+          </w:p>
+          <w:p>
+            <w:pPr>
+              <w:pStyle w:val="Paragraphedeliste"/>
+              <w:numPr>
+                <w:ilvl w:val="0"/>
+                <w:numId w:val="11"/>
+              </w:numPr>
+              <w:cnfStyle w:val="000000100000" w:firstRow="0" w:lastRow="0" w:firstColumn="0" w:lastColumn="0" w:oddVBand="0" w:evenVBand="0" w:oddHBand="1" w:evenHBand="0" w:firstRowFirstColumn="0" w:firstRowLastColumn="0" w:lastRowFirstColumn="0" w:lastRowLastColumn="0"/>
+            </w:pPr>
+            <w:r>
+              <w:t>Modification de l’IDE selon les préférences</w:t>
+            </w:r>
+          </w:p>
+          <w:p>
+            <w:pPr>
+              <w:pStyle w:val="Paragraphedeliste"/>
+              <w:numPr>
+                <w:ilvl w:val="0"/>
+                <w:numId w:val="11"/>
+              </w:numPr>
+              <w:cnfStyle w:val="000000100000" w:firstRow="0" w:lastRow="0" w:firstColumn="0" w:lastColumn="0" w:oddVBand="0" w:evenVBand="0" w:oddHBand="1" w:evenHBand="0" w:firstRowFirstColumn="0" w:firstRowLastColumn="0" w:lastRowFirstColumn="0" w:lastRowLastColumn="0"/>
+            </w:pPr>
+            <w:r>
+              <w:t>Permet d’avoir un code style pareil pour tous</w:t>
+            </w:r>
+          </w:p>
+        </w:tc>
+        <w:tc>
+          <w:tcPr>
+            <w:tcW w:w="833" w:type="pct"/>
+          </w:tcPr>
+          <w:p>
+            <w:pPr>
+              <w:pStyle w:val="Paragraphedeliste"/>
+              <w:numPr>
+                <w:ilvl w:val="0"/>
+                <w:numId w:val="11"/>
+              </w:numPr>
+              <w:cnfStyle w:val="000000100000" w:firstRow="0" w:lastRow="0" w:firstColumn="0" w:lastColumn="0" w:oddVBand="0" w:evenVBand="0" w:oddHBand="1" w:evenHBand="0" w:firstRowFirstColumn="0" w:firstRowLastColumn="0" w:lastRowFirstColumn="0" w:lastRowLastColumn="0"/>
+            </w:pPr>
+            <w:r>
+              <w:t>Consommation de Mémoire</w:t>
+            </w:r>
+            <w:r>
+              <w:t xml:space="preserve"> peut être parfois haute si les projets ont beaucoup à charger</w:t>
+            </w:r>
+          </w:p>
+        </w:tc>
+        <w:tc>
+          <w:tcPr>
+            <w:tcW w:w="833" w:type="pct"/>
+          </w:tcPr>
+          <w:p>
+            <w:pPr>
+              <w:spacing w:line="259" w:lineRule="auto"/>
+              <w:cnfStyle w:val="000000100000" w:firstRow="0" w:lastRow="0" w:firstColumn="0" w:lastColumn="0" w:oddVBand="0" w:evenVBand="0" w:oddHBand="1" w:evenHBand="0" w:firstRowFirstColumn="0" w:firstRowLastColumn="0" w:lastRowFirstColumn="0" w:lastRowLastColumn="0"/>
+            </w:pPr>
+            <w:hyperlink r:id="rId18" w:history="1">
+              <w:r>
+                <w:rPr>
+                  <w:rStyle w:val="Lienhypertexte"/>
+                </w:rPr>
+                <w:t>https://code.visualstudio.com/docs/languages/python</w:t>
+              </w:r>
+            </w:hyperlink>
+          </w:p>
+          <w:p>
+            <w:pPr>
+              <w:spacing w:line="259" w:lineRule="auto"/>
+              <w:cnfStyle w:val="000000100000" w:firstRow="0" w:lastRow="0" w:firstColumn="0" w:lastColumn="0" w:oddVBand="0" w:evenVBand="0" w:oddHBand="1" w:evenHBand="0" w:firstRowFirstColumn="0" w:firstRowLastColumn="0" w:lastRowFirstColumn="0" w:lastRowLastColumn="0"/>
+            </w:pPr>
+          </w:p>
+          <w:p>
+            <w:pPr>
+              <w:spacing w:line="259" w:lineRule="auto"/>
+              <w:cnfStyle w:val="000000100000" w:firstRow="0" w:lastRow="0" w:firstColumn="0" w:lastColumn="0" w:oddVBand="0" w:evenVBand="0" w:oddHBand="1" w:evenHBand="0" w:firstRowFirstColumn="0" w:firstRowLastColumn="0" w:lastRowFirstColumn="0" w:lastRowLastColumn="0"/>
+            </w:pPr>
+            <w:hyperlink r:id="rId19" w:history="1">
+              <w:r>
+                <w:rPr>
+                  <w:rStyle w:val="Lienhypertexte"/>
+                </w:rPr>
+                <w:t>https://code.visualstudio.com/docs/nodejs/angular-tutorial</w:t>
+              </w:r>
+            </w:hyperlink>
+          </w:p>
+          <w:p>
+            <w:pPr>
+              <w:spacing w:line="259" w:lineRule="auto"/>
+              <w:cnfStyle w:val="000000100000" w:firstRow="0" w:lastRow="0" w:firstColumn="0" w:lastColumn="0" w:oddVBand="0" w:evenVBand="0" w:oddHBand="1" w:evenHBand="0" w:firstRowFirstColumn="0" w:firstRowLastColumn="0" w:lastRowFirstColumn="0" w:lastRowLastColumn="0"/>
+            </w:pPr>
+          </w:p>
+        </w:tc>
+        <w:tc>
+          <w:tcPr>
+            <w:tcW w:w="834" w:type="pct"/>
+          </w:tcPr>
+          <w:p>
+            <w:pPr>
+              <w:spacing w:line="259" w:lineRule="auto"/>
+              <w:cnfStyle w:val="000000100000" w:firstRow="0" w:lastRow="0" w:firstColumn="0" w:lastColumn="0" w:oddVBand="0" w:evenVBand="0" w:oddHBand="1" w:evenHBand="0" w:firstRowFirstColumn="0" w:firstRowLastColumn="0" w:lastRowFirstColumn="0" w:lastRowLastColumn="0"/>
+            </w:pPr>
+            <w:proofErr w:type="gramStart"/>
+            <w:r>
+              <w:t>IDE gratuit</w:t>
+            </w:r>
+            <w:proofErr w:type="gramEnd"/>
+            <w:r>
+              <w:t xml:space="preserve"> qui peut nous mettre un code style et qui comprend très bien Python, </w:t>
+            </w:r>
+            <w:proofErr w:type="spellStart"/>
+            <w:r>
+              <w:t>Angular</w:t>
+            </w:r>
+            <w:proofErr w:type="spellEnd"/>
+            <w:r>
+              <w:t xml:space="preserve">, </w:t>
+            </w:r>
+            <w:proofErr w:type="spellStart"/>
+            <w:r>
+              <w:t>TypeScript</w:t>
+            </w:r>
+            <w:proofErr w:type="spellEnd"/>
+            <w:r>
+              <w:t xml:space="preserve"> et intègre même Git pour que le projet soit à jour</w:t>
+            </w:r>
+          </w:p>
+        </w:tc>
+      </w:tr>
+      <w:tr>
+        <w:tc>
+          <w:tcPr>
+            <w:cnfStyle w:val="001000000000" w:firstRow="0" w:lastRow="0" w:firstColumn="1" w:lastColumn="0" w:oddVBand="0" w:evenVBand="0" w:oddHBand="0" w:evenHBand="0" w:firstRowFirstColumn="0" w:firstRowLastColumn="0" w:lastRowFirstColumn="0" w:lastRowLastColumn="0"/>
+            <w:tcW w:w="833" w:type="pct"/>
+          </w:tcPr>
+          <w:p>
+            <w:r>
+              <w:lastRenderedPageBreak/>
+              <w:t>Git</w:t>
+            </w:r>
+          </w:p>
+        </w:tc>
+        <w:tc>
+          <w:tcPr>
+            <w:tcW w:w="833" w:type="pct"/>
+          </w:tcPr>
+          <w:p>
+            <w:pPr>
+              <w:cnfStyle w:val="000000000000" w:firstRow="0" w:lastRow="0" w:firstColumn="0" w:lastColumn="0" w:oddVBand="0" w:evenVBand="0" w:oddHBand="0" w:evenHBand="0" w:firstRowFirstColumn="0" w:firstRowLastColumn="0" w:lastRowFirstColumn="0" w:lastRowLastColumn="0"/>
+            </w:pPr>
+            <w:r>
+              <w:t>Git est un système de gestion de version distribué largement utilisé qui permet de suivre les modifications apportées à un ensemble de fichiers, facilitant la collaboration, la gestion des versions et le suivi des changements dans un projet de développement.</w:t>
+            </w:r>
+          </w:p>
+        </w:tc>
+        <w:tc>
+          <w:tcPr>
+            <w:tcW w:w="834" w:type="pct"/>
+          </w:tcPr>
+          <w:p>
+            <w:pPr>
+              <w:pStyle w:val="Paragraphedeliste"/>
+              <w:numPr>
+                <w:ilvl w:val="0"/>
+                <w:numId w:val="12"/>
+              </w:numPr>
+              <w:cnfStyle w:val="000000000000" w:firstRow="0" w:lastRow="0" w:firstColumn="0" w:lastColumn="0" w:oddVBand="0" w:evenVBand="0" w:oddHBand="0" w:evenHBand="0" w:firstRowFirstColumn="0" w:firstRowLastColumn="0" w:lastRowFirstColumn="0" w:lastRowLastColumn="0"/>
+            </w:pPr>
+            <w:r>
+              <w:t>Gestion de Versions Efficace</w:t>
+            </w:r>
+          </w:p>
+          <w:p>
+            <w:pPr>
+              <w:pStyle w:val="Paragraphedeliste"/>
+              <w:numPr>
+                <w:ilvl w:val="0"/>
+                <w:numId w:val="12"/>
+              </w:numPr>
+              <w:cnfStyle w:val="000000000000" w:firstRow="0" w:lastRow="0" w:firstColumn="0" w:lastColumn="0" w:oddVBand="0" w:evenVBand="0" w:oddHBand="0" w:evenHBand="0" w:firstRowFirstColumn="0" w:firstRowLastColumn="0" w:lastRowFirstColumn="0" w:lastRowLastColumn="0"/>
+            </w:pPr>
+            <w:r>
+              <w:t>Chaque développeur a une copie complète de l'historique du projet. Cela favorise la flexibilité, la résilience et la possibilité de travailler hors ligne.</w:t>
+            </w:r>
+          </w:p>
+        </w:tc>
+        <w:tc>
+          <w:tcPr>
+            <w:tcW w:w="833" w:type="pct"/>
+          </w:tcPr>
+          <w:p>
+            <w:pPr>
+              <w:pStyle w:val="Paragraphedeliste"/>
+              <w:numPr>
+                <w:ilvl w:val="0"/>
+                <w:numId w:val="12"/>
+              </w:numPr>
+              <w:cnfStyle w:val="000000000000" w:firstRow="0" w:lastRow="0" w:firstColumn="0" w:lastColumn="0" w:oddVBand="0" w:evenVBand="0" w:oddHBand="0" w:evenHBand="0" w:firstRowFirstColumn="0" w:firstRowLastColumn="0" w:lastRowFirstColumn="0" w:lastRowLastColumn="0"/>
+            </w:pPr>
+            <w:r>
+              <w:t xml:space="preserve">Git </w:t>
+            </w:r>
+            <w:r>
+              <w:t>peut-être</w:t>
+            </w:r>
+            <w:r>
+              <w:t xml:space="preserve"> assez dure </w:t>
+            </w:r>
+            <w:r>
+              <w:t>à</w:t>
+            </w:r>
+            <w:r>
+              <w:t xml:space="preserve"> comprendre au départ pour les nouveaux utilisateurs</w:t>
+            </w:r>
+          </w:p>
+        </w:tc>
+        <w:tc>
+          <w:tcPr>
+            <w:tcW w:w="833" w:type="pct"/>
+          </w:tcPr>
+          <w:p>
+            <w:pPr>
+              <w:cnfStyle w:val="000000000000" w:firstRow="0" w:lastRow="0" w:firstColumn="0" w:lastColumn="0" w:oddVBand="0" w:evenVBand="0" w:oddHBand="0" w:evenHBand="0" w:firstRowFirstColumn="0" w:firstRowLastColumn="0" w:lastRowFirstColumn="0" w:lastRowLastColumn="0"/>
+            </w:pPr>
+            <w:hyperlink r:id="rId20" w:history="1">
+              <w:r>
+                <w:rPr>
+                  <w:rStyle w:val="Lienhypertexte"/>
+                </w:rPr>
+                <w:t>https://git-scm.com/</w:t>
+              </w:r>
+            </w:hyperlink>
+          </w:p>
+          <w:p>
+            <w:pPr>
+              <w:cnfStyle w:val="000000000000" w:firstRow="0" w:lastRow="0" w:firstColumn="0" w:lastColumn="0" w:oddVBand="0" w:evenVBand="0" w:oddHBand="0" w:evenHBand="0" w:firstRowFirstColumn="0" w:firstRowLastColumn="0" w:lastRowFirstColumn="0" w:lastRowLastColumn="0"/>
+            </w:pPr>
+            <w:hyperlink r:id="rId21" w:history="1">
+              <w:r>
+                <w:rPr>
+                  <w:rStyle w:val="Lienhypertexte"/>
+                </w:rPr>
+                <w:t>https://github.com/</w:t>
+              </w:r>
+            </w:hyperlink>
+          </w:p>
+          <w:p>
+            <w:pPr>
+              <w:cnfStyle w:val="000000000000" w:firstRow="0" w:lastRow="0" w:firstColumn="0" w:lastColumn="0" w:oddVBand="0" w:evenVBand="0" w:oddHBand="0" w:evenHBand="0" w:firstRowFirstColumn="0" w:firstRowLastColumn="0" w:lastRowFirstColumn="0" w:lastRowLastColumn="0"/>
+            </w:pPr>
+            <w:hyperlink r:id="rId22" w:history="1">
+              <w:r>
+                <w:rPr>
+                  <w:rStyle w:val="Lienhypertexte"/>
+                </w:rPr>
+                <w:t>https://auth0.com/blog/using-python-flask-and-angular-to-build-modern-apps-part-1/</w:t>
+              </w:r>
+            </w:hyperlink>
+          </w:p>
+          <w:p>
+            <w:pPr>
+              <w:cnfStyle w:val="000000000000" w:firstRow="0" w:lastRow="0" w:firstColumn="0" w:lastColumn="0" w:oddVBand="0" w:evenVBand="0" w:oddHBand="0" w:evenHBand="0" w:firstRowFirstColumn="0" w:firstRowLastColumn="0" w:lastRowFirstColumn="0" w:lastRowLastColumn="0"/>
+            </w:pPr>
+          </w:p>
+        </w:tc>
+        <w:tc>
+          <w:tcPr>
+            <w:tcW w:w="834" w:type="pct"/>
+          </w:tcPr>
+          <w:p>
+            <w:pPr>
+              <w:cnfStyle w:val="000000000000" w:firstRow="0" w:lastRow="0" w:firstColumn="0" w:lastColumn="0" w:oddVBand="0" w:evenVBand="0" w:oddHBand="0" w:evenHBand="0" w:firstRowFirstColumn="0" w:firstRowLastColumn="0" w:lastRowFirstColumn="0" w:lastRowLastColumn="0"/>
+            </w:pPr>
+            <w:r>
+              <w:t xml:space="preserve">Permet à l’équipe de travailler sur des parties différentes du projet asynchrone ou </w:t>
+            </w:r>
+            <w:r>
+              <w:t xml:space="preserve">synchronisé et de le réunir en un à la fin du projet. Permet aussi de garder </w:t>
+            </w:r>
+            <w:r>
+              <w:t>les anciennes versions</w:t>
+            </w:r>
+            <w:r>
+              <w:t xml:space="preserve"> et de rester à jour.</w:t>
+            </w:r>
+          </w:p>
+        </w:tc>
+      </w:tr>
+    </w:tbl>
+    <w:p/>
+    <w:p>
+      <w:pPr>
+        <w:pStyle w:val="Titre2"/>
+      </w:pPr>
+      <w:bookmarkStart w:id="6" w:name="_Toc144118374"/>
+      <w:r>
+        <w:t>Autres technologies</w:t>
+      </w:r>
+      <w:bookmarkEnd w:id="6"/>
+    </w:p>
+    <w:p>
+      <w:r>
+        <w:t>Y a-t-il d’autres catégories de technologies qui sont nécessaire</w:t>
+      </w:r>
+      <w:r>
+        <w:t>s</w:t>
+      </w:r>
+      <w:r>
+        <w:t xml:space="preserve"> </w:t>
+      </w:r>
+      <w:r>
+        <w:t xml:space="preserve">ou utiles </w:t>
+      </w:r>
+      <w:r>
+        <w:t>pour répondre au besoin?</w:t>
+      </w:r>
+      <w:r>
+        <w:br/>
+        <w:t xml:space="preserve">Par exemple, des </w:t>
+      </w:r>
+      <w:r>
+        <w:t>logiciels ou applications existantes qui couvrent déjà la majorité des fonctionnalités répondant au besoin.</w:t>
       </w:r>
     </w:p>
     <w:tbl>
@@ -2356,9 +3551,6 @@
             <w:pPr>
               <w:spacing w:line="259" w:lineRule="auto"/>
             </w:pPr>
-            <w:r>
-              <w:t>Python</w:t>
-            </w:r>
           </w:p>
         </w:tc>
         <w:tc>
@@ -2370,15 +3562,6 @@
               <w:spacing w:line="259" w:lineRule="auto"/>
               <w:cnfStyle w:val="000000100000" w:firstRow="0" w:lastRow="0" w:firstColumn="0" w:lastColumn="0" w:oddVBand="0" w:evenVBand="0" w:oddHBand="1" w:evenHBand="0" w:firstRowFirstColumn="0" w:firstRowLastColumn="0" w:lastRowFirstColumn="0" w:lastRowLastColumn="0"/>
             </w:pPr>
-            <w:r>
-              <w:t xml:space="preserve">Python est un langage de programmation polyvalent, largement utilisé pour </w:t>
-            </w:r>
-            <w:r>
-              <w:t>sa lisibilité</w:t>
-            </w:r>
-            <w:r>
-              <w:t>, sa simplicité syntaxique et sa polyvalence dans de nombreux domaines, de la programmation web à la science des données.</w:t>
-            </w:r>
           </w:p>
         </w:tc>
         <w:tc>
@@ -2387,363 +3570,42 @@
           </w:tcPr>
           <w:p>
             <w:pPr>
-              <w:pStyle w:val="Paragraphedeliste"/>
-              <w:numPr>
-                <w:ilvl w:val="0"/>
-                <w:numId w:val="9"/>
-              </w:numPr>
+              <w:spacing w:line="259" w:lineRule="auto"/>
               <w:cnfStyle w:val="000000100000" w:firstRow="0" w:lastRow="0" w:firstColumn="0" w:lastColumn="0" w:oddVBand="0" w:evenVBand="0" w:oddHBand="1" w:evenHBand="0" w:firstRowFirstColumn="0" w:firstRowLastColumn="0" w:lastRowFirstColumn="0" w:lastRowLastColumn="0"/>
             </w:pPr>
-            <w:r>
-              <w:t>Facilité d'apprentissage et de lecture</w:t>
-            </w:r>
-          </w:p>
-          <w:p>
-            <w:pPr>
-              <w:pStyle w:val="Paragraphedeliste"/>
-              <w:numPr>
-                <w:ilvl w:val="0"/>
-                <w:numId w:val="9"/>
-              </w:numPr>
+          </w:p>
+        </w:tc>
+        <w:tc>
+          <w:tcPr>
+            <w:tcW w:w="833" w:type="pct"/>
+          </w:tcPr>
+          <w:p>
+            <w:pPr>
+              <w:spacing w:line="259" w:lineRule="auto"/>
               <w:cnfStyle w:val="000000100000" w:firstRow="0" w:lastRow="0" w:firstColumn="0" w:lastColumn="0" w:oddVBand="0" w:evenVBand="0" w:oddHBand="1" w:evenHBand="0" w:firstRowFirstColumn="0" w:firstRowLastColumn="0" w:lastRowFirstColumn="0" w:lastRowLastColumn="0"/>
             </w:pPr>
-            <w:r>
-              <w:t>Large écosystème de bibliothèques</w:t>
-            </w:r>
-          </w:p>
-          <w:p>
-            <w:pPr>
-              <w:pStyle w:val="Paragraphedeliste"/>
-              <w:numPr>
-                <w:ilvl w:val="0"/>
-                <w:numId w:val="9"/>
-              </w:numPr>
+          </w:p>
+        </w:tc>
+        <w:tc>
+          <w:tcPr>
+            <w:tcW w:w="833" w:type="pct"/>
+          </w:tcPr>
+          <w:p>
+            <w:pPr>
+              <w:spacing w:line="259" w:lineRule="auto"/>
               <w:cnfStyle w:val="000000100000" w:firstRow="0" w:lastRow="0" w:firstColumn="0" w:lastColumn="0" w:oddVBand="0" w:evenVBand="0" w:oddHBand="1" w:evenHBand="0" w:firstRowFirstColumn="0" w:firstRowLastColumn="0" w:lastRowFirstColumn="0" w:lastRowLastColumn="0"/>
             </w:pPr>
-            <w:r>
-              <w:t>Communauté</w:t>
-            </w:r>
-            <w:r>
-              <w:t xml:space="preserve"> active</w:t>
-            </w:r>
-          </w:p>
-        </w:tc>
-        <w:tc>
-          <w:tcPr>
-            <w:tcW w:w="833" w:type="pct"/>
+          </w:p>
+        </w:tc>
+        <w:tc>
+          <w:tcPr>
+            <w:tcW w:w="834" w:type="pct"/>
           </w:tcPr>
           <w:p>
             <w:pPr>
               <w:spacing w:line="259" w:lineRule="auto"/>
               <w:cnfStyle w:val="000000100000" w:firstRow="0" w:lastRow="0" w:firstColumn="0" w:lastColumn="0" w:oddVBand="0" w:evenVBand="0" w:oddHBand="1" w:evenHBand="0" w:firstRowFirstColumn="0" w:firstRowLastColumn="0" w:lastRowFirstColumn="0" w:lastRowLastColumn="0"/>
             </w:pPr>
-            <w:r>
-              <w:t>Peut potentiellement avoir de moins bonnes performances que JavaScript et peut être moins bon si on doit avoir une haute vitesse pour traiter beaucoup de données</w:t>
-            </w:r>
-          </w:p>
-        </w:tc>
-        <w:tc>
-          <w:tcPr>
-            <w:tcW w:w="833" w:type="pct"/>
-          </w:tcPr>
-          <w:p>
-            <w:pPr>
-              <w:spacing w:line="259" w:lineRule="auto"/>
-              <w:cnfStyle w:val="000000100000" w:firstRow="0" w:lastRow="0" w:firstColumn="0" w:lastColumn="0" w:oddVBand="0" w:evenVBand="0" w:oddHBand="1" w:evenHBand="0" w:firstRowFirstColumn="0" w:firstRowLastColumn="0" w:lastRowFirstColumn="0" w:lastRowLastColumn="0"/>
-            </w:pPr>
-          </w:p>
-        </w:tc>
-        <w:tc>
-          <w:tcPr>
-            <w:tcW w:w="834" w:type="pct"/>
-          </w:tcPr>
-          <w:p>
-            <w:pPr>
-              <w:spacing w:line="259" w:lineRule="auto"/>
-              <w:cnfStyle w:val="000000100000" w:firstRow="0" w:lastRow="0" w:firstColumn="0" w:lastColumn="0" w:oddVBand="0" w:evenVBand="0" w:oddHBand="1" w:evenHBand="0" w:firstRowFirstColumn="0" w:firstRowLastColumn="0" w:lastRowFirstColumn="0" w:lastRowLastColumn="0"/>
-            </w:pPr>
-            <w:r>
-              <w:t xml:space="preserve">Ce langage permet de faire le backend avec beaucoup de librairies accessibles et de l’aide est disponible si nécessaire. </w:t>
-            </w:r>
-          </w:p>
-        </w:tc>
-      </w:tr>
-      <w:tr>
-        <w:tc>
-          <w:tcPr>
-            <w:cnfStyle w:val="001000000000" w:firstRow="0" w:lastRow="0" w:firstColumn="1" w:lastColumn="0" w:oddVBand="0" w:evenVBand="0" w:oddHBand="0" w:evenHBand="0" w:firstRowFirstColumn="0" w:firstRowLastColumn="0" w:lastRowFirstColumn="0" w:lastRowLastColumn="0"/>
-            <w:tcW w:w="833" w:type="pct"/>
-          </w:tcPr>
-          <w:p>
-            <w:proofErr w:type="spellStart"/>
-            <w:r>
-              <w:t>GeoPandas</w:t>
-            </w:r>
-            <w:proofErr w:type="spellEnd"/>
-          </w:p>
-        </w:tc>
-        <w:tc>
-          <w:tcPr>
-            <w:tcW w:w="833" w:type="pct"/>
-          </w:tcPr>
-          <w:p>
-            <w:pPr>
-              <w:cnfStyle w:val="000000000000" w:firstRow="0" w:lastRow="0" w:firstColumn="0" w:lastColumn="0" w:oddVBand="0" w:evenVBand="0" w:oddHBand="0" w:evenHBand="0" w:firstRowFirstColumn="0" w:firstRowLastColumn="0" w:lastRowFirstColumn="0" w:lastRowLastColumn="0"/>
-            </w:pPr>
-            <w:proofErr w:type="spellStart"/>
-            <w:r>
-              <w:t>GeoPandas</w:t>
-            </w:r>
-            <w:proofErr w:type="spellEnd"/>
-            <w:r>
-              <w:t xml:space="preserve"> est une bibliothèque Python qui facilite la manipulation et l'analyse de données géospatiales en fournissant des structures de données géographiques et des outils d'analyse spatiale.</w:t>
-            </w:r>
-          </w:p>
-        </w:tc>
-        <w:tc>
-          <w:tcPr>
-            <w:tcW w:w="834" w:type="pct"/>
-          </w:tcPr>
-          <w:p>
-            <w:pPr>
-              <w:pStyle w:val="Paragraphedeliste"/>
-              <w:numPr>
-                <w:ilvl w:val="0"/>
-                <w:numId w:val="10"/>
-              </w:numPr>
-              <w:cnfStyle w:val="000000000000" w:firstRow="0" w:lastRow="0" w:firstColumn="0" w:lastColumn="0" w:oddVBand="0" w:evenVBand="0" w:oddHBand="0" w:evenHBand="0" w:firstRowFirstColumn="0" w:firstRowLastColumn="0" w:lastRowFirstColumn="0" w:lastRowLastColumn="0"/>
-            </w:pPr>
-            <w:r>
-              <w:t>Facilité d'utilisation</w:t>
-            </w:r>
-          </w:p>
-          <w:p>
-            <w:pPr>
-              <w:pStyle w:val="Paragraphedeliste"/>
-              <w:numPr>
-                <w:ilvl w:val="0"/>
-                <w:numId w:val="10"/>
-              </w:numPr>
-              <w:cnfStyle w:val="000000000000" w:firstRow="0" w:lastRow="0" w:firstColumn="0" w:lastColumn="0" w:oddVBand="0" w:evenVBand="0" w:oddHBand="0" w:evenHBand="0" w:firstRowFirstColumn="0" w:firstRowLastColumn="0" w:lastRowFirstColumn="0" w:lastRowLastColumn="0"/>
-            </w:pPr>
-            <w:r>
-              <w:t>Traitement de données géospatiales complètes</w:t>
-            </w:r>
-          </w:p>
-          <w:p>
-            <w:pPr>
-              <w:pStyle w:val="Paragraphedeliste"/>
-              <w:numPr>
-                <w:ilvl w:val="0"/>
-                <w:numId w:val="10"/>
-              </w:numPr>
-              <w:cnfStyle w:val="000000000000" w:firstRow="0" w:lastRow="0" w:firstColumn="0" w:lastColumn="0" w:oddVBand="0" w:evenVBand="0" w:oddHBand="0" w:evenHBand="0" w:firstRowFirstColumn="0" w:firstRowLastColumn="0" w:lastRowFirstColumn="0" w:lastRowLastColumn="0"/>
-            </w:pPr>
-            <w:r>
-              <w:t xml:space="preserve">Intégration </w:t>
-            </w:r>
-            <w:r>
-              <w:t>facile</w:t>
-            </w:r>
-            <w:r>
-              <w:t xml:space="preserve"> avec d'autres bibliothèques</w:t>
-            </w:r>
-          </w:p>
-        </w:tc>
-        <w:tc>
-          <w:tcPr>
-            <w:tcW w:w="833" w:type="pct"/>
-          </w:tcPr>
-          <w:p>
-            <w:pPr>
-              <w:cnfStyle w:val="000000000000" w:firstRow="0" w:lastRow="0" w:firstColumn="0" w:lastColumn="0" w:oddVBand="0" w:evenVBand="0" w:oddHBand="0" w:evenHBand="0" w:firstRowFirstColumn="0" w:firstRowLastColumn="0" w:lastRowFirstColumn="0" w:lastRowLastColumn="0"/>
-            </w:pPr>
-            <w:r>
-              <w:t>Certaines opérations géospatiales avancées peuvent nécessiter une connaissance approfondie des concepts géospatiaux, ce qui peut rendre complexe la mise en œuvre de certaines tâches</w:t>
-            </w:r>
-          </w:p>
-        </w:tc>
-        <w:tc>
-          <w:tcPr>
-            <w:tcW w:w="833" w:type="pct"/>
-          </w:tcPr>
-          <w:p>
-            <w:pPr>
-              <w:cnfStyle w:val="000000000000" w:firstRow="0" w:lastRow="0" w:firstColumn="0" w:lastColumn="0" w:oddVBand="0" w:evenVBand="0" w:oddHBand="0" w:evenHBand="0" w:firstRowFirstColumn="0" w:firstRowLastColumn="0" w:lastRowFirstColumn="0" w:lastRowLastColumn="0"/>
-              <w:rPr>
-                <w:lang w:val="en-CA"/>
-              </w:rPr>
-            </w:pPr>
-          </w:p>
-        </w:tc>
-        <w:tc>
-          <w:tcPr>
-            <w:tcW w:w="834" w:type="pct"/>
-          </w:tcPr>
-          <w:p>
-            <w:pPr>
-              <w:cnfStyle w:val="000000000000" w:firstRow="0" w:lastRow="0" w:firstColumn="0" w:lastColumn="0" w:oddVBand="0" w:evenVBand="0" w:oddHBand="0" w:evenHBand="0" w:firstRowFirstColumn="0" w:firstRowLastColumn="0" w:lastRowFirstColumn="0" w:lastRowLastColumn="0"/>
-            </w:pPr>
-            <w:r>
-              <w:t>Librairie qui facilite la manipulation de données GTFS qui provient de Python et donc utilisable au niveau backend</w:t>
-            </w:r>
-          </w:p>
-        </w:tc>
-      </w:tr>
-      <w:tr>
-        <w:trPr>
-          <w:cnfStyle w:val="000000100000" w:firstRow="0" w:lastRow="0" w:firstColumn="0" w:lastColumn="0" w:oddVBand="0" w:evenVBand="0" w:oddHBand="1" w:evenHBand="0" w:firstRowFirstColumn="0" w:firstRowLastColumn="0" w:lastRowFirstColumn="0" w:lastRowLastColumn="0"/>
-        </w:trPr>
-        <w:tc>
-          <w:tcPr>
-            <w:cnfStyle w:val="001000000000" w:firstRow="0" w:lastRow="0" w:firstColumn="1" w:lastColumn="0" w:oddVBand="0" w:evenVBand="0" w:oddHBand="0" w:evenHBand="0" w:firstRowFirstColumn="0" w:firstRowLastColumn="0" w:lastRowFirstColumn="0" w:lastRowLastColumn="0"/>
-            <w:tcW w:w="833" w:type="pct"/>
-          </w:tcPr>
-          <w:p>
-            <w:proofErr w:type="spellStart"/>
-            <w:r>
-              <w:t>Angular</w:t>
-            </w:r>
-            <w:proofErr w:type="spellEnd"/>
-          </w:p>
-        </w:tc>
-        <w:tc>
-          <w:tcPr>
-            <w:tcW w:w="833" w:type="pct"/>
-          </w:tcPr>
-          <w:p>
-            <w:pPr>
-              <w:cnfStyle w:val="000000100000" w:firstRow="0" w:lastRow="0" w:firstColumn="0" w:lastColumn="0" w:oddVBand="0" w:evenVBand="0" w:oddHBand="1" w:evenHBand="0" w:firstRowFirstColumn="0" w:firstRowLastColumn="0" w:lastRowFirstColumn="0" w:lastRowLastColumn="0"/>
-            </w:pPr>
-            <w:proofErr w:type="spellStart"/>
-            <w:r>
-              <w:t>Angular</w:t>
-            </w:r>
-            <w:proofErr w:type="spellEnd"/>
-            <w:r>
-              <w:t xml:space="preserve"> est un </w:t>
-            </w:r>
-            <w:proofErr w:type="spellStart"/>
-            <w:r>
-              <w:t>framework</w:t>
-            </w:r>
-            <w:proofErr w:type="spellEnd"/>
-            <w:r>
-              <w:t xml:space="preserve"> de développement web open source basé sur </w:t>
-            </w:r>
-            <w:proofErr w:type="spellStart"/>
-            <w:r>
-              <w:t>TypeScript</w:t>
-            </w:r>
-            <w:proofErr w:type="spellEnd"/>
-            <w:r>
-              <w:t>, utilisé pour créer des applications web interactives, dynamiques et évolutives.</w:t>
-            </w:r>
-          </w:p>
-        </w:tc>
-        <w:tc>
-          <w:tcPr>
-            <w:tcW w:w="834" w:type="pct"/>
-          </w:tcPr>
-          <w:p>
-            <w:pPr>
-              <w:pStyle w:val="Paragraphedeliste"/>
-              <w:numPr>
-                <w:ilvl w:val="0"/>
-                <w:numId w:val="10"/>
-              </w:numPr>
-              <w:cnfStyle w:val="000000100000" w:firstRow="0" w:lastRow="0" w:firstColumn="0" w:lastColumn="0" w:oddVBand="0" w:evenVBand="0" w:oddHBand="1" w:evenHBand="0" w:firstRowFirstColumn="0" w:firstRowLastColumn="0" w:lastRowFirstColumn="0" w:lastRowLastColumn="0"/>
-            </w:pPr>
-            <w:r>
-              <w:t>Structure organisée</w:t>
-            </w:r>
-          </w:p>
-          <w:p>
-            <w:pPr>
-              <w:pStyle w:val="Paragraphedeliste"/>
-              <w:numPr>
-                <w:ilvl w:val="0"/>
-                <w:numId w:val="10"/>
-              </w:numPr>
-              <w:cnfStyle w:val="000000100000" w:firstRow="0" w:lastRow="0" w:firstColumn="0" w:lastColumn="0" w:oddVBand="0" w:evenVBand="0" w:oddHBand="1" w:evenHBand="0" w:firstRowFirstColumn="0" w:firstRowLastColumn="0" w:lastRowFirstColumn="0" w:lastRowLastColumn="0"/>
-            </w:pPr>
-            <w:r>
-              <w:t>Optimisation des performances</w:t>
-            </w:r>
-          </w:p>
-        </w:tc>
-        <w:tc>
-          <w:tcPr>
-            <w:tcW w:w="833" w:type="pct"/>
-          </w:tcPr>
-          <w:p>
-            <w:pPr>
-              <w:pStyle w:val="Paragraphedeliste"/>
-              <w:numPr>
-                <w:ilvl w:val="0"/>
-                <w:numId w:val="10"/>
-              </w:numPr>
-              <w:cnfStyle w:val="000000100000" w:firstRow="0" w:lastRow="0" w:firstColumn="0" w:lastColumn="0" w:oddVBand="0" w:evenVBand="0" w:oddHBand="1" w:evenHBand="0" w:firstRowFirstColumn="0" w:firstRowLastColumn="0" w:lastRowFirstColumn="0" w:lastRowLastColumn="0"/>
-            </w:pPr>
-            <w:r>
-              <w:t>Poids de la taille du bundle</w:t>
-            </w:r>
-          </w:p>
-          <w:p>
-            <w:pPr>
-              <w:pStyle w:val="Paragraphedeliste"/>
-              <w:numPr>
-                <w:ilvl w:val="0"/>
-                <w:numId w:val="10"/>
-              </w:numPr>
-              <w:cnfStyle w:val="000000100000" w:firstRow="0" w:lastRow="0" w:firstColumn="0" w:lastColumn="0" w:oddVBand="0" w:evenVBand="0" w:oddHBand="1" w:evenHBand="0" w:firstRowFirstColumn="0" w:firstRowLastColumn="0" w:lastRowFirstColumn="0" w:lastRowLastColumn="0"/>
-            </w:pPr>
-            <w:r>
-              <w:t>Mises à jour majeures</w:t>
-            </w:r>
-            <w:r>
-              <w:t xml:space="preserve"> </w:t>
-            </w:r>
-            <w:r>
-              <w:t>nécessite</w:t>
-            </w:r>
-            <w:r>
-              <w:t xml:space="preserve"> des changements </w:t>
-            </w:r>
-            <w:r>
-              <w:t>parfois</w:t>
-            </w:r>
-          </w:p>
-        </w:tc>
-        <w:tc>
-          <w:tcPr>
-            <w:tcW w:w="833" w:type="pct"/>
-          </w:tcPr>
-          <w:p>
-            <w:pPr>
-              <w:cnfStyle w:val="000000100000" w:firstRow="0" w:lastRow="0" w:firstColumn="0" w:lastColumn="0" w:oddVBand="0" w:evenVBand="0" w:oddHBand="1" w:evenHBand="0" w:firstRowFirstColumn="0" w:firstRowLastColumn="0" w:lastRowFirstColumn="0" w:lastRowLastColumn="0"/>
-            </w:pPr>
-          </w:p>
-        </w:tc>
-        <w:tc>
-          <w:tcPr>
-            <w:tcW w:w="834" w:type="pct"/>
-          </w:tcPr>
-          <w:p>
-            <w:pPr>
-              <w:cnfStyle w:val="000000100000" w:firstRow="0" w:lastRow="0" w:firstColumn="0" w:lastColumn="0" w:oddVBand="0" w:evenVBand="0" w:oddHBand="1" w:evenHBand="0" w:firstRowFirstColumn="0" w:firstRowLastColumn="0" w:lastRowFirstColumn="0" w:lastRowLastColumn="0"/>
-            </w:pPr>
-            <w:r>
-              <w:t xml:space="preserve">Sera adéquat pour faire un frontend pour les utilisateurs qui se mélange bien à </w:t>
-            </w:r>
-            <w:proofErr w:type="spellStart"/>
-            <w:r>
-              <w:t>bootstrap</w:t>
-            </w:r>
-            <w:proofErr w:type="spellEnd"/>
-            <w:r>
-              <w:t xml:space="preserve"> pour faire un site web attrayant héberger sur le VPS</w:t>
-            </w:r>
           </w:p>
         </w:tc>
       </w:tr>
@@ -2751,715 +3613,9 @@
     <w:p/>
     <w:p>
       <w:pPr>
-        <w:pStyle w:val="Titre2"/>
-      </w:pPr>
-      <w:bookmarkStart w:id="5" w:name="_Toc144118373"/>
-      <w:r>
-        <w:lastRenderedPageBreak/>
-        <w:t>Environnement de développement</w:t>
-      </w:r>
-      <w:bookmarkEnd w:id="5"/>
-    </w:p>
-    <w:p>
-      <w:r>
-        <w:t>Pour développer l</w:t>
-      </w:r>
-      <w:r>
-        <w:t xml:space="preserve">e logiciel </w:t>
-      </w:r>
-      <w:r>
-        <w:t>répondant au besoin, quel</w:t>
-      </w:r>
-      <w:r>
-        <w:t>s</w:t>
-      </w:r>
-      <w:r>
-        <w:t xml:space="preserve"> </w:t>
-      </w:r>
-      <w:r>
-        <w:t>outils</w:t>
-      </w:r>
-      <w:r>
-        <w:t xml:space="preserve"> </w:t>
-      </w:r>
-      <w:r>
-        <w:t xml:space="preserve">ou processus </w:t>
-      </w:r>
-      <w:r>
-        <w:t>de développement serai</w:t>
-      </w:r>
-      <w:r>
-        <w:t>en</w:t>
-      </w:r>
-      <w:r>
-        <w:t xml:space="preserve">t </w:t>
-      </w:r>
-      <w:r>
-        <w:t>utiles</w:t>
-      </w:r>
-      <w:r>
-        <w:t xml:space="preserve"> ou nécessaires</w:t>
-      </w:r>
-      <w:r>
-        <w:t>?</w:t>
-      </w:r>
-      <w:r>
-        <w:br/>
-      </w:r>
-      <w:r>
-        <w:t>Certaines plateformes nécessitent parfois l’utilisation de logiciels spécifiques pour le développement d’application</w:t>
-      </w:r>
-      <w:r>
-        <w:t>s</w:t>
-      </w:r>
-      <w:r>
-        <w:t>; Si c’est le cas, il faut les identifier ici.</w:t>
-      </w:r>
-    </w:p>
-    <w:tbl>
-      <w:tblPr>
-        <w:tblStyle w:val="TableauGrille4-Accentuation5"/>
-        <w:tblW w:w="5000" w:type="pct"/>
-        <w:tblLook w:val="04A0" w:firstRow="1" w:lastRow="0" w:firstColumn="1" w:lastColumn="0" w:noHBand="0" w:noVBand="1"/>
-      </w:tblPr>
-      <w:tblGrid>
-        <w:gridCol w:w="2877"/>
-        <w:gridCol w:w="2877"/>
-        <w:gridCol w:w="2881"/>
-        <w:gridCol w:w="2877"/>
-        <w:gridCol w:w="2877"/>
-        <w:gridCol w:w="2881"/>
-      </w:tblGrid>
-      <w:tr>
-        <w:trPr>
-          <w:cnfStyle w:val="100000000000" w:firstRow="1" w:lastRow="0" w:firstColumn="0" w:lastColumn="0" w:oddVBand="0" w:evenVBand="0" w:oddHBand="0" w:evenHBand="0" w:firstRowFirstColumn="0" w:firstRowLastColumn="0" w:lastRowFirstColumn="0" w:lastRowLastColumn="0"/>
-        </w:trPr>
-        <w:tc>
-          <w:tcPr>
-            <w:cnfStyle w:val="001000000000" w:firstRow="0" w:lastRow="0" w:firstColumn="1" w:lastColumn="0" w:oddVBand="0" w:evenVBand="0" w:oddHBand="0" w:evenHBand="0" w:firstRowFirstColumn="0" w:firstRowLastColumn="0" w:lastRowFirstColumn="0" w:lastRowLastColumn="0"/>
-            <w:tcW w:w="833" w:type="pct"/>
-          </w:tcPr>
-          <w:p>
-            <w:pPr>
-              <w:spacing w:line="259" w:lineRule="auto"/>
-            </w:pPr>
-            <w:r>
-              <w:t>Nom</w:t>
-            </w:r>
-            <w:r>
-              <w:t xml:space="preserve"> de la technologie</w:t>
-            </w:r>
-          </w:p>
-        </w:tc>
-        <w:tc>
-          <w:tcPr>
-            <w:tcW w:w="833" w:type="pct"/>
-          </w:tcPr>
-          <w:p>
-            <w:pPr>
-              <w:spacing w:line="259" w:lineRule="auto"/>
-              <w:cnfStyle w:val="100000000000" w:firstRow="1" w:lastRow="0" w:firstColumn="0" w:lastColumn="0" w:oddVBand="0" w:evenVBand="0" w:oddHBand="0" w:evenHBand="0" w:firstRowFirstColumn="0" w:firstRowLastColumn="0" w:lastRowFirstColumn="0" w:lastRowLastColumn="0"/>
-            </w:pPr>
-            <w:r>
-              <w:t>Description</w:t>
-            </w:r>
-            <w:r>
-              <w:t xml:space="preserve"> sommaire</w:t>
-            </w:r>
-          </w:p>
-        </w:tc>
-        <w:tc>
-          <w:tcPr>
-            <w:tcW w:w="834" w:type="pct"/>
-          </w:tcPr>
-          <w:p>
-            <w:pPr>
-              <w:spacing w:line="259" w:lineRule="auto"/>
-              <w:cnfStyle w:val="100000000000" w:firstRow="1" w:lastRow="0" w:firstColumn="0" w:lastColumn="0" w:oddVBand="0" w:evenVBand="0" w:oddHBand="0" w:evenHBand="0" w:firstRowFirstColumn="0" w:firstRowLastColumn="0" w:lastRowFirstColumn="0" w:lastRowLastColumn="0"/>
-            </w:pPr>
-            <w:r>
-              <w:t>Avantages</w:t>
-            </w:r>
-          </w:p>
-        </w:tc>
-        <w:tc>
-          <w:tcPr>
-            <w:tcW w:w="833" w:type="pct"/>
-          </w:tcPr>
-          <w:p>
-            <w:pPr>
-              <w:spacing w:line="259" w:lineRule="auto"/>
-              <w:cnfStyle w:val="100000000000" w:firstRow="1" w:lastRow="0" w:firstColumn="0" w:lastColumn="0" w:oddVBand="0" w:evenVBand="0" w:oddHBand="0" w:evenHBand="0" w:firstRowFirstColumn="0" w:firstRowLastColumn="0" w:lastRowFirstColumn="0" w:lastRowLastColumn="0"/>
-            </w:pPr>
-            <w:r>
-              <w:t>Limitations</w:t>
-            </w:r>
-            <w:r>
-              <w:t xml:space="preserve"> ou </w:t>
-            </w:r>
-            <w:r>
-              <w:t>incertitudes</w:t>
-            </w:r>
-          </w:p>
-        </w:tc>
-        <w:tc>
-          <w:tcPr>
-            <w:tcW w:w="833" w:type="pct"/>
-          </w:tcPr>
-          <w:p>
-            <w:pPr>
-              <w:spacing w:line="259" w:lineRule="auto"/>
-              <w:cnfStyle w:val="100000000000" w:firstRow="1" w:lastRow="0" w:firstColumn="0" w:lastColumn="0" w:oddVBand="0" w:evenVBand="0" w:oddHBand="0" w:evenHBand="0" w:firstRowFirstColumn="0" w:firstRowLastColumn="0" w:lastRowFirstColumn="0" w:lastRowLastColumn="0"/>
-            </w:pPr>
-            <w:r>
-              <w:t>Références et exemples</w:t>
-            </w:r>
-          </w:p>
-        </w:tc>
-        <w:tc>
-          <w:tcPr>
-            <w:tcW w:w="834" w:type="pct"/>
-          </w:tcPr>
-          <w:p>
-            <w:pPr>
-              <w:spacing w:line="259" w:lineRule="auto"/>
-              <w:cnfStyle w:val="100000000000" w:firstRow="1" w:lastRow="0" w:firstColumn="0" w:lastColumn="0" w:oddVBand="0" w:evenVBand="0" w:oddHBand="0" w:evenHBand="0" w:firstRowFirstColumn="0" w:firstRowLastColumn="0" w:lastRowFirstColumn="0" w:lastRowLastColumn="0"/>
-            </w:pPr>
-            <w:r>
-              <w:t>Analyse</w:t>
-            </w:r>
-            <w:r>
-              <w:t xml:space="preserve"> (votre jugement)</w:t>
-            </w:r>
-          </w:p>
-        </w:tc>
-      </w:tr>
-      <w:tr>
-        <w:trPr>
-          <w:cnfStyle w:val="000000100000" w:firstRow="0" w:lastRow="0" w:firstColumn="0" w:lastColumn="0" w:oddVBand="0" w:evenVBand="0" w:oddHBand="1" w:evenHBand="0" w:firstRowFirstColumn="0" w:firstRowLastColumn="0" w:lastRowFirstColumn="0" w:lastRowLastColumn="0"/>
-        </w:trPr>
-        <w:tc>
-          <w:tcPr>
-            <w:cnfStyle w:val="001000000000" w:firstRow="0" w:lastRow="0" w:firstColumn="1" w:lastColumn="0" w:oddVBand="0" w:evenVBand="0" w:oddHBand="0" w:evenHBand="0" w:firstRowFirstColumn="0" w:firstRowLastColumn="0" w:lastRowFirstColumn="0" w:lastRowLastColumn="0"/>
-            <w:tcW w:w="833" w:type="pct"/>
-          </w:tcPr>
-          <w:p>
-            <w:pPr>
-              <w:spacing w:line="259" w:lineRule="auto"/>
-            </w:pPr>
-            <w:r>
-              <w:t>Visual Studio Code</w:t>
-            </w:r>
-          </w:p>
-        </w:tc>
-        <w:tc>
-          <w:tcPr>
-            <w:tcW w:w="833" w:type="pct"/>
-          </w:tcPr>
-          <w:p>
-            <w:pPr>
-              <w:spacing w:line="259" w:lineRule="auto"/>
-              <w:cnfStyle w:val="000000100000" w:firstRow="0" w:lastRow="0" w:firstColumn="0" w:lastColumn="0" w:oddVBand="0" w:evenVBand="0" w:oddHBand="1" w:evenHBand="0" w:firstRowFirstColumn="0" w:firstRowLastColumn="0" w:lastRowFirstColumn="0" w:lastRowLastColumn="0"/>
-            </w:pPr>
-            <w:r>
-              <w:t>VS Code est un environnement de développement intégré (IDE) léger et open source, développé par Microsoft, qui offre des fonctionnalités avancées pour la programmation et la gestion de projets informatiques.</w:t>
-            </w:r>
-          </w:p>
-        </w:tc>
-        <w:tc>
-          <w:tcPr>
-            <w:tcW w:w="834" w:type="pct"/>
-          </w:tcPr>
-          <w:p>
-            <w:pPr>
-              <w:pStyle w:val="Paragraphedeliste"/>
-              <w:numPr>
-                <w:ilvl w:val="0"/>
-                <w:numId w:val="11"/>
-              </w:numPr>
-              <w:cnfStyle w:val="000000100000" w:firstRow="0" w:lastRow="0" w:firstColumn="0" w:lastColumn="0" w:oddVBand="0" w:evenVBand="0" w:oddHBand="1" w:evenHBand="0" w:firstRowFirstColumn="0" w:firstRowLastColumn="0" w:lastRowFirstColumn="0" w:lastRowLastColumn="0"/>
-            </w:pPr>
-            <w:r>
-              <w:t>Légèreté et Rapidité</w:t>
-            </w:r>
-          </w:p>
-          <w:p>
-            <w:pPr>
-              <w:pStyle w:val="Paragraphedeliste"/>
-              <w:numPr>
-                <w:ilvl w:val="0"/>
-                <w:numId w:val="11"/>
-              </w:numPr>
-              <w:cnfStyle w:val="000000100000" w:firstRow="0" w:lastRow="0" w:firstColumn="0" w:lastColumn="0" w:oddVBand="0" w:evenVBand="0" w:oddHBand="1" w:evenHBand="0" w:firstRowFirstColumn="0" w:firstRowLastColumn="0" w:lastRowFirstColumn="0" w:lastRowLastColumn="0"/>
-            </w:pPr>
-            <w:r>
-              <w:t>Extensions Puissantes</w:t>
-            </w:r>
-            <w:r>
-              <w:t xml:space="preserve"> et en abondances</w:t>
-            </w:r>
-          </w:p>
-          <w:p>
-            <w:pPr>
-              <w:pStyle w:val="Paragraphedeliste"/>
-              <w:numPr>
-                <w:ilvl w:val="0"/>
-                <w:numId w:val="11"/>
-              </w:numPr>
-              <w:cnfStyle w:val="000000100000" w:firstRow="0" w:lastRow="0" w:firstColumn="0" w:lastColumn="0" w:oddVBand="0" w:evenVBand="0" w:oddHBand="1" w:evenHBand="0" w:firstRowFirstColumn="0" w:firstRowLastColumn="0" w:lastRowFirstColumn="0" w:lastRowLastColumn="0"/>
-            </w:pPr>
-            <w:r>
-              <w:t>Intégration Git</w:t>
-            </w:r>
-          </w:p>
-          <w:p>
-            <w:pPr>
-              <w:pStyle w:val="Paragraphedeliste"/>
-              <w:numPr>
-                <w:ilvl w:val="0"/>
-                <w:numId w:val="11"/>
-              </w:numPr>
-              <w:cnfStyle w:val="000000100000" w:firstRow="0" w:lastRow="0" w:firstColumn="0" w:lastColumn="0" w:oddVBand="0" w:evenVBand="0" w:oddHBand="1" w:evenHBand="0" w:firstRowFirstColumn="0" w:firstRowLastColumn="0" w:lastRowFirstColumn="0" w:lastRowLastColumn="0"/>
-            </w:pPr>
-            <w:r>
-              <w:t>Modification de l’IDE selon les préférences</w:t>
-            </w:r>
-          </w:p>
-          <w:p>
-            <w:pPr>
-              <w:pStyle w:val="Paragraphedeliste"/>
-              <w:numPr>
-                <w:ilvl w:val="0"/>
-                <w:numId w:val="11"/>
-              </w:numPr>
-              <w:cnfStyle w:val="000000100000" w:firstRow="0" w:lastRow="0" w:firstColumn="0" w:lastColumn="0" w:oddVBand="0" w:evenVBand="0" w:oddHBand="1" w:evenHBand="0" w:firstRowFirstColumn="0" w:firstRowLastColumn="0" w:lastRowFirstColumn="0" w:lastRowLastColumn="0"/>
-            </w:pPr>
-            <w:r>
-              <w:t>Permet d’avoir un code style pareil pour tous</w:t>
-            </w:r>
-          </w:p>
-        </w:tc>
-        <w:tc>
-          <w:tcPr>
-            <w:tcW w:w="833" w:type="pct"/>
-          </w:tcPr>
-          <w:p>
-            <w:pPr>
-              <w:pStyle w:val="Paragraphedeliste"/>
-              <w:numPr>
-                <w:ilvl w:val="0"/>
-                <w:numId w:val="11"/>
-              </w:numPr>
-              <w:cnfStyle w:val="000000100000" w:firstRow="0" w:lastRow="0" w:firstColumn="0" w:lastColumn="0" w:oddVBand="0" w:evenVBand="0" w:oddHBand="1" w:evenHBand="0" w:firstRowFirstColumn="0" w:firstRowLastColumn="0" w:lastRowFirstColumn="0" w:lastRowLastColumn="0"/>
-            </w:pPr>
-            <w:r>
-              <w:t>Consommation de Mémoire</w:t>
-            </w:r>
-            <w:r>
-              <w:t xml:space="preserve"> peut être parfois haute si les projets ont beaucoup à charger</w:t>
-            </w:r>
-          </w:p>
-        </w:tc>
-        <w:tc>
-          <w:tcPr>
-            <w:tcW w:w="833" w:type="pct"/>
-          </w:tcPr>
-          <w:p>
-            <w:pPr>
-              <w:spacing w:line="259" w:lineRule="auto"/>
-              <w:cnfStyle w:val="000000100000" w:firstRow="0" w:lastRow="0" w:firstColumn="0" w:lastColumn="0" w:oddVBand="0" w:evenVBand="0" w:oddHBand="1" w:evenHBand="0" w:firstRowFirstColumn="0" w:firstRowLastColumn="0" w:lastRowFirstColumn="0" w:lastRowLastColumn="0"/>
-            </w:pPr>
-          </w:p>
-        </w:tc>
-        <w:tc>
-          <w:tcPr>
-            <w:tcW w:w="834" w:type="pct"/>
-          </w:tcPr>
-          <w:p>
-            <w:pPr>
-              <w:spacing w:line="259" w:lineRule="auto"/>
-              <w:cnfStyle w:val="000000100000" w:firstRow="0" w:lastRow="0" w:firstColumn="0" w:lastColumn="0" w:oddVBand="0" w:evenVBand="0" w:oddHBand="1" w:evenHBand="0" w:firstRowFirstColumn="0" w:firstRowLastColumn="0" w:lastRowFirstColumn="0" w:lastRowLastColumn="0"/>
-            </w:pPr>
-            <w:proofErr w:type="gramStart"/>
-            <w:r>
-              <w:t>IDE gratuit</w:t>
-            </w:r>
-            <w:proofErr w:type="gramEnd"/>
-            <w:r>
-              <w:t xml:space="preserve"> qui peut nous mettre un code style et qui comprend très bien Python, </w:t>
-            </w:r>
-            <w:proofErr w:type="spellStart"/>
-            <w:r>
-              <w:t>Angular</w:t>
-            </w:r>
-            <w:proofErr w:type="spellEnd"/>
-            <w:r>
-              <w:t xml:space="preserve">, </w:t>
-            </w:r>
-            <w:proofErr w:type="spellStart"/>
-            <w:r>
-              <w:t>TypeScript</w:t>
-            </w:r>
-            <w:proofErr w:type="spellEnd"/>
-            <w:r>
-              <w:t xml:space="preserve"> et intègre même Git pour que le projet soit à jour</w:t>
-            </w:r>
-          </w:p>
-        </w:tc>
-      </w:tr>
-      <w:tr>
-        <w:tc>
-          <w:tcPr>
-            <w:cnfStyle w:val="001000000000" w:firstRow="0" w:lastRow="0" w:firstColumn="1" w:lastColumn="0" w:oddVBand="0" w:evenVBand="0" w:oddHBand="0" w:evenHBand="0" w:firstRowFirstColumn="0" w:firstRowLastColumn="0" w:lastRowFirstColumn="0" w:lastRowLastColumn="0"/>
-            <w:tcW w:w="833" w:type="pct"/>
-          </w:tcPr>
-          <w:p>
-            <w:r>
-              <w:t>Git</w:t>
-            </w:r>
-          </w:p>
-        </w:tc>
-        <w:tc>
-          <w:tcPr>
-            <w:tcW w:w="833" w:type="pct"/>
-          </w:tcPr>
-          <w:p>
-            <w:pPr>
-              <w:cnfStyle w:val="000000000000" w:firstRow="0" w:lastRow="0" w:firstColumn="0" w:lastColumn="0" w:oddVBand="0" w:evenVBand="0" w:oddHBand="0" w:evenHBand="0" w:firstRowFirstColumn="0" w:firstRowLastColumn="0" w:lastRowFirstColumn="0" w:lastRowLastColumn="0"/>
-            </w:pPr>
-            <w:r>
-              <w:t>Git est un système de gestion de version distribué largement utilisé qui permet de suivre les modifications apportées à un ensemble de fichiers, facilitant la collaboration, la gestion des versions et le suivi des changements dans un projet de développement.</w:t>
-            </w:r>
-          </w:p>
-        </w:tc>
-        <w:tc>
-          <w:tcPr>
-            <w:tcW w:w="834" w:type="pct"/>
-          </w:tcPr>
-          <w:p>
-            <w:pPr>
-              <w:pStyle w:val="Paragraphedeliste"/>
-              <w:numPr>
-                <w:ilvl w:val="0"/>
-                <w:numId w:val="12"/>
-              </w:numPr>
-              <w:cnfStyle w:val="000000000000" w:firstRow="0" w:lastRow="0" w:firstColumn="0" w:lastColumn="0" w:oddVBand="0" w:evenVBand="0" w:oddHBand="0" w:evenHBand="0" w:firstRowFirstColumn="0" w:firstRowLastColumn="0" w:lastRowFirstColumn="0" w:lastRowLastColumn="0"/>
-            </w:pPr>
-            <w:r>
-              <w:t>Gestion de Versions Efficace</w:t>
-            </w:r>
-          </w:p>
-          <w:p>
-            <w:pPr>
-              <w:pStyle w:val="Paragraphedeliste"/>
-              <w:numPr>
-                <w:ilvl w:val="0"/>
-                <w:numId w:val="12"/>
-              </w:numPr>
-              <w:cnfStyle w:val="000000000000" w:firstRow="0" w:lastRow="0" w:firstColumn="0" w:lastColumn="0" w:oddVBand="0" w:evenVBand="0" w:oddHBand="0" w:evenHBand="0" w:firstRowFirstColumn="0" w:firstRowLastColumn="0" w:lastRowFirstColumn="0" w:lastRowLastColumn="0"/>
-            </w:pPr>
-            <w:r>
-              <w:t>Chaque</w:t>
-            </w:r>
-            <w:r>
-              <w:t xml:space="preserve"> développeur a une copie complète de l'historique du projet. Cela favorise la flexibilité, la résilience et la possibilité de travailler hors ligne.</w:t>
-            </w:r>
-          </w:p>
-        </w:tc>
-        <w:tc>
-          <w:tcPr>
-            <w:tcW w:w="833" w:type="pct"/>
-          </w:tcPr>
-          <w:p>
-            <w:pPr>
-              <w:pStyle w:val="Paragraphedeliste"/>
-              <w:numPr>
-                <w:ilvl w:val="0"/>
-                <w:numId w:val="12"/>
-              </w:numPr>
-              <w:cnfStyle w:val="000000000000" w:firstRow="0" w:lastRow="0" w:firstColumn="0" w:lastColumn="0" w:oddVBand="0" w:evenVBand="0" w:oddHBand="0" w:evenHBand="0" w:firstRowFirstColumn="0" w:firstRowLastColumn="0" w:lastRowFirstColumn="0" w:lastRowLastColumn="0"/>
-            </w:pPr>
-            <w:r>
-              <w:t xml:space="preserve">Git </w:t>
-            </w:r>
-            <w:proofErr w:type="gramStart"/>
-            <w:r>
-              <w:t>peut être</w:t>
-            </w:r>
-            <w:proofErr w:type="gramEnd"/>
-            <w:r>
-              <w:t xml:space="preserve"> assez dure a comprendre au départ pour les nouveaux utilisateurs</w:t>
-            </w:r>
-          </w:p>
-        </w:tc>
-        <w:tc>
-          <w:tcPr>
-            <w:tcW w:w="833" w:type="pct"/>
-          </w:tcPr>
-          <w:p>
-            <w:pPr>
-              <w:cnfStyle w:val="000000000000" w:firstRow="0" w:lastRow="0" w:firstColumn="0" w:lastColumn="0" w:oddVBand="0" w:evenVBand="0" w:oddHBand="0" w:evenHBand="0" w:firstRowFirstColumn="0" w:firstRowLastColumn="0" w:lastRowFirstColumn="0" w:lastRowLastColumn="0"/>
-            </w:pPr>
-          </w:p>
-        </w:tc>
-        <w:tc>
-          <w:tcPr>
-            <w:tcW w:w="834" w:type="pct"/>
-          </w:tcPr>
-          <w:p>
-            <w:pPr>
-              <w:cnfStyle w:val="000000000000" w:firstRow="0" w:lastRow="0" w:firstColumn="0" w:lastColumn="0" w:oddVBand="0" w:evenVBand="0" w:oddHBand="0" w:evenHBand="0" w:firstRowFirstColumn="0" w:firstRowLastColumn="0" w:lastRowFirstColumn="0" w:lastRowLastColumn="0"/>
-            </w:pPr>
-            <w:r>
-              <w:t xml:space="preserve">Permet à l’équipe de travailler sur des parties différentes du projet asynchrone ou </w:t>
-            </w:r>
-            <w:r>
-              <w:t xml:space="preserve">synchronisé et de le réunir en un à la fin du projet. Permet aussi de garder </w:t>
-            </w:r>
-            <w:proofErr w:type="gramStart"/>
-            <w:r>
-              <w:t>les anciennes version</w:t>
-            </w:r>
-            <w:proofErr w:type="gramEnd"/>
-            <w:r>
-              <w:t xml:space="preserve"> et de rester à jour.</w:t>
-            </w:r>
-          </w:p>
-        </w:tc>
-      </w:tr>
-    </w:tbl>
-    <w:p/>
-    <w:p>
-      <w:pPr>
-        <w:pStyle w:val="Titre2"/>
-      </w:pPr>
-      <w:bookmarkStart w:id="6" w:name="_Toc144118374"/>
-      <w:r>
-        <w:t>Autres technologies</w:t>
-      </w:r>
-      <w:bookmarkEnd w:id="6"/>
-    </w:p>
-    <w:p>
-      <w:r>
-        <w:t>Y a-t-il d’autres catégories de technologies qui sont nécessaire</w:t>
-      </w:r>
-      <w:r>
-        <w:t>s</w:t>
-      </w:r>
-      <w:r>
-        <w:t xml:space="preserve"> </w:t>
-      </w:r>
-      <w:r>
-        <w:t xml:space="preserve">ou utiles </w:t>
-      </w:r>
-      <w:r>
-        <w:t>pour répondre au besoin?</w:t>
-      </w:r>
-      <w:r>
-        <w:br/>
-        <w:t xml:space="preserve">Par exemple, des </w:t>
-      </w:r>
-      <w:r>
-        <w:t>logiciels ou applications existantes qui couvrent déjà la majorité des fonctionnalités répondant au besoin.</w:t>
-      </w:r>
-    </w:p>
-    <w:tbl>
-      <w:tblPr>
-        <w:tblStyle w:val="TableauGrille4-Accentuation5"/>
-        <w:tblW w:w="5000" w:type="pct"/>
-        <w:tblLook w:val="04A0" w:firstRow="1" w:lastRow="0" w:firstColumn="1" w:lastColumn="0" w:noHBand="0" w:noVBand="1"/>
-      </w:tblPr>
-      <w:tblGrid>
-        <w:gridCol w:w="2877"/>
-        <w:gridCol w:w="2877"/>
-        <w:gridCol w:w="2881"/>
-        <w:gridCol w:w="2877"/>
-        <w:gridCol w:w="2877"/>
-        <w:gridCol w:w="2881"/>
-      </w:tblGrid>
-      <w:tr>
-        <w:trPr>
-          <w:cnfStyle w:val="100000000000" w:firstRow="1" w:lastRow="0" w:firstColumn="0" w:lastColumn="0" w:oddVBand="0" w:evenVBand="0" w:oddHBand="0" w:evenHBand="0" w:firstRowFirstColumn="0" w:firstRowLastColumn="0" w:lastRowFirstColumn="0" w:lastRowLastColumn="0"/>
-        </w:trPr>
-        <w:tc>
-          <w:tcPr>
-            <w:cnfStyle w:val="001000000000" w:firstRow="0" w:lastRow="0" w:firstColumn="1" w:lastColumn="0" w:oddVBand="0" w:evenVBand="0" w:oddHBand="0" w:evenHBand="0" w:firstRowFirstColumn="0" w:firstRowLastColumn="0" w:lastRowFirstColumn="0" w:lastRowLastColumn="0"/>
-            <w:tcW w:w="833" w:type="pct"/>
-          </w:tcPr>
-          <w:p>
-            <w:pPr>
-              <w:spacing w:line="259" w:lineRule="auto"/>
-            </w:pPr>
-            <w:r>
-              <w:t>Nom</w:t>
-            </w:r>
-            <w:r>
-              <w:t xml:space="preserve"> de la technologie</w:t>
-            </w:r>
-          </w:p>
-        </w:tc>
-        <w:tc>
-          <w:tcPr>
-            <w:tcW w:w="833" w:type="pct"/>
-          </w:tcPr>
-          <w:p>
-            <w:pPr>
-              <w:spacing w:line="259" w:lineRule="auto"/>
-              <w:cnfStyle w:val="100000000000" w:firstRow="1" w:lastRow="0" w:firstColumn="0" w:lastColumn="0" w:oddVBand="0" w:evenVBand="0" w:oddHBand="0" w:evenHBand="0" w:firstRowFirstColumn="0" w:firstRowLastColumn="0" w:lastRowFirstColumn="0" w:lastRowLastColumn="0"/>
-            </w:pPr>
-            <w:r>
-              <w:t>Description</w:t>
-            </w:r>
-            <w:r>
-              <w:t xml:space="preserve"> sommaire</w:t>
-            </w:r>
-          </w:p>
-        </w:tc>
-        <w:tc>
-          <w:tcPr>
-            <w:tcW w:w="834" w:type="pct"/>
-          </w:tcPr>
-          <w:p>
-            <w:pPr>
-              <w:spacing w:line="259" w:lineRule="auto"/>
-              <w:cnfStyle w:val="100000000000" w:firstRow="1" w:lastRow="0" w:firstColumn="0" w:lastColumn="0" w:oddVBand="0" w:evenVBand="0" w:oddHBand="0" w:evenHBand="0" w:firstRowFirstColumn="0" w:firstRowLastColumn="0" w:lastRowFirstColumn="0" w:lastRowLastColumn="0"/>
-            </w:pPr>
-            <w:r>
-              <w:t>Avantages</w:t>
-            </w:r>
-          </w:p>
-        </w:tc>
-        <w:tc>
-          <w:tcPr>
-            <w:tcW w:w="833" w:type="pct"/>
-          </w:tcPr>
-          <w:p>
-            <w:pPr>
-              <w:spacing w:line="259" w:lineRule="auto"/>
-              <w:cnfStyle w:val="100000000000" w:firstRow="1" w:lastRow="0" w:firstColumn="0" w:lastColumn="0" w:oddVBand="0" w:evenVBand="0" w:oddHBand="0" w:evenHBand="0" w:firstRowFirstColumn="0" w:firstRowLastColumn="0" w:lastRowFirstColumn="0" w:lastRowLastColumn="0"/>
-            </w:pPr>
-            <w:r>
-              <w:t>Limitations</w:t>
-            </w:r>
-            <w:r>
-              <w:t xml:space="preserve"> ou </w:t>
-            </w:r>
-            <w:r>
-              <w:t>incertitudes</w:t>
-            </w:r>
-          </w:p>
-        </w:tc>
-        <w:tc>
-          <w:tcPr>
-            <w:tcW w:w="833" w:type="pct"/>
-          </w:tcPr>
-          <w:p>
-            <w:pPr>
-              <w:spacing w:line="259" w:lineRule="auto"/>
-              <w:cnfStyle w:val="100000000000" w:firstRow="1" w:lastRow="0" w:firstColumn="0" w:lastColumn="0" w:oddVBand="0" w:evenVBand="0" w:oddHBand="0" w:evenHBand="0" w:firstRowFirstColumn="0" w:firstRowLastColumn="0" w:lastRowFirstColumn="0" w:lastRowLastColumn="0"/>
-            </w:pPr>
-            <w:r>
-              <w:t>Références et exemples</w:t>
-            </w:r>
-          </w:p>
-        </w:tc>
-        <w:tc>
-          <w:tcPr>
-            <w:tcW w:w="834" w:type="pct"/>
-          </w:tcPr>
-          <w:p>
-            <w:pPr>
-              <w:spacing w:line="259" w:lineRule="auto"/>
-              <w:cnfStyle w:val="100000000000" w:firstRow="1" w:lastRow="0" w:firstColumn="0" w:lastColumn="0" w:oddVBand="0" w:evenVBand="0" w:oddHBand="0" w:evenHBand="0" w:firstRowFirstColumn="0" w:firstRowLastColumn="0" w:lastRowFirstColumn="0" w:lastRowLastColumn="0"/>
-            </w:pPr>
-            <w:r>
-              <w:t>Analyse</w:t>
-            </w:r>
-            <w:r>
-              <w:t xml:space="preserve"> (votre jugement)</w:t>
-            </w:r>
-          </w:p>
-        </w:tc>
-      </w:tr>
-      <w:tr>
-        <w:trPr>
-          <w:cnfStyle w:val="000000100000" w:firstRow="0" w:lastRow="0" w:firstColumn="0" w:lastColumn="0" w:oddVBand="0" w:evenVBand="0" w:oddHBand="1" w:evenHBand="0" w:firstRowFirstColumn="0" w:firstRowLastColumn="0" w:lastRowFirstColumn="0" w:lastRowLastColumn="0"/>
-        </w:trPr>
-        <w:tc>
-          <w:tcPr>
-            <w:cnfStyle w:val="001000000000" w:firstRow="0" w:lastRow="0" w:firstColumn="1" w:lastColumn="0" w:oddVBand="0" w:evenVBand="0" w:oddHBand="0" w:evenHBand="0" w:firstRowFirstColumn="0" w:firstRowLastColumn="0" w:lastRowFirstColumn="0" w:lastRowLastColumn="0"/>
-            <w:tcW w:w="833" w:type="pct"/>
-          </w:tcPr>
-          <w:p>
-            <w:pPr>
-              <w:spacing w:line="259" w:lineRule="auto"/>
-            </w:pPr>
-          </w:p>
-        </w:tc>
-        <w:tc>
-          <w:tcPr>
-            <w:tcW w:w="833" w:type="pct"/>
-          </w:tcPr>
-          <w:p>
-            <w:pPr>
-              <w:spacing w:line="259" w:lineRule="auto"/>
-              <w:cnfStyle w:val="000000100000" w:firstRow="0" w:lastRow="0" w:firstColumn="0" w:lastColumn="0" w:oddVBand="0" w:evenVBand="0" w:oddHBand="1" w:evenHBand="0" w:firstRowFirstColumn="0" w:firstRowLastColumn="0" w:lastRowFirstColumn="0" w:lastRowLastColumn="0"/>
-            </w:pPr>
-          </w:p>
-        </w:tc>
-        <w:tc>
-          <w:tcPr>
-            <w:tcW w:w="834" w:type="pct"/>
-          </w:tcPr>
-          <w:p>
-            <w:pPr>
-              <w:spacing w:line="259" w:lineRule="auto"/>
-              <w:cnfStyle w:val="000000100000" w:firstRow="0" w:lastRow="0" w:firstColumn="0" w:lastColumn="0" w:oddVBand="0" w:evenVBand="0" w:oddHBand="1" w:evenHBand="0" w:firstRowFirstColumn="0" w:firstRowLastColumn="0" w:lastRowFirstColumn="0" w:lastRowLastColumn="0"/>
-            </w:pPr>
-          </w:p>
-        </w:tc>
-        <w:tc>
-          <w:tcPr>
-            <w:tcW w:w="833" w:type="pct"/>
-          </w:tcPr>
-          <w:p>
-            <w:pPr>
-              <w:spacing w:line="259" w:lineRule="auto"/>
-              <w:cnfStyle w:val="000000100000" w:firstRow="0" w:lastRow="0" w:firstColumn="0" w:lastColumn="0" w:oddVBand="0" w:evenVBand="0" w:oddHBand="1" w:evenHBand="0" w:firstRowFirstColumn="0" w:firstRowLastColumn="0" w:lastRowFirstColumn="0" w:lastRowLastColumn="0"/>
-            </w:pPr>
-          </w:p>
-        </w:tc>
-        <w:tc>
-          <w:tcPr>
-            <w:tcW w:w="833" w:type="pct"/>
-          </w:tcPr>
-          <w:p>
-            <w:pPr>
-              <w:spacing w:line="259" w:lineRule="auto"/>
-              <w:cnfStyle w:val="000000100000" w:firstRow="0" w:lastRow="0" w:firstColumn="0" w:lastColumn="0" w:oddVBand="0" w:evenVBand="0" w:oddHBand="1" w:evenHBand="0" w:firstRowFirstColumn="0" w:firstRowLastColumn="0" w:lastRowFirstColumn="0" w:lastRowLastColumn="0"/>
-            </w:pPr>
-          </w:p>
-        </w:tc>
-        <w:tc>
-          <w:tcPr>
-            <w:tcW w:w="834" w:type="pct"/>
-          </w:tcPr>
-          <w:p>
-            <w:pPr>
-              <w:spacing w:line="259" w:lineRule="auto"/>
-              <w:cnfStyle w:val="000000100000" w:firstRow="0" w:lastRow="0" w:firstColumn="0" w:lastColumn="0" w:oddVBand="0" w:evenVBand="0" w:oddHBand="1" w:evenHBand="0" w:firstRowFirstColumn="0" w:firstRowLastColumn="0" w:lastRowFirstColumn="0" w:lastRowLastColumn="0"/>
-            </w:pPr>
-          </w:p>
-        </w:tc>
-      </w:tr>
-    </w:tbl>
-    <w:p/>
-    <w:p>
-      <w:pPr>
         <w:pStyle w:val="Titre1"/>
       </w:pPr>
       <w:r>
-        <w:lastRenderedPageBreak/>
         <w:t>Choix</w:t>
       </w:r>
       <w:r>
@@ -3597,6 +3753,7 @@
         <w:ind w:left="360"/>
       </w:pPr>
       <w:r>
+        <w:lastRenderedPageBreak/>
         <w:t>Nous utiliserons OVH Cloud VPS</w:t>
       </w:r>
       <w:r>
@@ -3849,28 +4006,143 @@
       </w:r>
     </w:p>
     <w:p>
-      <w:r>
-        <w:t>(</w:t>
-      </w:r>
-      <w:r>
+      <w:pPr>
         <w:rPr>
-          <w:highlight w:val="yellow"/>
+          <w:i/>
+          <w:iCs/>
         </w:rPr>
-        <w:t>D</w:t>
-      </w:r>
-      <w:r>
-        <w:rPr>
-          <w:highlight w:val="yellow"/>
-        </w:rPr>
-        <w:t>écrivez votre prototype ici</w:t>
-      </w:r>
-      <w:r>
-        <w:t>)</w:t>
-      </w:r>
+      </w:pPr>
     </w:p>
-    <w:p/>
+    <w:p>
+      <w:r>
+        <w:t>Alors, pour tester si les outils que nous avons choisis sont bons pour notre projet de carte thermique des transports à Montréal, voici ce que nous allons faire dans notre petit test. On va se concentrer sur une partie du projet, celle où on récupère les horaires des bus à Montréal et qu'on les affiche sur une carte.</w:t>
+      </w:r>
+    </w:p>
+    <w:p>
+      <w:r>
+        <w:t>Prototype : On fait une carte avec tous les arrêts de bus à Montréal</w:t>
+      </w:r>
+    </w:p>
+    <w:p>
+      <w:r>
+        <w:t>Description :</w:t>
+      </w:r>
+    </w:p>
+    <w:p>
+      <w:pPr>
+        <w:pStyle w:val="Paragraphedeliste"/>
+        <w:numPr>
+          <w:ilvl w:val="0"/>
+          <w:numId w:val="14"/>
+        </w:numPr>
+      </w:pPr>
+      <w:r>
+        <w:t>On récupère des données : On utilise l'API de la STM pour attraper toutes les infos dont on a besoin sur les horaires des bus et où sont les arrêts à Montréal.</w:t>
+      </w:r>
+    </w:p>
+    <w:p>
+      <w:pPr>
+        <w:pStyle w:val="Paragraphedeliste"/>
+        <w:numPr>
+          <w:ilvl w:val="0"/>
+          <w:numId w:val="14"/>
+        </w:numPr>
+      </w:pPr>
+      <w:r>
+        <w:t xml:space="preserve">On travaille ces données : Avec Python et </w:t>
+      </w:r>
+      <w:proofErr w:type="spellStart"/>
+      <w:r>
+        <w:t>GeoPandas</w:t>
+      </w:r>
+      <w:proofErr w:type="spellEnd"/>
+      <w:r>
+        <w:t>, on organise ces données pour qu'elles soient bien utilisables. En gros, on les met en ordre.</w:t>
+      </w:r>
+    </w:p>
+    <w:p>
+      <w:pPr>
+        <w:pStyle w:val="Paragraphedeliste"/>
+        <w:numPr>
+          <w:ilvl w:val="0"/>
+          <w:numId w:val="14"/>
+        </w:numPr>
+      </w:pPr>
+      <w:r>
+        <w:t xml:space="preserve">On fait la carte : On se sert de </w:t>
+      </w:r>
+      <w:proofErr w:type="spellStart"/>
+      <w:r>
+        <w:t>Matplotlib</w:t>
+      </w:r>
+      <w:proofErr w:type="spellEnd"/>
+      <w:r>
+        <w:t xml:space="preserve"> ou un autre truc pour créer une belle carte qui montre où sont tous les arrêts de bus à Montréal avec les infos qu'on a récupérées.</w:t>
+      </w:r>
+    </w:p>
+    <w:p>
+      <w:pPr>
+        <w:pStyle w:val="Paragraphedeliste"/>
+        <w:numPr>
+          <w:ilvl w:val="0"/>
+          <w:numId w:val="14"/>
+        </w:numPr>
+      </w:pPr>
+      <w:r>
+        <w:t>On regarde le résultat : On regarde notre super carte dans Visual Studio Code pour voir si tout marche bien</w:t>
+      </w:r>
+      <w:r>
+        <w:t xml:space="preserve"> ou directement sur un site web que l’on crée rapidement</w:t>
+      </w:r>
+      <w:r>
+        <w:t>.</w:t>
+      </w:r>
+    </w:p>
+    <w:p>
+      <w:pPr>
+        <w:pStyle w:val="Paragraphedeliste"/>
+        <w:numPr>
+          <w:ilvl w:val="0"/>
+          <w:numId w:val="0"/>
+        </w:numPr>
+        <w:ind w:left="720"/>
+      </w:pPr>
+    </w:p>
+    <w:p>
+      <w:r>
+        <w:t>Pourquoi on fait ça ? :</w:t>
+      </w:r>
+    </w:p>
+    <w:p>
+      <w:r>
+        <w:lastRenderedPageBreak/>
+        <w:t xml:space="preserve">Ce test nous aide à voir si les outils qu'on a choisis (Python, </w:t>
+      </w:r>
+      <w:proofErr w:type="spellStart"/>
+      <w:r>
+        <w:t>GeoPandas</w:t>
+      </w:r>
+      <w:proofErr w:type="spellEnd"/>
+      <w:r>
+        <w:t xml:space="preserve">, </w:t>
+      </w:r>
+      <w:proofErr w:type="spellStart"/>
+      <w:r>
+        <w:t>Matplotlib</w:t>
+      </w:r>
+      <w:proofErr w:type="spellEnd"/>
+      <w:r>
+        <w:t xml:space="preserve">) marchent bien pour récupérer, organiser et montrer les infos sur les arrêts de bus. On veut surtout être sûr que tout marche bien avant de faire les trucs plus compliqués, comme animer la carte thermique ou faire une interface web cool. Ce petit </w:t>
+      </w:r>
+      <w:r>
+        <w:t>test ne devrait pas</w:t>
+      </w:r>
+      <w:r>
+        <w:t xml:space="preserve"> prendre trop de temps, juste quelques semaines au maximum.</w:t>
+      </w:r>
+    </w:p>
     <w:sectPr>
-      <w:headerReference w:type="default" r:id="rId14"/>
+      <w:headerReference w:type="default" r:id="rId23"/>
       <w:pgSz w:w="20160" w:h="12240" w:orient="landscape" w:code="5"/>
       <w:pgMar w:top="1440" w:right="1440" w:bottom="1440" w:left="1440" w:header="709" w:footer="709" w:gutter="0"/>
       <w:cols w:space="708"/>
@@ -5229,6 +5501,119 @@
     </w:lvl>
   </w:abstractNum>
   <w:abstractNum w:abstractNumId="11" w15:restartNumberingAfterBreak="0">
+    <w:nsid w:val="71726004"/>
+    <w:multiLevelType w:val="hybridMultilevel"/>
+    <w:tmpl w:val="9ED8537C"/>
+    <w:lvl w:ilvl="0" w:tplc="04090001">
+      <w:start w:val="1"/>
+      <w:numFmt w:val="bullet"/>
+      <w:lvlText w:val=""/>
+      <w:lvlJc w:val="left"/>
+      <w:pPr>
+        <w:ind w:left="720" w:hanging="360"/>
+      </w:pPr>
+      <w:rPr>
+        <w:rFonts w:ascii="Symbol" w:hAnsi="Symbol" w:hint="default"/>
+      </w:rPr>
+    </w:lvl>
+    <w:lvl w:ilvl="1" w:tplc="04090003" w:tentative="1">
+      <w:start w:val="1"/>
+      <w:numFmt w:val="bullet"/>
+      <w:lvlText w:val="o"/>
+      <w:lvlJc w:val="left"/>
+      <w:pPr>
+        <w:ind w:left="1440" w:hanging="360"/>
+      </w:pPr>
+      <w:rPr>
+        <w:rFonts w:ascii="Courier New" w:hAnsi="Courier New" w:cs="Courier New" w:hint="default"/>
+      </w:rPr>
+    </w:lvl>
+    <w:lvl w:ilvl="2" w:tplc="04090005" w:tentative="1">
+      <w:start w:val="1"/>
+      <w:numFmt w:val="bullet"/>
+      <w:lvlText w:val=""/>
+      <w:lvlJc w:val="left"/>
+      <w:pPr>
+        <w:ind w:left="2160" w:hanging="360"/>
+      </w:pPr>
+      <w:rPr>
+        <w:rFonts w:ascii="Wingdings" w:hAnsi="Wingdings" w:hint="default"/>
+      </w:rPr>
+    </w:lvl>
+    <w:lvl w:ilvl="3" w:tplc="04090001" w:tentative="1">
+      <w:start w:val="1"/>
+      <w:numFmt w:val="bullet"/>
+      <w:lvlText w:val=""/>
+      <w:lvlJc w:val="left"/>
+      <w:pPr>
+        <w:ind w:left="2880" w:hanging="360"/>
+      </w:pPr>
+      <w:rPr>
+        <w:rFonts w:ascii="Symbol" w:hAnsi="Symbol" w:hint="default"/>
+      </w:rPr>
+    </w:lvl>
+    <w:lvl w:ilvl="4" w:tplc="04090003" w:tentative="1">
+      <w:start w:val="1"/>
+      <w:numFmt w:val="bullet"/>
+      <w:lvlText w:val="o"/>
+      <w:lvlJc w:val="left"/>
+      <w:pPr>
+        <w:ind w:left="3600" w:hanging="360"/>
+      </w:pPr>
+      <w:rPr>
+        <w:rFonts w:ascii="Courier New" w:hAnsi="Courier New" w:cs="Courier New" w:hint="default"/>
+      </w:rPr>
+    </w:lvl>
+    <w:lvl w:ilvl="5" w:tplc="04090005" w:tentative="1">
+      <w:start w:val="1"/>
+      <w:numFmt w:val="bullet"/>
+      <w:lvlText w:val=""/>
+      <w:lvlJc w:val="left"/>
+      <w:pPr>
+        <w:ind w:left="4320" w:hanging="360"/>
+      </w:pPr>
+      <w:rPr>
+        <w:rFonts w:ascii="Wingdings" w:hAnsi="Wingdings" w:hint="default"/>
+      </w:rPr>
+    </w:lvl>
+    <w:lvl w:ilvl="6" w:tplc="04090001" w:tentative="1">
+      <w:start w:val="1"/>
+      <w:numFmt w:val="bullet"/>
+      <w:lvlText w:val=""/>
+      <w:lvlJc w:val="left"/>
+      <w:pPr>
+        <w:ind w:left="5040" w:hanging="360"/>
+      </w:pPr>
+      <w:rPr>
+        <w:rFonts w:ascii="Symbol" w:hAnsi="Symbol" w:hint="default"/>
+      </w:rPr>
+    </w:lvl>
+    <w:lvl w:ilvl="7" w:tplc="04090003" w:tentative="1">
+      <w:start w:val="1"/>
+      <w:numFmt w:val="bullet"/>
+      <w:lvlText w:val="o"/>
+      <w:lvlJc w:val="left"/>
+      <w:pPr>
+        <w:ind w:left="5760" w:hanging="360"/>
+      </w:pPr>
+      <w:rPr>
+        <w:rFonts w:ascii="Courier New" w:hAnsi="Courier New" w:cs="Courier New" w:hint="default"/>
+      </w:rPr>
+    </w:lvl>
+    <w:lvl w:ilvl="8" w:tplc="04090005" w:tentative="1">
+      <w:start w:val="1"/>
+      <w:numFmt w:val="bullet"/>
+      <w:lvlText w:val=""/>
+      <w:lvlJc w:val="left"/>
+      <w:pPr>
+        <w:ind w:left="6480" w:hanging="360"/>
+      </w:pPr>
+      <w:rPr>
+        <w:rFonts w:ascii="Wingdings" w:hAnsi="Wingdings" w:hint="default"/>
+      </w:rPr>
+    </w:lvl>
+  </w:abstractNum>
+  <w:abstractNum w:abstractNumId="12" w15:restartNumberingAfterBreak="0">
     <w:nsid w:val="756E5BA5"/>
     <w:multiLevelType w:val="hybridMultilevel"/>
     <w:tmpl w:val="C0E248FC"/>
@@ -5341,7 +5726,7 @@
       </w:rPr>
     </w:lvl>
   </w:abstractNum>
-  <w:abstractNum w:abstractNumId="12" w15:restartNumberingAfterBreak="0">
+  <w:abstractNum w:abstractNumId="13" w15:restartNumberingAfterBreak="0">
     <w:nsid w:val="7E1656AC"/>
     <w:multiLevelType w:val="hybridMultilevel"/>
     <w:tmpl w:val="39F25346"/>
@@ -5485,13 +5870,16 @@
     <w:abstractNumId w:val="0"/>
   </w:num>
   <w:num w:numId="11" w16cid:durableId="138378064">
-    <w:abstractNumId w:val="12"/>
+    <w:abstractNumId w:val="13"/>
   </w:num>
   <w:num w:numId="12" w16cid:durableId="668599909">
-    <w:abstractNumId w:val="11"/>
+    <w:abstractNumId w:val="12"/>
   </w:num>
   <w:num w:numId="13" w16cid:durableId="844785465">
     <w:abstractNumId w:val="5"/>
+  </w:num>
+  <w:num w:numId="14" w16cid:durableId="223758400">
+    <w:abstractNumId w:val="11"/>
   </w:num>
 </w:numbering>
 </file>
@@ -6568,6 +6956,27 @@
 </file>
 
 <file path=customXml/item1.xml><?xml version="1.0" encoding="utf-8"?>
+<b:Sources xmlns:b="http://schemas.openxmlformats.org/officeDocument/2006/bibliography" xmlns="http://schemas.openxmlformats.org/officeDocument/2006/bibliography" SelectedStyle="\APASixthEditionOfficeOnline.xsl" StyleName="APA" Version="6"/>
+</file>
+
+<file path=customXml/item2.xml><?xml version="1.0" encoding="utf-8"?>
+<p:properties xmlns:p="http://schemas.microsoft.com/office/2006/metadata/properties" xmlns:xsi="http://www.w3.org/2001/XMLSchema-instance" xmlns:pc="http://schemas.microsoft.com/office/infopath/2007/PartnerControls">
+  <documentManagement>
+    <ReferenceId xmlns="42257c34-c77f-467d-905d-75a97d547138" xsi:nil="true"/>
+  </documentManagement>
+</p:properties>
+</file>
+
+<file path=customXml/item3.xml><?xml version="1.0" encoding="utf-8"?>
+<?mso-contentType ?>
+<FormTemplates xmlns="http://schemas.microsoft.com/sharepoint/v3/contenttype/forms">
+  <Display>DocumentLibraryForm</Display>
+  <Edit>DocumentLibraryForm</Edit>
+  <New>DocumentLibraryForm</New>
+</FormTemplates>
+</file>
+
+<file path=customXml/item4.xml><?xml version="1.0" encoding="utf-8"?>
 <ct:contentTypeSchema xmlns:ct="http://schemas.microsoft.com/office/2006/metadata/contentType" xmlns:ma="http://schemas.microsoft.com/office/2006/metadata/properties/metaAttributes" ct:_="" ma:_="" ma:contentTypeName="Document" ma:contentTypeID="0x010100551D635FAC5C8C40B6758ED46EE74085" ma:contentTypeVersion="1" ma:contentTypeDescription="Crée un document." ma:contentTypeScope="" ma:versionID="0c523bf75113fe7fa38646be70e883a9">
   <xsd:schema xmlns:xsd="http://www.w3.org/2001/XMLSchema" xmlns:xs="http://www.w3.org/2001/XMLSchema" xmlns:p="http://schemas.microsoft.com/office/2006/metadata/properties" xmlns:ns2="42257c34-c77f-467d-905d-75a97d547138" targetNamespace="http://schemas.microsoft.com/office/2006/metadata/properties" ma:root="true" ma:fieldsID="7a54401c2abbf958be344a21e651011b" ns2:_="">
     <xsd:import namespace="42257c34-c77f-467d-905d-75a97d547138"/>
@@ -6693,28 +7102,33 @@
 </ct:contentTypeSchema>
 </file>
 
-<file path=customXml/item2.xml><?xml version="1.0" encoding="utf-8"?>
-<?mso-contentType ?>
-<FormTemplates xmlns="http://schemas.microsoft.com/sharepoint/v3/contenttype/forms">
-  <Display>DocumentLibraryForm</Display>
-  <Edit>DocumentLibraryForm</Edit>
-  <New>DocumentLibraryForm</New>
-</FormTemplates>
+<file path=customXml/itemProps1.xml><?xml version="1.0" encoding="utf-8"?>
+<ds:datastoreItem xmlns:ds="http://schemas.openxmlformats.org/officeDocument/2006/customXml" ds:itemID="{C5E14211-7814-4068-AEC0-194C3A425F86}">
+  <ds:schemaRefs>
+    <ds:schemaRef ds:uri="http://schemas.openxmlformats.org/officeDocument/2006/bibliography"/>
+  </ds:schemaRefs>
+</ds:datastoreItem>
 </file>
 
-<file path=customXml/item3.xml><?xml version="1.0" encoding="utf-8"?>
-<p:properties xmlns:p="http://schemas.microsoft.com/office/2006/metadata/properties" xmlns:xsi="http://www.w3.org/2001/XMLSchema-instance" xmlns:pc="http://schemas.microsoft.com/office/infopath/2007/PartnerControls">
-  <documentManagement>
-    <ReferenceId xmlns="42257c34-c77f-467d-905d-75a97d547138" xsi:nil="true"/>
-  </documentManagement>
-</p:properties>
+<file path=customXml/itemProps2.xml><?xml version="1.0" encoding="utf-8"?>
+<ds:datastoreItem xmlns:ds="http://schemas.openxmlformats.org/officeDocument/2006/customXml" ds:itemID="{9F598CD7-6DF5-442C-BC9D-4EF79CA37EA3}">
+  <ds:schemaRefs>
+    <ds:schemaRef ds:uri="http://schemas.microsoft.com/office/2006/metadata/properties"/>
+    <ds:schemaRef ds:uri="http://schemas.microsoft.com/office/infopath/2007/PartnerControls"/>
+    <ds:schemaRef ds:uri="42257c34-c77f-467d-905d-75a97d547138"/>
+  </ds:schemaRefs>
+</ds:datastoreItem>
 </file>
 
-<file path=customXml/item4.xml><?xml version="1.0" encoding="utf-8"?>
-<b:Sources xmlns:b="http://schemas.openxmlformats.org/officeDocument/2006/bibliography" xmlns="http://schemas.openxmlformats.org/officeDocument/2006/bibliography" SelectedStyle="\APASixthEditionOfficeOnline.xsl" StyleName="APA" Version="6"/>
+<file path=customXml/itemProps3.xml><?xml version="1.0" encoding="utf-8"?>
+<ds:datastoreItem xmlns:ds="http://schemas.openxmlformats.org/officeDocument/2006/customXml" ds:itemID="{3FD6EF8E-ADF0-4C4F-B817-D3959536959B}">
+  <ds:schemaRefs>
+    <ds:schemaRef ds:uri="http://schemas.microsoft.com/sharepoint/v3/contenttype/forms"/>
+  </ds:schemaRefs>
+</ds:datastoreItem>
 </file>
 
-<file path=customXml/itemProps1.xml><?xml version="1.0" encoding="utf-8"?>
+<file path=customXml/itemProps4.xml><?xml version="1.0" encoding="utf-8"?>
 <ds:datastoreItem xmlns:ds="http://schemas.openxmlformats.org/officeDocument/2006/customXml" ds:itemID="{57C2D642-B5AC-40E5-8AC8-1A6F08B0B667}">
   <ds:schemaRefs>
     <ds:schemaRef ds:uri="http://schemas.microsoft.com/office/2006/metadata/contentType"/>
@@ -6730,30 +7144,4 @@
     <ds:schemaRef ds:uri="http://schemas.microsoft.com/internal/obd"/>
   </ds:schemaRefs>
 </ds:datastoreItem>
-</file>
-
-<file path=customXml/itemProps2.xml><?xml version="1.0" encoding="utf-8"?>
-<ds:datastoreItem xmlns:ds="http://schemas.openxmlformats.org/officeDocument/2006/customXml" ds:itemID="{3FD6EF8E-ADF0-4C4F-B817-D3959536959B}">
-  <ds:schemaRefs>
-    <ds:schemaRef ds:uri="http://schemas.microsoft.com/sharepoint/v3/contenttype/forms"/>
-  </ds:schemaRefs>
-</ds:datastoreItem>
-</file>
-
-<file path=customXml/itemProps3.xml><?xml version="1.0" encoding="utf-8"?>
-<ds:datastoreItem xmlns:ds="http://schemas.openxmlformats.org/officeDocument/2006/customXml" ds:itemID="{9F598CD7-6DF5-442C-BC9D-4EF79CA37EA3}">
-  <ds:schemaRefs>
-    <ds:schemaRef ds:uri="http://schemas.microsoft.com/office/2006/metadata/properties"/>
-    <ds:schemaRef ds:uri="http://schemas.microsoft.com/office/infopath/2007/PartnerControls"/>
-    <ds:schemaRef ds:uri="42257c34-c77f-467d-905d-75a97d547138"/>
-  </ds:schemaRefs>
-</ds:datastoreItem>
-</file>
-
-<file path=customXml/itemProps4.xml><?xml version="1.0" encoding="utf-8"?>
-<ds:datastoreItem xmlns:ds="http://schemas.openxmlformats.org/officeDocument/2006/customXml" ds:itemID="{C5E14211-7814-4068-AEC0-194C3A425F86}">
-  <ds:schemaRefs>
-    <ds:schemaRef ds:uri="http://schemas.openxmlformats.org/officeDocument/2006/bibliography"/>
-  </ds:schemaRefs>
-</ds:datastoreItem>
 </file>
</xml_diff>